<commit_message>
our contribution and our approach both done
</commit_message>
<xml_diff>
--- a/Team Theia Research Paper.docx
+++ b/Team Theia Research Paper.docx
@@ -3849,7 +3849,7 @@
       <w:pPr>
         <w:pStyle w:val="Head1"/>
         <w:spacing w:before="0" w:after="0" w:line="360" w:lineRule="auto"/>
-        <w:ind w:left="0" w:firstLine="0"/>
+        <w:ind w:left="0" w:firstLine="708"/>
         <w:rPr>
           <w:rFonts w:ascii="Times New Roman" w:hAnsi="Times New Roman" w:cs="Times New Roman"/>
           <w:b w:val="0"/>
@@ -3991,7 +3991,7 @@
       <w:pPr>
         <w:pStyle w:val="Head1"/>
         <w:spacing w:before="0" w:after="0" w:line="360" w:lineRule="auto"/>
-        <w:ind w:left="0" w:firstLine="280"/>
+        <w:ind w:left="0" w:firstLine="708"/>
         <w:rPr>
           <w:rFonts w:ascii="Times New Roman" w:hAnsi="Times New Roman" w:cs="Times New Roman"/>
           <w:b w:val="0"/>
@@ -4016,8 +4016,120 @@
           <w:szCs w:val="18"/>
         </w:rPr>
         <w:lastRenderedPageBreak/>
-        <w:t>server for processing, displaying the results in real time as they flowed back to the client. This was highly inefficient, especially since people’s identities do not change between frames, assuming the program has knowledge that it is tracking the exact same face. MediaPipe’s face mesh model has powerful face tracking built in, but the internal box ID’s and direct box object references are not available through the high-level API. To circumvent this issue, we developed a Kalman filter-based temporal intersection over union box tracking class, and tied identification and UI information to that single detection, choosing to redraw it based on the Kalman filter detection</w:t>
-      </w:r>
+        <w:t xml:space="preserve">server for processing, displaying the results in real time as they flowed back to the client. This was highly inefficient, especially since people’s identities do not change between frames, assuming the program has knowledge that it is tracking the exact same face. MediaPipe’s face mesh model has powerful face tracking built in, but the internal box ID’s and direct box object references are not available through the high-level API. To circumvent this issue, we developed a Kalman filter-based temporal intersection over union box tracking class, and tied identification and UI information to that single </w:t>
+      </w:r>
+      <w:r>
+        <w:rPr>
+          <w:rFonts w:ascii="Times New Roman" w:hAnsi="Times New Roman" w:cs="Times New Roman"/>
+          <w:b w:val="0"/>
+          <w:sz w:val="18"/>
+          <w:szCs w:val="18"/>
+        </w:rPr>
+        <w:t>track object</w:t>
+      </w:r>
+      <w:r>
+        <w:rPr>
+          <w:rFonts w:ascii="Times New Roman" w:hAnsi="Times New Roman" w:cs="Times New Roman"/>
+          <w:b w:val="0"/>
+          <w:sz w:val="18"/>
+          <w:szCs w:val="18"/>
+        </w:rPr>
+        <w:t xml:space="preserve">, </w:t>
+      </w:r>
+      <w:r>
+        <w:rPr>
+          <w:rFonts w:ascii="Times New Roman" w:hAnsi="Times New Roman" w:cs="Times New Roman"/>
+          <w:b w:val="0"/>
+          <w:sz w:val="18"/>
+          <w:szCs w:val="18"/>
+        </w:rPr>
+        <w:t xml:space="preserve">displaying it continuously without the need for reidentification. To do so, we implemented an identity locking system, where if the server returned either a high confidence (&gt;0.65) identification or two consecutive identical </w:t>
+      </w:r>
+      <w:r>
+        <w:rPr>
+          <w:rFonts w:ascii="Times New Roman" w:hAnsi="Times New Roman" w:cs="Times New Roman"/>
+          <w:b w:val="0"/>
+          <w:sz w:val="18"/>
+          <w:szCs w:val="18"/>
+        </w:rPr>
+        <w:t>results</w:t>
+      </w:r>
+      <w:r>
+        <w:rPr>
+          <w:rFonts w:ascii="Times New Roman" w:hAnsi="Times New Roman" w:cs="Times New Roman"/>
+          <w:b w:val="0"/>
+          <w:sz w:val="18"/>
+          <w:szCs w:val="18"/>
+        </w:rPr>
+        <w:t xml:space="preserve">, the track </w:t>
+      </w:r>
+      <w:r>
+        <w:rPr>
+          <w:rFonts w:ascii="Times New Roman" w:hAnsi="Times New Roman" w:cs="Times New Roman"/>
+          <w:b w:val="0"/>
+          <w:sz w:val="18"/>
+          <w:szCs w:val="18"/>
+        </w:rPr>
+        <w:t>would</w:t>
+      </w:r>
+      <w:r>
+        <w:rPr>
+          <w:rFonts w:ascii="Times New Roman" w:hAnsi="Times New Roman" w:cs="Times New Roman"/>
+          <w:b w:val="0"/>
+          <w:sz w:val="18"/>
+          <w:szCs w:val="18"/>
+        </w:rPr>
+        <w:t xml:space="preserve"> lock </w:t>
+      </w:r>
+      <w:r>
+        <w:rPr>
+          <w:rFonts w:ascii="Times New Roman" w:hAnsi="Times New Roman" w:cs="Times New Roman"/>
+          <w:b w:val="0"/>
+          <w:sz w:val="18"/>
+          <w:szCs w:val="18"/>
+        </w:rPr>
+        <w:t xml:space="preserve">onto </w:t>
+      </w:r>
+      <w:r>
+        <w:rPr>
+          <w:rFonts w:ascii="Times New Roman" w:hAnsi="Times New Roman" w:cs="Times New Roman"/>
+          <w:b w:val="0"/>
+          <w:sz w:val="18"/>
+          <w:szCs w:val="18"/>
+        </w:rPr>
+        <w:t xml:space="preserve">that </w:t>
+      </w:r>
+      <w:r>
+        <w:rPr>
+          <w:rFonts w:ascii="Times New Roman" w:hAnsi="Times New Roman" w:cs="Times New Roman"/>
+          <w:b w:val="0"/>
+          <w:sz w:val="18"/>
+          <w:szCs w:val="18"/>
+        </w:rPr>
+        <w:t>person’s</w:t>
+      </w:r>
+      <w:r>
+        <w:rPr>
+          <w:rFonts w:ascii="Times New Roman" w:hAnsi="Times New Roman" w:cs="Times New Roman"/>
+          <w:b w:val="0"/>
+          <w:sz w:val="18"/>
+          <w:szCs w:val="18"/>
+        </w:rPr>
+        <w:t xml:space="preserve"> identity, preventing further attempts at reidentification. This allowed for the simultaneous identification and display of multiple people, increased accuracy regardless of a person’s current pose, and greatly reduced processing and latency.</w:t>
+      </w:r>
+    </w:p>
+    <w:p>
+      <w:pPr>
+        <w:pStyle w:val="Head1"/>
+        <w:spacing w:before="0" w:after="0" w:line="360" w:lineRule="auto"/>
+        <w:ind w:left="0" w:firstLine="708"/>
+        <w:rPr>
+          <w:rFonts w:ascii="Times New Roman" w:hAnsi="Times New Roman" w:cs="Times New Roman"/>
+          <w:b w:val="0"/>
+          <w:sz w:val="18"/>
+          <w:szCs w:val="18"/>
+        </w:rPr>
+      </w:pPr>
     </w:p>
     <w:p>
       <w:pPr>
@@ -4079,10 +4191,10 @@
         <w:jc w:val="left"/>
       </w:pPr>
       <w:r>
-        <w:t xml:space="preserve">We currently have no intention or interest in turning this into a commercial product. This product would introduce a great deal of ethical concerns. For instance, if the glasses were stolen in their current state, it would give access to an unauthorized individual the identities and personal data of the current database attached to the glasses. Having the ability to link a name to a face introduces many ethical concerns alone. Not to mention the ethical concerns of each individual use case as well as hosting the data of thousands of individuals. If we were to sell it, it would be without a pre-built database and only sold to trusted companies </w:t>
-      </w:r>
-      <w:r>
-        <w:t>that fall within our use cases while recommending heavy security measures around the product.</w:t>
+        <w:t xml:space="preserve">We currently have no intention or interest in turning this into a commercial product. This product would introduce a great </w:t>
+      </w:r>
+      <w:r>
+        <w:t>deal of ethical concerns. For instance, if the glasses were stolen in their current state, it would give access to an unauthorized individual the identities and personal data of the current database attached to the glasses. Having the ability to link a name to a face introduces many ethical concerns alone. Not to mention the ethical concerns of each individual use case as well as hosting the data of thousands of individuals. If we were to sell it, it would be without a pre-built database and only sold to trusted companies that fall within our use cases while recommending heavy security measures around the product.</w:t>
       </w:r>
     </w:p>
     <w:p>
@@ -4090,14 +4202,12 @@
         <w:spacing w:line="360" w:lineRule="auto"/>
         <w:ind w:firstLine="708"/>
         <w:jc w:val="left"/>
-        <w:rPr>
-          <w:rFonts w:ascii="Times New Roman" w:eastAsia="Times New Roman" w:hAnsi="Times New Roman" w:cs="Times New Roman"/>
-        </w:rPr>
       </w:pPr>
     </w:p>
     <w:p>
       <w:pPr>
         <w:pStyle w:val="Head1"/>
+        <w:spacing w:before="0"/>
       </w:pPr>
       <w:r>
         <w:t>6</w:t>
@@ -4118,13 +4228,55 @@
         <w:rPr>
           <w:rFonts w:ascii="Times New Roman" w:eastAsia="Times New Roman" w:hAnsi="Times New Roman" w:cs="Times New Roman"/>
         </w:rPr>
-        <w:t>As touched upon in the introduction, facial recognition has many limitations: racial biases, the inability to distinguish between similar looking people (i.e. twins), and faces at extreme angles, to name some. Lighting is also a key factor as to whether DeepFace can recognize a face. Further, the face capture had an issue with the range where it would cutoff at an inconsistent distance away from the camera. While we attempted to remedy some of the problems, there is no catch-all solution to any of them.</w:t>
-      </w:r>
-      <w:r>
-        <w:rPr>
-          <w:rFonts w:ascii="Times New Roman" w:eastAsia="Times New Roman" w:hAnsi="Times New Roman" w:cs="Times New Roman"/>
-        </w:rPr>
-        <w:t xml:space="preserve"> </w:t>
+        <w:t xml:space="preserve">As touched upon in the introduction, facial recognition has many limitations: racial biases, the inability to </w:t>
+      </w:r>
+      <w:r>
+        <w:rPr>
+          <w:rFonts w:ascii="Times New Roman" w:eastAsia="Times New Roman" w:hAnsi="Times New Roman" w:cs="Times New Roman"/>
+        </w:rPr>
+        <w:t xml:space="preserve">always </w:t>
+      </w:r>
+      <w:r>
+        <w:rPr>
+          <w:rFonts w:ascii="Times New Roman" w:eastAsia="Times New Roman" w:hAnsi="Times New Roman" w:cs="Times New Roman"/>
+        </w:rPr>
+        <w:t xml:space="preserve">distinguish between similar looking people (i.e. twins), and faces at extreme angles, to name some. Lighting is also a key factor as to whether DeepFace can recognize a face. Further, the face capture had an issue with the range where it would cutoff at an inconsistent distance away from the camera. While we </w:t>
+      </w:r>
+      <w:r>
+        <w:rPr>
+          <w:rFonts w:ascii="Times New Roman" w:eastAsia="Times New Roman" w:hAnsi="Times New Roman" w:cs="Times New Roman"/>
+        </w:rPr>
+        <w:t>were able</w:t>
+      </w:r>
+      <w:r>
+        <w:rPr>
+          <w:rFonts w:ascii="Times New Roman" w:eastAsia="Times New Roman" w:hAnsi="Times New Roman" w:cs="Times New Roman"/>
+        </w:rPr>
+        <w:t xml:space="preserve"> to remedy some of </w:t>
+      </w:r>
+      <w:r>
+        <w:rPr>
+          <w:rFonts w:ascii="Times New Roman" w:eastAsia="Times New Roman" w:hAnsi="Times New Roman" w:cs="Times New Roman"/>
+        </w:rPr>
+        <w:t>these</w:t>
+      </w:r>
+      <w:r>
+        <w:rPr>
+          <w:rFonts w:ascii="Times New Roman" w:eastAsia="Times New Roman" w:hAnsi="Times New Roman" w:cs="Times New Roman"/>
+        </w:rPr>
+        <w:t xml:space="preserve"> problems, there is no catch-all solution</w:t>
+      </w:r>
+      <w:r>
+        <w:rPr>
+          <w:rFonts w:ascii="Times New Roman" w:eastAsia="Times New Roman" w:hAnsi="Times New Roman" w:cs="Times New Roman"/>
+        </w:rPr>
+        <w:t xml:space="preserve"> that we were able to come up with</w:t>
+      </w:r>
+      <w:r>
+        <w:rPr>
+          <w:rFonts w:ascii="Times New Roman" w:eastAsia="Times New Roman" w:hAnsi="Times New Roman" w:cs="Times New Roman"/>
+        </w:rPr>
+        <w:t>.</w:t>
       </w:r>
     </w:p>
     <w:p>
@@ -4133,6 +4285,105 @@
         <w:ind w:firstLine="708"/>
         <w:rPr>
           <w:rFonts w:ascii="Times New Roman" w:eastAsia="Times New Roman" w:hAnsi="Times New Roman" w:cs="Times New Roman"/>
+        </w:rPr>
+      </w:pPr>
+      <w:r>
+        <w:rPr>
+          <w:rFonts w:ascii="Times New Roman" w:eastAsia="Times New Roman" w:hAnsi="Times New Roman" w:cs="Times New Roman"/>
+        </w:rPr>
+        <w:t xml:space="preserve">The purpose of this project was to gain experience with areas we were unfamiliar with: AI face detection and recognition, scraping, and AR displays. Our </w:t>
+      </w:r>
+      <w:r>
+        <w:rPr>
+          <w:rFonts w:ascii="Times New Roman" w:eastAsia="Times New Roman" w:hAnsi="Times New Roman" w:cs="Times New Roman"/>
+        </w:rPr>
+        <w:t>result</w:t>
+      </w:r>
+      <w:r>
+        <w:rPr>
+          <w:rFonts w:ascii="Times New Roman" w:eastAsia="Times New Roman" w:hAnsi="Times New Roman" w:cs="Times New Roman"/>
+        </w:rPr>
+        <w:t xml:space="preserve"> has some shortcomings, as it is limited by the current state of facial recognition</w:t>
+      </w:r>
+      <w:r>
+        <w:rPr>
+          <w:rFonts w:ascii="Times New Roman" w:eastAsia="Times New Roman" w:hAnsi="Times New Roman" w:cs="Times New Roman"/>
+        </w:rPr>
+        <w:t xml:space="preserve"> models</w:t>
+      </w:r>
+      <w:r>
+        <w:rPr>
+          <w:rFonts w:ascii="Times New Roman" w:eastAsia="Times New Roman" w:hAnsi="Times New Roman" w:cs="Times New Roman"/>
+        </w:rPr>
+        <w:t xml:space="preserve"> and </w:t>
+      </w:r>
+      <w:r>
+        <w:rPr>
+          <w:rFonts w:ascii="Times New Roman" w:eastAsia="Times New Roman" w:hAnsi="Times New Roman" w:cs="Times New Roman"/>
+        </w:rPr>
+        <w:t xml:space="preserve">the </w:t>
+      </w:r>
+      <w:r>
+        <w:rPr>
+          <w:rFonts w:ascii="Times New Roman" w:eastAsia="Times New Roman" w:hAnsi="Times New Roman" w:cs="Times New Roman"/>
+        </w:rPr>
+        <w:t xml:space="preserve">potentially inadequate quality of </w:t>
+      </w:r>
+      <w:r>
+        <w:rPr>
+          <w:rFonts w:ascii="Times New Roman" w:eastAsia="Times New Roman" w:hAnsi="Times New Roman" w:cs="Times New Roman"/>
+        </w:rPr>
+        <w:t>web-scraped data</w:t>
+      </w:r>
+      <w:r>
+        <w:rPr>
+          <w:rFonts w:ascii="Times New Roman" w:eastAsia="Times New Roman" w:hAnsi="Times New Roman" w:cs="Times New Roman"/>
+        </w:rPr>
+        <w:t xml:space="preserve">. However, with the time and budget </w:t>
+      </w:r>
+      <w:r>
+        <w:rPr>
+          <w:rFonts w:ascii="Times New Roman" w:eastAsia="Times New Roman" w:hAnsi="Times New Roman" w:cs="Times New Roman"/>
+        </w:rPr>
+        <w:t>allocated</w:t>
+      </w:r>
+      <w:r>
+        <w:rPr>
+          <w:rFonts w:ascii="Times New Roman" w:eastAsia="Times New Roman" w:hAnsi="Times New Roman" w:cs="Times New Roman"/>
+        </w:rPr>
+        <w:t xml:space="preserve"> to work on this project, we consider </w:t>
+      </w:r>
+      <w:r>
+        <w:rPr>
+          <w:rFonts w:ascii="Times New Roman" w:eastAsia="Times New Roman" w:hAnsi="Times New Roman" w:cs="Times New Roman"/>
+        </w:rPr>
+        <w:t>our</w:t>
+      </w:r>
+      <w:r>
+        <w:rPr>
+          <w:rFonts w:ascii="Times New Roman" w:eastAsia="Times New Roman" w:hAnsi="Times New Roman" w:cs="Times New Roman"/>
+        </w:rPr>
+        <w:t xml:space="preserve"> end result </w:t>
+      </w:r>
+      <w:r>
+        <w:rPr>
+          <w:rFonts w:ascii="Times New Roman" w:eastAsia="Times New Roman" w:hAnsi="Times New Roman" w:cs="Times New Roman"/>
+        </w:rPr>
+        <w:t xml:space="preserve">and contributions </w:t>
+      </w:r>
+      <w:r>
+        <w:rPr>
+          <w:rFonts w:ascii="Times New Roman" w:eastAsia="Times New Roman" w:hAnsi="Times New Roman" w:cs="Times New Roman"/>
+        </w:rPr>
+        <w:t>to be adequate.</w:t>
+      </w:r>
+    </w:p>
+    <w:p>
+      <w:pPr>
+        <w:spacing w:line="360" w:lineRule="auto"/>
+        <w:ind w:firstLine="708"/>
+        <w:rPr>
+          <w:rFonts w:ascii="Times New Roman" w:eastAsia="Times New Roman" w:hAnsi="Times New Roman" w:cs="Times New Roman"/>
           <w:smallCaps/>
         </w:rPr>
       </w:pPr>
@@ -4140,7 +4391,158 @@
         <w:rPr>
           <w:rFonts w:ascii="Times New Roman" w:eastAsia="Times New Roman" w:hAnsi="Times New Roman" w:cs="Times New Roman"/>
         </w:rPr>
-        <w:t>The purpose of this project was to gain experience with areas we were unfamiliar with: AI face detection and recognition, scraping, and AR displays. Our end result certainly has some shortcomings, as it is limited by the current state of facial recognition and potentially inadequate quality of the collection of data. However, with the time and budget allotted to work on this project, we consider this end result to be adequate. Frequent testing shows the recognition is very consistent and accurate. As facial recognition evolves, so will our product. We currently have no intention or interest in turning this into a commercial product. This product would introduce a great deal of ethical concerns. For instance, if the glasses were stolen in their current state, it would give access to an unauthorized individual the identities and personal data of the current database attached to the glasses. Having the ability to link a name to a face introduces many ethical concerns alone. Not to mention the ethical concerns of each individual use case as well as hosting the data of thousands of individuals. If we were to sell it, it would be without a pre-built database and only sold to trusted companies that fall within our use cases while recommending heavy security measures around the product.</w:t>
+        <w:t xml:space="preserve">Frequent testing shows the recognition is very consistent and accurate. As facial recognition </w:t>
+      </w:r>
+      <w:r>
+        <w:rPr>
+          <w:rFonts w:ascii="Times New Roman" w:eastAsia="Times New Roman" w:hAnsi="Times New Roman" w:cs="Times New Roman"/>
+        </w:rPr>
+        <w:t xml:space="preserve">technology </w:t>
+      </w:r>
+      <w:r>
+        <w:rPr>
+          <w:rFonts w:ascii="Times New Roman" w:eastAsia="Times New Roman" w:hAnsi="Times New Roman" w:cs="Times New Roman"/>
+        </w:rPr>
+        <w:t xml:space="preserve">evolves, so </w:t>
+      </w:r>
+      <w:r>
+        <w:rPr>
+          <w:rFonts w:ascii="Times New Roman" w:eastAsia="Times New Roman" w:hAnsi="Times New Roman" w:cs="Times New Roman"/>
+        </w:rPr>
+        <w:t>would</w:t>
+      </w:r>
+      <w:r>
+        <w:rPr>
+          <w:rFonts w:ascii="Times New Roman" w:eastAsia="Times New Roman" w:hAnsi="Times New Roman" w:cs="Times New Roman"/>
+        </w:rPr>
+        <w:t xml:space="preserve"> our </w:t>
+      </w:r>
+      <w:r>
+        <w:rPr>
+          <w:rFonts w:ascii="Times New Roman" w:eastAsia="Times New Roman" w:hAnsi="Times New Roman" w:cs="Times New Roman"/>
+        </w:rPr>
+        <w:t>project</w:t>
+      </w:r>
+      <w:r>
+        <w:rPr>
+          <w:rFonts w:ascii="Times New Roman" w:eastAsia="Times New Roman" w:hAnsi="Times New Roman" w:cs="Times New Roman"/>
+        </w:rPr>
+        <w:t xml:space="preserve">. </w:t>
+      </w:r>
+      <w:r>
+        <w:rPr>
+          <w:rFonts w:ascii="Times New Roman" w:eastAsia="Times New Roman" w:hAnsi="Times New Roman" w:cs="Times New Roman"/>
+        </w:rPr>
+        <w:t>That being said, w</w:t>
+      </w:r>
+      <w:r>
+        <w:rPr>
+          <w:rFonts w:ascii="Times New Roman" w:eastAsia="Times New Roman" w:hAnsi="Times New Roman" w:cs="Times New Roman"/>
+        </w:rPr>
+        <w:t>e currently have no intention or interest in turning this into a commercial product</w:t>
+      </w:r>
+      <w:r>
+        <w:rPr>
+          <w:rFonts w:ascii="Times New Roman" w:eastAsia="Times New Roman" w:hAnsi="Times New Roman" w:cs="Times New Roman"/>
+        </w:rPr>
+        <w:t>, as t</w:t>
+      </w:r>
+      <w:r>
+        <w:rPr>
+          <w:rFonts w:ascii="Times New Roman" w:eastAsia="Times New Roman" w:hAnsi="Times New Roman" w:cs="Times New Roman"/>
+        </w:rPr>
+        <w:t xml:space="preserve">his product would introduce </w:t>
+      </w:r>
+      <w:r>
+        <w:rPr>
+          <w:rFonts w:ascii="Times New Roman" w:eastAsia="Times New Roman" w:hAnsi="Times New Roman" w:cs="Times New Roman"/>
+        </w:rPr>
+        <w:t>numerous</w:t>
+      </w:r>
+      <w:r>
+        <w:rPr>
+          <w:rFonts w:ascii="Times New Roman" w:eastAsia="Times New Roman" w:hAnsi="Times New Roman" w:cs="Times New Roman"/>
+        </w:rPr>
+        <w:t xml:space="preserve"> ethical concerns</w:t>
+      </w:r>
+      <w:r>
+        <w:rPr>
+          <w:rFonts w:ascii="Times New Roman" w:eastAsia="Times New Roman" w:hAnsi="Times New Roman" w:cs="Times New Roman"/>
+        </w:rPr>
+        <w:t xml:space="preserve"> were it to be widely available</w:t>
+      </w:r>
+      <w:r>
+        <w:rPr>
+          <w:rFonts w:ascii="Times New Roman" w:eastAsia="Times New Roman" w:hAnsi="Times New Roman" w:cs="Times New Roman"/>
+        </w:rPr>
+        <w:t xml:space="preserve">. For instance, if the glasses were stolen in their current state, it would give access to an unauthorized individual the identities and personal data of the current database attached to the glasses. Having the ability to link a name to a face </w:t>
+      </w:r>
+      <w:r>
+        <w:rPr>
+          <w:rFonts w:ascii="Times New Roman" w:eastAsia="Times New Roman" w:hAnsi="Times New Roman" w:cs="Times New Roman"/>
+        </w:rPr>
+        <w:t>can be</w:t>
+      </w:r>
+      <w:r>
+        <w:rPr>
+          <w:rFonts w:ascii="Times New Roman" w:eastAsia="Times New Roman" w:hAnsi="Times New Roman" w:cs="Times New Roman"/>
+        </w:rPr>
+        <w:t xml:space="preserve"> powerful</w:t>
+      </w:r>
+      <w:r>
+        <w:rPr>
+          <w:rFonts w:ascii="Times New Roman" w:eastAsia="Times New Roman" w:hAnsi="Times New Roman" w:cs="Times New Roman"/>
+        </w:rPr>
+        <w:t xml:space="preserve"> and dangerous</w:t>
+      </w:r>
+      <w:r>
+        <w:rPr>
+          <w:rFonts w:ascii="Times New Roman" w:eastAsia="Times New Roman" w:hAnsi="Times New Roman" w:cs="Times New Roman"/>
+        </w:rPr>
+        <w:t>, especially when employing web-scraping tactics that allow for the potential identification of strangers</w:t>
+      </w:r>
+      <w:r>
+        <w:rPr>
+          <w:rFonts w:ascii="Times New Roman" w:eastAsia="Times New Roman" w:hAnsi="Times New Roman" w:cs="Times New Roman"/>
+        </w:rPr>
+        <w:t xml:space="preserve">. Not to mention the </w:t>
+      </w:r>
+      <w:r>
+        <w:rPr>
+          <w:rFonts w:ascii="Times New Roman" w:eastAsia="Times New Roman" w:hAnsi="Times New Roman" w:cs="Times New Roman"/>
+        </w:rPr>
+        <w:t xml:space="preserve">specific </w:t>
+      </w:r>
+      <w:r>
+        <w:rPr>
+          <w:rFonts w:ascii="Times New Roman" w:eastAsia="Times New Roman" w:hAnsi="Times New Roman" w:cs="Times New Roman"/>
+        </w:rPr>
+        <w:t xml:space="preserve">ethical concerns of each </w:t>
+      </w:r>
+      <w:r>
+        <w:rPr>
+          <w:rFonts w:ascii="Times New Roman" w:eastAsia="Times New Roman" w:hAnsi="Times New Roman" w:cs="Times New Roman"/>
+        </w:rPr>
+        <w:lastRenderedPageBreak/>
+        <w:t>potential</w:t>
+      </w:r>
+      <w:r>
+        <w:rPr>
+          <w:rFonts w:ascii="Times New Roman" w:eastAsia="Times New Roman" w:hAnsi="Times New Roman" w:cs="Times New Roman"/>
+        </w:rPr>
+        <w:t xml:space="preserve"> use case</w:t>
+      </w:r>
+      <w:r>
+        <w:rPr>
+          <w:rFonts w:ascii="Times New Roman" w:eastAsia="Times New Roman" w:hAnsi="Times New Roman" w:cs="Times New Roman"/>
+        </w:rPr>
+        <w:t>,</w:t>
+      </w:r>
+      <w:r>
+        <w:rPr>
+          <w:rFonts w:ascii="Times New Roman" w:eastAsia="Times New Roman" w:hAnsi="Times New Roman" w:cs="Times New Roman"/>
+        </w:rPr>
+        <w:t xml:space="preserve"> as well as hosting the data of thousands of individuals. If we were to sell it, it would be without a pre-built database and only sold to trusted companies that fall within our use cases while recommending heavy security measures around the product.</w:t>
       </w:r>
     </w:p>
     <w:p>
@@ -4216,19 +4618,7 @@
           <w:sz w:val="18"/>
           <w:szCs w:val="18"/>
         </w:rPr>
-        <w:t xml:space="preserve">S. N. Ilkal, S. S. Munshi, S. Katarki, N. Kotwal, M. Chikkond, and A. Makandar, “AI Based Facial Recognition Smart Glass for Visually Impaired Person,” Saudi Journal of Engineering and </w:t>
-      </w:r>
-      <w:r>
-        <w:rPr>
-          <w:rFonts w:ascii="Times New Roman" w:eastAsia="MS Mincho" w:hAnsi="Times New Roman" w:cs="Times New Roman"/>
-          <w:i/>
-          <w:iCs/>
-          <w:color w:val="auto"/>
-          <w:sz w:val="18"/>
-          <w:szCs w:val="18"/>
-        </w:rPr>
-        <w:lastRenderedPageBreak/>
-        <w:t xml:space="preserve">Technology, vol. 10, no. 06, pp. 270–276, Jun. 2025, doi: </w:t>
+        <w:t xml:space="preserve">S. N. Ilkal, S. S. Munshi, S. Katarki, N. Kotwal, M. Chikkond, and A. Makandar, “AI Based Facial Recognition Smart Glass for Visually Impaired Person,” Saudi Journal of Engineering and Technology, vol. 10, no. 06, pp. 270–276, Jun. 2025, doi: </w:t>
       </w:r>
       <w:hyperlink r:id="rId41">
         <w:r>
@@ -9908,6 +10298,7 @@
   <w:style w:type="character" w:default="1" w:styleId="DefaultParagraphFont">
     <w:name w:val="Default Paragraph Font"/>
     <w:uiPriority w:val="1"/>
+    <w:semiHidden/>
     <w:unhideWhenUsed/>
   </w:style>
   <w:style w:type="table" w:default="1" w:styleId="TableNormal">
@@ -15590,27 +15981,188 @@
 </file>
 
 <file path=customXml/item1.xml><?xml version="1.0" encoding="utf-8"?>
-<p:properties xmlns:p="http://schemas.microsoft.com/office/2006/metadata/properties" xmlns:xsi="http://www.w3.org/2001/XMLSchema-instance" xmlns:pc="http://schemas.microsoft.com/office/infopath/2007/PartnerControls">
-  <documentManagement>
-    <_activity xmlns="1112fb0d-fe2d-4cf5-ba0d-ded80aadf55c" xsi:nil="true"/>
-  </documentManagement>
-</p:properties>
+<b:Sources xmlns:b="http://schemas.openxmlformats.org/officeDocument/2006/bibliography" xmlns="http://schemas.openxmlformats.org/officeDocument/2006/bibliography" SelectedStyle="\APA.XSL" StyleName="APA"/>
 </file>
 
 <file path=customXml/item2.xml><?xml version="1.0" encoding="utf-8"?>
-<b:Sources xmlns:b="http://schemas.openxmlformats.org/officeDocument/2006/bibliography" xmlns="http://schemas.openxmlformats.org/officeDocument/2006/bibliography" SelectedStyle="\APA.XSL" StyleName="APA"/>
+<Workflow version="v.1.13">
+  <Filtration versionrequired="True" status="DONE" StartTime="25-07-2014 13:27:04" EndTime="25-07-2014 13:28:29">
+    <Mandatory>
+      <P status="DONE" StartTime="25-07-2014 13:27:42" EndTime="25-07-2014 13:27:43">(1) * Replace leftmost and rightmost char -(hyphen) of superscript matter, into minus</P>
+      <P status="DONE" StartTime="25-07-2014 13:27:43" EndTime="25-07-2014 13:27:44">(2) * Replace all variations of degree into 'degree' symbol</P>
+      <P status="DONE" StartTime="25-07-2014 13:27:44" EndTime="25-07-2014 13:27:44">(3) * Remove unwanted blank lines</P>
+      <P status="DONE" StartTime="25-07-2014 13:27:44" EndTime="25-07-2014 13:27:44">(4) * Replace underlined 'plus' sign(s) with plus/minus symbol(s)</P>
+      <P status="DONE" StartTime="25-07-2014 13:27:44" EndTime="25-07-2014 13:27:44">(5) * Replace underlined 'Greater Than' symbol(s) with 'Greater Than or Equal To' symbol(s)</P>
+      <P status="DONE" StartTime="25-07-2014 13:27:44" EndTime="25-07-2014 13:27:45">(6) * Replace underlined 'Less Than' symbol(s) with 'Less Than or Equal To' symbol(s)</P>
+      <P status="DONE" StartTime="25-07-2014 13:27:45" EndTime="25-07-2014 13:27:46">(7) * Replace 'x' with 'multiplication' symbol</P>
+      <P status="DONE" StartTime="25-07-2014 13:27:46" EndTime="25-07-2014 13:27:46">(8) * Remove space(s) before tab</P>
+      <P status="DONE" StartTime="25-07-2014 13:27:46" EndTime="25-07-2014 13:27:46">(9) * Remove space(s) after tab</P>
+      <P status="DONE" StartTime="25-07-2014 13:27:46" EndTime="25-07-2014 13:27:47">(10) * Remove tab(s) before paragraph mark</P>
+      <P status="DONE" StartTime="25-07-2014 13:27:47" EndTime="25-07-2014 13:27:47">(11) * Remove tab(s) after paragraph mark</P>
+      <P status="DONE" StartTime="25-07-2014 13:27:47" EndTime="25-07-2014 13:27:50">(12) * Remove space(s) before paragraph mark</P>
+      <P status="DONE" StartTime="25-07-2014 13:27:50" EndTime="25-07-2014 13:27:51">(13) * Remove space(s) after paragraph mark</P>
+      <P status="DONE" StartTime="25-07-2014 13:27:51" EndTime="25-07-2014 13:27:51">(14) * Replace multiple space(s) with single space</P>
+      <P status="DONE" StartTime="25-07-2014 13:27:51" EndTime="25-07-2014 13:28:14">(16) * Replace 'single hyphen' inside page range/number range with 'double hyphen'</P>
+      <P status="DONE" StartTime="25-07-2014 13:28:14" EndTime="25-07-2014 13:28:14">(18) * Change smart quote(s) to straight quote(s)</P>
+      <P status="DONE" StartTime="25-07-2014 13:28:14" EndTime="25-07-2014 13:28:15">(19) * Change straight quote(s) to smart quote(s)</P>
+      <P status="DONE" StartTime="25-07-2014 13:28:15" EndTime="25-07-2014 13:28:15">(20) * Change three consecutive dots to Ellipsis(...)</P>
+      <P status="DONE" StartTime="25-07-2014 13:28:15" EndTime="25-07-2014 13:28:16">(22) * Remove space(s) before comma</P>
+      <P status="DONE" StartTime="25-07-2014 13:28:16" EndTime="25-07-2014 13:28:16">(23) * Remove space(s) before semicolon</P>
+      <P status="DONE" StartTime="25-07-2014 13:28:16" EndTime="25-07-2014 13:28:17">(24) * Remove space(s) before period</P>
+      <P status="DONE" StartTime="25-07-2014 13:28:17" EndTime="25-07-2014 13:28:17">(25) * Remove space(s) before closing parenthesis</P>
+      <P status="DONE" StartTime="25-07-2014 13:28:17" EndTime="25-07-2014 13:28:17">(26) * Remove space(s) after opening parenthesis</P>
+      <P status="DONE" StartTime="25-07-2014 13:28:17" EndTime="25-07-2014 13:28:18">(28) * Remove space(s) before % sign</P>
+      <P status="DONE" StartTime="25-07-2014 13:28:18" EndTime="25-07-2014 13:28:18">(29) * Remove space before Celsius or Fahrenheit sign</P>
+      <P status="DONE" StartTime="25-07-2014 13:28:18" EndTime="25-07-2014 13:28:19">(34) * Convert 'direction' sign(s) to symbol(s)</P>
+      <P status="DONE" StartTime="25-07-2014 13:28:19" EndTime="25-07-2014 13:28:20">(38) * Remove unwanted section/page/column Breaks</P>
+      <P status="DONE" StartTime="25-07-2014 13:28:20" EndTime="25-07-2014 13:28:22">(47) * Convert 'direction' arrow(s) to symbol(s)</P>
+    </Mandatory>
+    <Optional>
+      <P status="YTS">(15) * Change 'Em Dash' with --- (triple hyphen) and 'En Dash' with -- (double hyphen)</P>
+      <P status="YTS">(17) * Change 'double hyphen' inside page range/number range into 'single hyphen'</P>
+      <P status="YTS">(21) * Change hyphen (with space both side) into En Dash (with space both side)</P>
+      <P status="YTS">(27) * Remove comma from digits</P>
+      <P status="YTS">(30) * Convert tab mark(s) to standard form</P>
+      <P status="YTS">(31) * Add 'space' before and after 'equal sign'</P>
+      <P status="YTS">(32) * Move 'period' from outside closing double quote(s) to inside</P>
+      <P status="YTS">(33) * Move 'comma' from outside closing double quote(s) to inside</P>
+      <P status="YTS">(35) * Convert 'hard return' mark(s) to standard form</P>
+      <P status="YTS">(36) * Insert 'En Space' in COMMON SI and Metric units</P>
+      <P status="YTS">(37) * Insert 'En Space' for COMPLEX (&gt;550 units) SI and Metric units</P>
+      <P status="YTS">(39) * Replace Em dash with spaces on both sides to En dash with spaces on both sides</P>
+      <P status="YTS">(40) * Replace --- (Triple hyphens) with spaces on both sides to En dash with spaces on both sides</P>
+      <P status="YTS">(41) * Replace --- (Triple hyphens) without spaces on both sides to En dash with spaces on both sides</P>
+      <P status="YTS">(42) * Replace -- (Double hyphens) with spaces on both sides to En dash with spaces on both sides</P>
+      <P status="YTS">(43) * Insert 'Non-breaking Space' for COMPLEX (&gt;550 units) SI and Metric units</P>
+      <P status="YTS">(44) * Remove header and footer information</P>
+      <P status="YTS">(45) * Remove space before superscript footnote/endnote citations</P>
+      <P status="YTS">(46) * Remove Optional Hyphen Between Word</P>
+    </Optional>
+  </Filtration>
+  <BodyStyling versionrequired="True" status="DONE" StartTime="25-07-2014 13:29:21" EndTime="25-07-2014 13:33:39">
+    <TagMapping status="DONE">
+    </TagMapping>
+    <StyleMapping status="DONE">
+    </StyleMapping>
+  </BodyStyling>
+  <Reference versionrequired="True" status="DONE" StartTime="25-07-2014 13:34:10" EndTime="25-07-2014 13:37:04">
+  </Reference>
+  <CrossLinking versionrequired="True" status="YTS">
+  </CrossLinking>
+  <DOI versionrequired="True" status="YTS">
+  </DOI>
+  <Metadata versionrequired="True" status="YTS">
+    <Global>
+      <JournalID type="publisher">PRB</JournalID>
+      <JournalID type="coden">PRBMDO</JournalID>
+      <JournalID type="hwp">
+      </JournalID>
+      <JournalID type="pmc">
+      </JournalID>
+      <JournalID type="nlmta">
+      </JournalID>
+      <JournalID type="pmid">
+      </JournalID>
+      <JournalID type="pumbed">
+      </JournalID>
+      <JournalID type="doi">
+      </JournalID>
+      <JournalID type="other">
+      </JournalID>
+      <JOURNALTITLE>Physical Review B</JOURNALTITLE>
+      <JOURNALSUBTITLE>
+      </JOURNALSUBTITLE>
+      <TRANSJOURNALTITLE>
+      </TRANSJOURNALTITLE>
+      <ABBREVJOURNALTITLE>Phys. Rev. B</ABBREVJOURNALTITLE>
+      <ISSNPRINT>1098-0121</ISSNPRINT>
+      <ISSNONLINE>1550-235X</ISSNONLINE>
+      <PUBLISHERNAME>American Physical Society</PUBLISHERNAME>
+      <PUBLISHERLOCATION>
+      </PUBLISHERLOCATION>
+      <SELFURI>
+      </SELFURI>
+      <COPYRIGHTS>
+      </COPYRIGHTS>
+    </Global>
+    <OPENACCESS>
+      <OPEN_ACCESS_NO>
+      </OPEN_ACCESS_NO>
+      <OPEN_ACCESS_YES>
+      </OPEN_ACCESS_YES>
+      <OPEN_ACCESS_CC_BY>
+      </OPEN_ACCESS_CC_BY>
+      <OPEN_ACCESS_CC_BY_SA>
+      </OPEN_ACCESS_CC_BY_SA>
+      <OPEN_ACCESS_CC_BY_ND>
+      </OPEN_ACCESS_CC_BY_ND>
+      <OPEN_ACCESS_CC_BY_NC>
+      </OPEN_ACCESS_CC_BY_NC>
+      <OPEN_ACCESS_CC_BY_NC_SA>
+      </OPEN_ACCESS_CC_BY_NC_SA>
+      <OPEN_ACCESS_CC_BY_NC_ND>
+      </OPEN_ACCESS_CC_BY_NC_ND>
+    </OPENACCESS>
+    <ArticleSpecific metafile="starter.txt">
+      <ARTICLEID mandatory="False" active="True" metadata="%ACC" tagname=""/>
+      <DOI mandatory="False" active="True" metadata="%SC" tagname=""/>
+      <PMID mandatory="False" active="False" metadata="" tagname=""/>
+      <CODEN mandatory="False" active="False" metadata="" tagname=""/>
+      <MANUSCRIPT mandatory="False" active="True" metadata="%ACC" tagname=""/>
+      <PII mandatory="False" active="False" metadata="" tagname=""/>
+      <OTHER mandatory="False" active="False" metadata="" tagname=""/>
+      <SUBJECT_LEVEL1 mandatory="False" active="True" metadata="%SC" tagname=""/>
+      <SUBJECT_LEVEL2 mandatory="False" active="True" metadata="%SC" tagname=""/>
+      <PUBDATE_PRINT mandatory="False" active="True" metadata="" tagname=""/>
+      <PUBDATE_ONLINE mandatory="False" active="True" metadata="" tagname=""/>
+      <HISTORYDATE_RECEIVED mandatory="False" active="True" metadata="%RD" tagname=""/>
+      <HISTORYDATE_REV-REQUEST mandatory="False" active="False" metadata="" tagname=""/>
+      <HISTORYDATE_REV-RECEIVED mandatory="False" active="True" metadata="%RDREV" tagname=""/>
+      <HISTORYDATE_ACCEPTED mandatory="False" active="False" metadata="" tagname=""/>
+      <VOLUME mandatory="False" active="True" metadata="" tagname="00"/>
+      <ISSUE mandatory="False" active="True" metadata="" tagname="0"/>
+      <SUPPLEMENTARY_MATERIAL mandatory="False" active="False" metadata="" tagname=""/>
+      <COPYRIGHT_STATEMENT mandatory="False" active="True" metadata="%CP+%CPTXT+%CPHOLDER+%CPURL" tagname=""/>
+      <OPEN_ACCESS mandatory="False" active="False" metadata="" tagname=""/>
+      <ARTICLE_TYPE mandatory="False" active="True" metadata="%SC" tagname=""/>
+    </ArticleSpecific>
+  </Metadata>
+  <XmlConversion versionrequired="True" status="YTS">
+    <XMLValidation>
+      <DTDNAME>JATS-JOURNALPUBLISHING-OASIS-ARTICLE1-MATHML3</DTDNAME>
+      <MATHSTYLENAME>LaTeX</MATHSTYLENAME>
+      <FLOATPLACEMENT>End of Para</FLOATPLACEMENT>
+      <FLOATPOSITION>First callout </FLOATPOSITION>
+      <ENTITYSTYLE>ISO</ENTITYSTYLE>
+    </XMLValidation>
+    <DocValidation status="YTS">
+    </DocValidation>
+  </XmlConversion>
+  <CopyEditing versionrequired="True" status="YTS">
+  </CopyEditing>
+  <XmlConversion versionrequired="True" status="YTS">
+    <XMLValidation>
+      <DTDNAME>JATS-JOURNALPUBLISHING-OASIS-ARTICLE1-MATHML3</DTDNAME>
+      <MATHSTYLENAME>LaTeX</MATHSTYLENAME>
+      <FLOATPLACEMENT>End of Para</FLOATPLACEMENT>
+      <FLOATPOSITION>First callout </FLOATPOSITION>
+      <ENTITYSTYLE>ISO</ENTITYSTYLE>
+    </XMLValidation>
+    <DocValidation status="YTS">
+    </DocValidation>
+  </XmlConversion>
+  <Utility>
+    <Manual>
+      <Category name="General">
+        <Query>Please Check 3</Query>
+      </Category>
+    </Manual>
+  </Utility>
+  <Client id="5" name="APS" journalname="PRB"/>
+</Workflow>
 </file>
 
 <file path=customXml/item3.xml><?xml version="1.0" encoding="utf-8"?>
-<?mso-contentType ?>
-<FormTemplates xmlns="http://schemas.microsoft.com/sharepoint/v3/contenttype/forms">
-  <Display>DocumentLibraryForm</Display>
-  <Edit>DocumentLibraryForm</Edit>
-  <New>DocumentLibraryForm</New>
-</FormTemplates>
-</file>
-
-<file path=customXml/item4.xml><?xml version="1.0" encoding="utf-8"?>
 <ct:contentTypeSchema xmlns:ct="http://schemas.microsoft.com/office/2006/metadata/contentType" xmlns:ma="http://schemas.microsoft.com/office/2006/metadata/properties/metaAttributes" ct:_="" ma:_="" ma:contentTypeName="Document" ma:contentTypeID="0x010100E3E5285DEC1728458766D710599927CF" ma:contentTypeVersion="13" ma:contentTypeDescription="Create a new document." ma:contentTypeScope="" ma:versionID="d8e5ed547a2f90997a1b914aa7c15e9c">
   <xsd:schema xmlns:xsd="http://www.w3.org/2001/XMLSchema" xmlns:xs="http://www.w3.org/2001/XMLSchema" xmlns:p="http://schemas.microsoft.com/office/2006/metadata/properties" xmlns:ns3="1112fb0d-fe2d-4cf5-ba0d-ded80aadf55c" xmlns:ns4="aeedd7a4-3c25-4cff-81d5-572b843aa24a" targetNamespace="http://schemas.microsoft.com/office/2006/metadata/properties" ma:root="true" ma:fieldsID="775347bae56a6572a181144cb597f31a" ns3:_="" ns4:_="">
     <xsd:import namespace="1112fb0d-fe2d-4cf5-ba0d-ded80aadf55c"/>
@@ -15829,195 +16381,24 @@
 </ct:contentTypeSchema>
 </file>
 
+<file path=customXml/item4.xml><?xml version="1.0" encoding="utf-8"?>
+<?mso-contentType ?>
+<FormTemplates xmlns="http://schemas.microsoft.com/sharepoint/v3/contenttype/forms">
+  <Display>DocumentLibraryForm</Display>
+  <Edit>DocumentLibraryForm</Edit>
+  <New>DocumentLibraryForm</New>
+</FormTemplates>
+</file>
+
 <file path=customXml/item5.xml><?xml version="1.0" encoding="utf-8"?>
-<Workflow version="v.1.13">
-  <Filtration versionrequired="True" status="DONE" StartTime="25-07-2014 13:27:04" EndTime="25-07-2014 13:28:29">
-    <Mandatory>
-      <P status="DONE" StartTime="25-07-2014 13:27:42" EndTime="25-07-2014 13:27:43">(1) * Replace leftmost and rightmost char -(hyphen) of superscript matter, into minus</P>
-      <P status="DONE" StartTime="25-07-2014 13:27:43" EndTime="25-07-2014 13:27:44">(2) * Replace all variations of degree into 'degree' symbol</P>
-      <P status="DONE" StartTime="25-07-2014 13:27:44" EndTime="25-07-2014 13:27:44">(3) * Remove unwanted blank lines</P>
-      <P status="DONE" StartTime="25-07-2014 13:27:44" EndTime="25-07-2014 13:27:44">(4) * Replace underlined 'plus' sign(s) with plus/minus symbol(s)</P>
-      <P status="DONE" StartTime="25-07-2014 13:27:44" EndTime="25-07-2014 13:27:44">(5) * Replace underlined 'Greater Than' symbol(s) with 'Greater Than or Equal To' symbol(s)</P>
-      <P status="DONE" StartTime="25-07-2014 13:27:44" EndTime="25-07-2014 13:27:45">(6) * Replace underlined 'Less Than' symbol(s) with 'Less Than or Equal To' symbol(s)</P>
-      <P status="DONE" StartTime="25-07-2014 13:27:45" EndTime="25-07-2014 13:27:46">(7) * Replace 'x' with 'multiplication' symbol</P>
-      <P status="DONE" StartTime="25-07-2014 13:27:46" EndTime="25-07-2014 13:27:46">(8) * Remove space(s) before tab</P>
-      <P status="DONE" StartTime="25-07-2014 13:27:46" EndTime="25-07-2014 13:27:46">(9) * Remove space(s) after tab</P>
-      <P status="DONE" StartTime="25-07-2014 13:27:46" EndTime="25-07-2014 13:27:47">(10) * Remove tab(s) before paragraph mark</P>
-      <P status="DONE" StartTime="25-07-2014 13:27:47" EndTime="25-07-2014 13:27:47">(11) * Remove tab(s) after paragraph mark</P>
-      <P status="DONE" StartTime="25-07-2014 13:27:47" EndTime="25-07-2014 13:27:50">(12) * Remove space(s) before paragraph mark</P>
-      <P status="DONE" StartTime="25-07-2014 13:27:50" EndTime="25-07-2014 13:27:51">(13) * Remove space(s) after paragraph mark</P>
-      <P status="DONE" StartTime="25-07-2014 13:27:51" EndTime="25-07-2014 13:27:51">(14) * Replace multiple space(s) with single space</P>
-      <P status="DONE" StartTime="25-07-2014 13:27:51" EndTime="25-07-2014 13:28:14">(16) * Replace 'single hyphen' inside page range/number range with 'double hyphen'</P>
-      <P status="DONE" StartTime="25-07-2014 13:28:14" EndTime="25-07-2014 13:28:14">(18) * Change smart quote(s) to straight quote(s)</P>
-      <P status="DONE" StartTime="25-07-2014 13:28:14" EndTime="25-07-2014 13:28:15">(19) * Change straight quote(s) to smart quote(s)</P>
-      <P status="DONE" StartTime="25-07-2014 13:28:15" EndTime="25-07-2014 13:28:15">(20) * Change three consecutive dots to Ellipsis(...)</P>
-      <P status="DONE" StartTime="25-07-2014 13:28:15" EndTime="25-07-2014 13:28:16">(22) * Remove space(s) before comma</P>
-      <P status="DONE" StartTime="25-07-2014 13:28:16" EndTime="25-07-2014 13:28:16">(23) * Remove space(s) before semicolon</P>
-      <P status="DONE" StartTime="25-07-2014 13:28:16" EndTime="25-07-2014 13:28:17">(24) * Remove space(s) before period</P>
-      <P status="DONE" StartTime="25-07-2014 13:28:17" EndTime="25-07-2014 13:28:17">(25) * Remove space(s) before closing parenthesis</P>
-      <P status="DONE" StartTime="25-07-2014 13:28:17" EndTime="25-07-2014 13:28:17">(26) * Remove space(s) after opening parenthesis</P>
-      <P status="DONE" StartTime="25-07-2014 13:28:17" EndTime="25-07-2014 13:28:18">(28) * Remove space(s) before % sign</P>
-      <P status="DONE" StartTime="25-07-2014 13:28:18" EndTime="25-07-2014 13:28:18">(29) * Remove space before Celsius or Fahrenheit sign</P>
-      <P status="DONE" StartTime="25-07-2014 13:28:18" EndTime="25-07-2014 13:28:19">(34) * Convert 'direction' sign(s) to symbol(s)</P>
-      <P status="DONE" StartTime="25-07-2014 13:28:19" EndTime="25-07-2014 13:28:20">(38) * Remove unwanted section/page/column Breaks</P>
-      <P status="DONE" StartTime="25-07-2014 13:28:20" EndTime="25-07-2014 13:28:22">(47) * Convert 'direction' arrow(s) to symbol(s)</P>
-    </Mandatory>
-    <Optional>
-      <P status="YTS">(15) * Change 'Em Dash' with --- (triple hyphen) and 'En Dash' with -- (double hyphen)</P>
-      <P status="YTS">(17) * Change 'double hyphen' inside page range/number range into 'single hyphen'</P>
-      <P status="YTS">(21) * Change hyphen (with space both side) into En Dash (with space both side)</P>
-      <P status="YTS">(27) * Remove comma from digits</P>
-      <P status="YTS">(30) * Convert tab mark(s) to standard form</P>
-      <P status="YTS">(31) * Add 'space' before and after 'equal sign'</P>
-      <P status="YTS">(32) * Move 'period' from outside closing double quote(s) to inside</P>
-      <P status="YTS">(33) * Move 'comma' from outside closing double quote(s) to inside</P>
-      <P status="YTS">(35) * Convert 'hard return' mark(s) to standard form</P>
-      <P status="YTS">(36) * Insert 'En Space' in COMMON SI and Metric units</P>
-      <P status="YTS">(37) * Insert 'En Space' for COMPLEX (&gt;550 units) SI and Metric units</P>
-      <P status="YTS">(39) * Replace Em dash with spaces on both sides to En dash with spaces on both sides</P>
-      <P status="YTS">(40) * Replace --- (Triple hyphens) with spaces on both sides to En dash with spaces on both sides</P>
-      <P status="YTS">(41) * Replace --- (Triple hyphens) without spaces on both sides to En dash with spaces on both sides</P>
-      <P status="YTS">(42) * Replace -- (Double hyphens) with spaces on both sides to En dash with spaces on both sides</P>
-      <P status="YTS">(43) * Insert 'Non-breaking Space' for COMPLEX (&gt;550 units) SI and Metric units</P>
-      <P status="YTS">(44) * Remove header and footer information</P>
-      <P status="YTS">(45) * Remove space before superscript footnote/endnote citations</P>
-      <P status="YTS">(46) * Remove Optional Hyphen Between Word</P>
-    </Optional>
-  </Filtration>
-  <BodyStyling versionrequired="True" status="DONE" StartTime="25-07-2014 13:29:21" EndTime="25-07-2014 13:33:39">
-    <TagMapping status="DONE">
-    </TagMapping>
-    <StyleMapping status="DONE">
-    </StyleMapping>
-  </BodyStyling>
-  <Reference versionrequired="True" status="DONE" StartTime="25-07-2014 13:34:10" EndTime="25-07-2014 13:37:04">
-  </Reference>
-  <CrossLinking versionrequired="True" status="YTS">
-  </CrossLinking>
-  <DOI versionrequired="True" status="YTS">
-  </DOI>
-  <Metadata versionrequired="True" status="YTS">
-    <Global>
-      <JournalID type="publisher">PRB</JournalID>
-      <JournalID type="coden">PRBMDO</JournalID>
-      <JournalID type="hwp">
-      </JournalID>
-      <JournalID type="pmc">
-      </JournalID>
-      <JournalID type="nlmta">
-      </JournalID>
-      <JournalID type="pmid">
-      </JournalID>
-      <JournalID type="pumbed">
-      </JournalID>
-      <JournalID type="doi">
-      </JournalID>
-      <JournalID type="other">
-      </JournalID>
-      <JOURNALTITLE>Physical Review B</JOURNALTITLE>
-      <JOURNALSUBTITLE>
-      </JOURNALSUBTITLE>
-      <TRANSJOURNALTITLE>
-      </TRANSJOURNALTITLE>
-      <ABBREVJOURNALTITLE>Phys. Rev. B</ABBREVJOURNALTITLE>
-      <ISSNPRINT>1098-0121</ISSNPRINT>
-      <ISSNONLINE>1550-235X</ISSNONLINE>
-      <PUBLISHERNAME>American Physical Society</PUBLISHERNAME>
-      <PUBLISHERLOCATION>
-      </PUBLISHERLOCATION>
-      <SELFURI>
-      </SELFURI>
-      <COPYRIGHTS>
-      </COPYRIGHTS>
-    </Global>
-    <OPENACCESS>
-      <OPEN_ACCESS_NO>
-      </OPEN_ACCESS_NO>
-      <OPEN_ACCESS_YES>
-      </OPEN_ACCESS_YES>
-      <OPEN_ACCESS_CC_BY>
-      </OPEN_ACCESS_CC_BY>
-      <OPEN_ACCESS_CC_BY_SA>
-      </OPEN_ACCESS_CC_BY_SA>
-      <OPEN_ACCESS_CC_BY_ND>
-      </OPEN_ACCESS_CC_BY_ND>
-      <OPEN_ACCESS_CC_BY_NC>
-      </OPEN_ACCESS_CC_BY_NC>
-      <OPEN_ACCESS_CC_BY_NC_SA>
-      </OPEN_ACCESS_CC_BY_NC_SA>
-      <OPEN_ACCESS_CC_BY_NC_ND>
-      </OPEN_ACCESS_CC_BY_NC_ND>
-    </OPENACCESS>
-    <ArticleSpecific metafile="starter.txt">
-      <ARTICLEID mandatory="False" active="True" metadata="%ACC" tagname=""/>
-      <DOI mandatory="False" active="True" metadata="%SC" tagname=""/>
-      <PMID mandatory="False" active="False" metadata="" tagname=""/>
-      <CODEN mandatory="False" active="False" metadata="" tagname=""/>
-      <MANUSCRIPT mandatory="False" active="True" metadata="%ACC" tagname=""/>
-      <PII mandatory="False" active="False" metadata="" tagname=""/>
-      <OTHER mandatory="False" active="False" metadata="" tagname=""/>
-      <SUBJECT_LEVEL1 mandatory="False" active="True" metadata="%SC" tagname=""/>
-      <SUBJECT_LEVEL2 mandatory="False" active="True" metadata="%SC" tagname=""/>
-      <PUBDATE_PRINT mandatory="False" active="True" metadata="" tagname=""/>
-      <PUBDATE_ONLINE mandatory="False" active="True" metadata="" tagname=""/>
-      <HISTORYDATE_RECEIVED mandatory="False" active="True" metadata="%RD" tagname=""/>
-      <HISTORYDATE_REV-REQUEST mandatory="False" active="False" metadata="" tagname=""/>
-      <HISTORYDATE_REV-RECEIVED mandatory="False" active="True" metadata="%RDREV" tagname=""/>
-      <HISTORYDATE_ACCEPTED mandatory="False" active="False" metadata="" tagname=""/>
-      <VOLUME mandatory="False" active="True" metadata="" tagname="00"/>
-      <ISSUE mandatory="False" active="True" metadata="" tagname="0"/>
-      <SUPPLEMENTARY_MATERIAL mandatory="False" active="False" metadata="" tagname=""/>
-      <COPYRIGHT_STATEMENT mandatory="False" active="True" metadata="%CP+%CPTXT+%CPHOLDER+%CPURL" tagname=""/>
-      <OPEN_ACCESS mandatory="False" active="False" metadata="" tagname=""/>
-      <ARTICLE_TYPE mandatory="False" active="True" metadata="%SC" tagname=""/>
-    </ArticleSpecific>
-  </Metadata>
-  <XmlConversion versionrequired="True" status="YTS">
-    <XMLValidation>
-      <DTDNAME>JATS-JOURNALPUBLISHING-OASIS-ARTICLE1-MATHML3</DTDNAME>
-      <MATHSTYLENAME>LaTeX</MATHSTYLENAME>
-      <FLOATPLACEMENT>End of Para</FLOATPLACEMENT>
-      <FLOATPOSITION>First callout </FLOATPOSITION>
-      <ENTITYSTYLE>ISO</ENTITYSTYLE>
-    </XMLValidation>
-    <DocValidation status="YTS">
-    </DocValidation>
-  </XmlConversion>
-  <CopyEditing versionrequired="True" status="YTS">
-  </CopyEditing>
-  <XmlConversion versionrequired="True" status="YTS">
-    <XMLValidation>
-      <DTDNAME>JATS-JOURNALPUBLISHING-OASIS-ARTICLE1-MATHML3</DTDNAME>
-      <MATHSTYLENAME>LaTeX</MATHSTYLENAME>
-      <FLOATPLACEMENT>End of Para</FLOATPLACEMENT>
-      <FLOATPOSITION>First callout </FLOATPOSITION>
-      <ENTITYSTYLE>ISO</ENTITYSTYLE>
-    </XMLValidation>
-    <DocValidation status="YTS">
-    </DocValidation>
-  </XmlConversion>
-  <Utility>
-    <Manual>
-      <Category name="General">
-        <Query>Please Check 3</Query>
-      </Category>
-    </Manual>
-  </Utility>
-  <Client id="5" name="APS" journalname="PRB"/>
-</Workflow>
+<p:properties xmlns:p="http://schemas.microsoft.com/office/2006/metadata/properties" xmlns:xsi="http://www.w3.org/2001/XMLSchema-instance" xmlns:pc="http://schemas.microsoft.com/office/infopath/2007/PartnerControls">
+  <documentManagement>
+    <_activity xmlns="1112fb0d-fe2d-4cf5-ba0d-ded80aadf55c" xsi:nil="true"/>
+  </documentManagement>
+</p:properties>
 </file>
 
 <file path=customXml/itemProps1.xml><?xml version="1.0" encoding="utf-8"?>
-<ds:datastoreItem xmlns:ds="http://schemas.openxmlformats.org/officeDocument/2006/customXml" ds:itemID="{5293C4E6-2A44-4085-88BC-9CCCD5DAF4E2}">
-  <ds:schemaRefs>
-    <ds:schemaRef ds:uri="http://schemas.microsoft.com/office/2006/metadata/properties"/>
-    <ds:schemaRef ds:uri="http://schemas.microsoft.com/office/infopath/2007/PartnerControls"/>
-    <ds:schemaRef ds:uri="1112fb0d-fe2d-4cf5-ba0d-ded80aadf55c"/>
-  </ds:schemaRefs>
-</ds:datastoreItem>
-</file>
-
-<file path=customXml/itemProps2.xml><?xml version="1.0" encoding="utf-8"?>
 <ds:datastoreItem xmlns:ds="http://schemas.openxmlformats.org/officeDocument/2006/customXml" ds:itemID="{B589180B-96F4-4B3D-93D7-E2C64345EF74}">
   <ds:schemaRefs>
     <ds:schemaRef ds:uri="http://schemas.openxmlformats.org/officeDocument/2006/bibliography"/>
@@ -16025,15 +16406,13 @@
 </ds:datastoreItem>
 </file>
 
-<file path=customXml/itemProps3.xml><?xml version="1.0" encoding="utf-8"?>
-<ds:datastoreItem xmlns:ds="http://schemas.openxmlformats.org/officeDocument/2006/customXml" ds:itemID="{EDBB85A4-1C45-466C-B8CE-BC57B6E8D826}">
-  <ds:schemaRefs>
-    <ds:schemaRef ds:uri="http://schemas.microsoft.com/sharepoint/v3/contenttype/forms"/>
-  </ds:schemaRefs>
+<file path=customXml/itemProps2.xml><?xml version="1.0" encoding="utf-8"?>
+<ds:datastoreItem xmlns:ds="http://schemas.openxmlformats.org/officeDocument/2006/customXml" ds:itemID="{4D45DBA2-DCF6-46BF-858B-9A8CC8161B4D}">
+  <ds:schemaRefs/>
 </ds:datastoreItem>
 </file>
 
-<file path=customXml/itemProps4.xml><?xml version="1.0" encoding="utf-8"?>
+<file path=customXml/itemProps3.xml><?xml version="1.0" encoding="utf-8"?>
 <ds:datastoreItem xmlns:ds="http://schemas.openxmlformats.org/officeDocument/2006/customXml" ds:itemID="{0DE0F1DE-0F19-4E36-8168-5D26F2DE53D9}">
   <ds:schemaRefs>
     <ds:schemaRef ds:uri="http://schemas.microsoft.com/office/2006/metadata/contentType"/>
@@ -16052,8 +16431,20 @@
 </ds:datastoreItem>
 </file>
 
+<file path=customXml/itemProps4.xml><?xml version="1.0" encoding="utf-8"?>
+<ds:datastoreItem xmlns:ds="http://schemas.openxmlformats.org/officeDocument/2006/customXml" ds:itemID="{EDBB85A4-1C45-466C-B8CE-BC57B6E8D826}">
+  <ds:schemaRefs>
+    <ds:schemaRef ds:uri="http://schemas.microsoft.com/sharepoint/v3/contenttype/forms"/>
+  </ds:schemaRefs>
+</ds:datastoreItem>
+</file>
+
 <file path=customXml/itemProps5.xml><?xml version="1.0" encoding="utf-8"?>
-<ds:datastoreItem xmlns:ds="http://schemas.openxmlformats.org/officeDocument/2006/customXml" ds:itemID="{4D45DBA2-DCF6-46BF-858B-9A8CC8161B4D}">
-  <ds:schemaRefs/>
+<ds:datastoreItem xmlns:ds="http://schemas.openxmlformats.org/officeDocument/2006/customXml" ds:itemID="{5293C4E6-2A44-4085-88BC-9CCCD5DAF4E2}">
+  <ds:schemaRefs>
+    <ds:schemaRef ds:uri="http://schemas.microsoft.com/office/2006/metadata/properties"/>
+    <ds:schemaRef ds:uri="http://schemas.microsoft.com/office/infopath/2007/PartnerControls"/>
+    <ds:schemaRef ds:uri="1112fb0d-fe2d-4cf5-ba0d-ded80aadf55c"/>
+  </ds:schemaRefs>
 </ds:datastoreItem>
 </file>
</xml_diff>

<commit_message>
lit review is in and here
</commit_message>
<xml_diff>
--- a/Team Theia Research Paper.docx
+++ b/Team Theia Research Paper.docx
@@ -1176,1092 +1176,234 @@
     </w:p>
     <w:p>
       <w:pPr>
-        <w:pStyle w:val="Para"/>
         <w:spacing w:line="360" w:lineRule="auto"/>
         <w:ind w:firstLine="708"/>
-        <w:jc w:val="both"/>
-        <w:rPr>
-          <w:rFonts w:ascii="Times New Roman" w:eastAsia="Times New Roman" w:hAnsi="Times New Roman" w:cs="Times New Roman"/>
-          <w14:ligatures w14:val="standard"/>
-        </w:rPr>
-      </w:pPr>
-      <w:commentRangeStart w:id="1"/>
-      <w:r>
-        <w:rPr>
-          <w:rStyle w:val="Label"/>
-          <w:rFonts w:ascii="Times New Roman" w:eastAsia="Times New Roman" w:hAnsi="Times New Roman" w:cs="Times New Roman"/>
-          <w14:ligatures w14:val="standard"/>
-        </w:rPr>
-        <w:t>PimEyes</w:t>
-      </w:r>
-      <w:r>
-        <w:rPr>
-          <w:rStyle w:val="Label"/>
-          <w:rFonts w:ascii="Times New Roman" w:eastAsia="Times New Roman" w:hAnsi="Times New Roman" w:cs="Times New Roman"/>
-        </w:rPr>
-        <w:t xml:space="preserve"> is an online facial </w:t>
-      </w:r>
-      <w:r>
-        <w:rPr>
-          <w:rStyle w:val="Label"/>
-          <w:rFonts w:ascii="Times New Roman" w:eastAsia="Times New Roman" w:hAnsi="Times New Roman" w:cs="Times New Roman"/>
-          <w14:ligatures w14:val="standard"/>
-        </w:rPr>
-        <w:t>recognition</w:t>
-      </w:r>
-      <w:r>
-        <w:rPr>
-          <w:rStyle w:val="Label"/>
-          <w:rFonts w:ascii="Times New Roman" w:eastAsia="Times New Roman" w:hAnsi="Times New Roman" w:cs="Times New Roman"/>
-          <w14:ligatures w14:val="standard"/>
-        </w:rPr>
-        <w:t xml:space="preserve"> </w:t>
-      </w:r>
-      <w:r>
-        <w:rPr>
-          <w:rStyle w:val="Label"/>
-          <w:rFonts w:ascii="Times New Roman" w:eastAsia="Times New Roman" w:hAnsi="Times New Roman" w:cs="Times New Roman"/>
-          <w14:ligatures w14:val="standard"/>
-        </w:rPr>
-        <w:t>software</w:t>
-      </w:r>
-      <w:r>
-        <w:rPr>
-          <w:rStyle w:val="Label"/>
-          <w:rFonts w:ascii="Times New Roman" w:eastAsia="Times New Roman" w:hAnsi="Times New Roman" w:cs="Times New Roman"/>
-          <w14:ligatures w14:val="standard"/>
-        </w:rPr>
-        <w:t xml:space="preserve"> and API that allows users to </w:t>
-      </w:r>
-      <w:r>
-        <w:rPr>
-          <w:rStyle w:val="Label"/>
-          <w:rFonts w:ascii="Times New Roman" w:eastAsia="Times New Roman" w:hAnsi="Times New Roman" w:cs="Times New Roman"/>
-          <w14:ligatures w14:val="standard"/>
-        </w:rPr>
-        <w:t>upload</w:t>
-      </w:r>
-      <w:r>
-        <w:rPr>
-          <w:rStyle w:val="Label"/>
-          <w:rFonts w:ascii="Times New Roman" w:eastAsia="Times New Roman" w:hAnsi="Times New Roman" w:cs="Times New Roman"/>
-          <w14:ligatures w14:val="standard"/>
-        </w:rPr>
-        <w:t xml:space="preserve"> a photo and </w:t>
-      </w:r>
-      <w:r>
-        <w:rPr>
-          <w:rStyle w:val="Label"/>
-          <w:rFonts w:ascii="Times New Roman" w:eastAsia="Times New Roman" w:hAnsi="Times New Roman" w:cs="Times New Roman"/>
-          <w14:ligatures w14:val="standard"/>
-        </w:rPr>
-        <w:t>search</w:t>
-      </w:r>
-      <w:r>
-        <w:rPr>
-          <w:rStyle w:val="Label"/>
-          <w:rFonts w:ascii="Times New Roman" w:eastAsia="Times New Roman" w:hAnsi="Times New Roman" w:cs="Times New Roman"/>
-          <w14:ligatures w14:val="standard"/>
-        </w:rPr>
-        <w:t xml:space="preserve"> for matching </w:t>
-      </w:r>
-      <w:r>
-        <w:rPr>
-          <w:rStyle w:val="Label"/>
-          <w:rFonts w:ascii="Times New Roman" w:eastAsia="Times New Roman" w:hAnsi="Times New Roman" w:cs="Times New Roman"/>
-          <w14:ligatures w14:val="standard"/>
-        </w:rPr>
-        <w:t>appearances</w:t>
-      </w:r>
-      <w:r>
-        <w:rPr>
-          <w:rStyle w:val="Label"/>
-          <w:rFonts w:ascii="Times New Roman" w:eastAsia="Times New Roman" w:hAnsi="Times New Roman" w:cs="Times New Roman"/>
-          <w14:ligatures w14:val="standard"/>
-        </w:rPr>
-        <w:t xml:space="preserve"> [1]</w:t>
-      </w:r>
-      <w:r>
-        <w:rPr>
-          <w:rStyle w:val="Label"/>
-          <w:rFonts w:ascii="Times New Roman" w:eastAsia="Times New Roman" w:hAnsi="Times New Roman" w:cs="Times New Roman"/>
-          <w14:ligatures w14:val="standard"/>
-        </w:rPr>
-        <w:t>.</w:t>
-      </w:r>
-      <w:commentRangeEnd w:id="1"/>
-      <w:r>
-        <w:rPr>
-          <w:rStyle w:val="CommentReference"/>
-          <w:rFonts w:ascii="Times New Roman" w:eastAsia="Times New Roman" w:hAnsi="Times New Roman" w:cs="Times New Roman"/>
-          <w:sz w:val="18"/>
-          <w:szCs w:val="22"/>
-        </w:rPr>
-        <w:commentReference w:id="1"/>
-      </w:r>
-      <w:r>
-        <w:rPr>
-          <w:rStyle w:val="Label"/>
-          <w:rFonts w:ascii="Times New Roman" w:eastAsia="Times New Roman" w:hAnsi="Times New Roman" w:cs="Times New Roman"/>
-        </w:rPr>
-        <w:t xml:space="preserve"> </w:t>
-      </w:r>
-      <w:r>
-        <w:rPr>
-          <w:rStyle w:val="Label"/>
-          <w:rFonts w:ascii="Times New Roman" w:eastAsia="Times New Roman" w:hAnsi="Times New Roman" w:cs="Times New Roman"/>
-          <w14:ligatures w14:val="standard"/>
-        </w:rPr>
-        <w:t xml:space="preserve">It uses AI powered detection and an </w:t>
-      </w:r>
-      <w:r>
-        <w:rPr>
-          <w:rStyle w:val="Label"/>
-          <w:rFonts w:ascii="Times New Roman" w:eastAsia="Times New Roman" w:hAnsi="Times New Roman" w:cs="Times New Roman"/>
-          <w14:ligatures w14:val="standard"/>
-        </w:rPr>
-        <w:t>extensive</w:t>
-      </w:r>
-      <w:r>
-        <w:rPr>
-          <w:rStyle w:val="Label"/>
-          <w:rFonts w:ascii="Times New Roman" w:eastAsia="Times New Roman" w:hAnsi="Times New Roman" w:cs="Times New Roman"/>
-          <w14:ligatures w14:val="standard"/>
-        </w:rPr>
-        <w:t xml:space="preserve"> face database built through web-</w:t>
-      </w:r>
-      <w:r>
-        <w:rPr>
-          <w:rStyle w:val="Label"/>
-          <w:rFonts w:ascii="Times New Roman" w:eastAsia="Times New Roman" w:hAnsi="Times New Roman" w:cs="Times New Roman"/>
-          <w14:ligatures w14:val="standard"/>
-        </w:rPr>
-        <w:t>scraping</w:t>
-      </w:r>
-      <w:r>
-        <w:rPr>
-          <w:rStyle w:val="Label"/>
-          <w:rFonts w:ascii="Times New Roman" w:eastAsia="Times New Roman" w:hAnsi="Times New Roman" w:cs="Times New Roman"/>
-          <w14:ligatures w14:val="standard"/>
-        </w:rPr>
-        <w:t xml:space="preserve">, returning URLs where that </w:t>
-      </w:r>
-      <w:r>
-        <w:rPr>
-          <w:rStyle w:val="Label"/>
-          <w:rFonts w:ascii="Times New Roman" w:eastAsia="Times New Roman" w:hAnsi="Times New Roman" w:cs="Times New Roman"/>
-          <w14:ligatures w14:val="standard"/>
-        </w:rPr>
-        <w:t>person’s</w:t>
-      </w:r>
-      <w:r>
-        <w:rPr>
-          <w:rStyle w:val="Label"/>
-          <w:rFonts w:ascii="Times New Roman" w:eastAsia="Times New Roman" w:hAnsi="Times New Roman" w:cs="Times New Roman"/>
-          <w14:ligatures w14:val="standard"/>
-        </w:rPr>
-        <w:t xml:space="preserve"> face appears</w:t>
-      </w:r>
-      <w:r>
-        <w:rPr>
-          <w:rStyle w:val="Label"/>
-          <w:rFonts w:ascii="Times New Roman" w:eastAsia="Times New Roman" w:hAnsi="Times New Roman" w:cs="Times New Roman"/>
-          <w14:ligatures w14:val="standard"/>
-        </w:rPr>
-        <w:t xml:space="preserve">. The company </w:t>
-      </w:r>
-      <w:r>
-        <w:rPr>
-          <w:rStyle w:val="Label"/>
-          <w:rFonts w:ascii="Times New Roman" w:eastAsia="Times New Roman" w:hAnsi="Times New Roman" w:cs="Times New Roman"/>
-          <w14:ligatures w14:val="standard"/>
-        </w:rPr>
-        <w:t>markets</w:t>
-      </w:r>
-      <w:r>
-        <w:rPr>
-          <w:rStyle w:val="Label"/>
-          <w:rFonts w:ascii="Times New Roman" w:eastAsia="Times New Roman" w:hAnsi="Times New Roman" w:cs="Times New Roman"/>
-          <w14:ligatures w14:val="standard"/>
-        </w:rPr>
-        <w:t xml:space="preserve"> the service as a way for </w:t>
-      </w:r>
-      <w:r>
-        <w:rPr>
-          <w:rStyle w:val="Label"/>
-          <w:rFonts w:ascii="Times New Roman" w:eastAsia="Times New Roman" w:hAnsi="Times New Roman" w:cs="Times New Roman"/>
-          <w14:ligatures w14:val="standard"/>
-        </w:rPr>
-        <w:t>individuals</w:t>
-      </w:r>
-      <w:r>
-        <w:rPr>
-          <w:rStyle w:val="Label"/>
-          <w:rFonts w:ascii="Times New Roman" w:eastAsia="Times New Roman" w:hAnsi="Times New Roman" w:cs="Times New Roman"/>
-          <w14:ligatures w14:val="standard"/>
-        </w:rPr>
-        <w:t xml:space="preserve"> to </w:t>
-      </w:r>
-      <w:r>
-        <w:rPr>
-          <w:rStyle w:val="Label"/>
-          <w:rFonts w:ascii="Times New Roman" w:eastAsia="Times New Roman" w:hAnsi="Times New Roman" w:cs="Times New Roman"/>
-        </w:rPr>
-        <w:t xml:space="preserve">monitor and manage their online </w:t>
-      </w:r>
-      <w:r>
-        <w:rPr>
-          <w:rStyle w:val="Label"/>
-          <w:rFonts w:ascii="Times New Roman" w:eastAsia="Times New Roman" w:hAnsi="Times New Roman" w:cs="Times New Roman"/>
-          <w14:ligatures w14:val="standard"/>
-        </w:rPr>
-        <w:t xml:space="preserve">presence. </w:t>
-      </w:r>
-      <w:r>
-        <w:rPr>
-          <w:rStyle w:val="Label"/>
-          <w:rFonts w:ascii="Times New Roman" w:eastAsia="Times New Roman" w:hAnsi="Times New Roman" w:cs="Times New Roman"/>
-          <w14:ligatures w14:val="standard"/>
-        </w:rPr>
-        <w:t xml:space="preserve">Its </w:t>
-      </w:r>
-      <w:r>
-        <w:rPr>
-          <w:rFonts w:ascii="Times New Roman" w:eastAsia="Times New Roman" w:hAnsi="Times New Roman" w:cs="Times New Roman"/>
-        </w:rPr>
-        <w:t xml:space="preserve">primary advantage is speed and accuracy, with the platform often praised for how quickly and precisely it </w:t>
-      </w:r>
-      <w:r>
-        <w:rPr>
-          <w:rFonts w:ascii="Times New Roman" w:eastAsia="Times New Roman" w:hAnsi="Times New Roman" w:cs="Times New Roman"/>
-        </w:rPr>
-        <w:t xml:space="preserve">identifies matches. </w:t>
-      </w:r>
-      <w:r>
-        <w:rPr>
-          <w:rFonts w:ascii="Times New Roman" w:eastAsia="Times New Roman" w:hAnsi="Times New Roman" w:cs="Times New Roman"/>
-        </w:rPr>
-        <w:t>It is also framed as a privacy tool for users seeking to control their digital footprint.</w:t>
-      </w:r>
-      <w:r>
-        <w:rPr>
-          <w:rFonts w:ascii="Times New Roman" w:eastAsia="Times New Roman" w:hAnsi="Times New Roman" w:cs="Times New Roman"/>
-        </w:rPr>
-        <w:t xml:space="preserve"> </w:t>
-      </w:r>
-      <w:r>
-        <w:rPr>
-          <w:rFonts w:ascii="Times New Roman" w:eastAsia="Times New Roman" w:hAnsi="Times New Roman" w:cs="Times New Roman"/>
-        </w:rPr>
-        <w:t xml:space="preserve">However, </w:t>
-      </w:r>
-      <w:r>
-        <w:rPr>
-          <w:rFonts w:ascii="Times New Roman" w:eastAsia="Times New Roman" w:hAnsi="Times New Roman" w:cs="Times New Roman"/>
-        </w:rPr>
-        <w:t xml:space="preserve">PimEyes has been heavily criticized for misuse, including concerns that third parties could use it for surveillance, stalking, or other unethical purposes. Legal disputes in Europe have also placed the platform under scrutiny, with lawsuits questioning whether its data scraping practices comply with privacy laws. This tension between personal security and privacy risks highlights the broader ethical dilemma surrounding facial recognition technology. </w:t>
+        <w:rPr>
+          <w:rFonts w:ascii="Times New Roman" w:eastAsia="Times New Roman" w:hAnsi="Times New Roman" w:cs="Times New Roman"/>
+        </w:rPr>
+      </w:pPr>
+      <w:r>
+        <w:rPr>
+          <w:rFonts w:ascii="Times New Roman" w:eastAsia="Times New Roman" w:hAnsi="Times New Roman" w:cs="Times New Roman"/>
+        </w:rPr>
+        <w:t xml:space="preserve">The landscape of facial recognition technology is </w:t>
+      </w:r>
+      <w:r>
+        <w:rPr>
+          <w:rFonts w:ascii="Times New Roman" w:eastAsia="Times New Roman" w:hAnsi="Times New Roman" w:cs="Times New Roman"/>
+        </w:rPr>
+        <w:t>currently</w:t>
+      </w:r>
+      <w:r>
+        <w:rPr>
+          <w:rFonts w:ascii="Times New Roman" w:eastAsia="Times New Roman" w:hAnsi="Times New Roman" w:cs="Times New Roman"/>
+        </w:rPr>
+        <w:t xml:space="preserve"> defined by powerful, yet often opaque, systems. Platforms like PimEyes [2] and ProFaceFinder [3] demonstrate the rapid identification capabilities possible through expansive, web-scraped databases and AI detection. However, these systems face severe ethical and legal scrutiny due to </w:t>
+      </w:r>
+      <w:r>
+        <w:rPr>
+          <w:rFonts w:ascii="Times New Roman" w:eastAsia="Times New Roman" w:hAnsi="Times New Roman" w:cs="Times New Roman"/>
+        </w:rPr>
+        <w:t>the non-transparent</w:t>
+      </w:r>
+      <w:r>
+        <w:rPr>
+          <w:rFonts w:ascii="Times New Roman" w:eastAsia="Times New Roman" w:hAnsi="Times New Roman" w:cs="Times New Roman"/>
+        </w:rPr>
+        <w:t xml:space="preserve"> data </w:t>
+      </w:r>
+      <w:r>
+        <w:rPr>
+          <w:rFonts w:ascii="Times New Roman" w:eastAsia="Times New Roman" w:hAnsi="Times New Roman" w:cs="Times New Roman"/>
+        </w:rPr>
+        <w:t>source</w:t>
+      </w:r>
+      <w:r>
+        <w:rPr>
+          <w:rFonts w:ascii="Times New Roman" w:eastAsia="Times New Roman" w:hAnsi="Times New Roman" w:cs="Times New Roman"/>
+        </w:rPr>
+        <w:t xml:space="preserve"> and their potential for unauthorized surveillance. On the other end of the spectrum, systems like Regula’s Face SDK [4] and Apple’s Face ID [5] prioritize security and user privacy, often relying on local encryption and rigorous anti-spoofing measures. While Apple’s on-device storage effectively mitigates broader surveillance risks, such technologies remain locked within proprietary ecosystems. Face SDK, while highly adaptable for institutional use, suffers from accuracy degradation in the presence of occlusions, poor lighting, or low-resolution inputs, limitations that frequently occur in dynamic, real-world environments. </w:t>
       </w:r>
     </w:p>
     <w:p>
       <w:pPr>
-        <w:pStyle w:val="Para"/>
         <w:spacing w:line="360" w:lineRule="auto"/>
         <w:ind w:firstLine="708"/>
-        <w:jc w:val="both"/>
-        <w:rPr>
-          <w:rFonts w:ascii="Times New Roman" w:eastAsia="Times New Roman" w:hAnsi="Times New Roman" w:cs="Times New Roman"/>
-        </w:rPr>
-      </w:pPr>
-      <w:r>
-        <w:rPr>
-          <w:rFonts w:ascii="Times New Roman" w:eastAsia="Times New Roman" w:hAnsi="Times New Roman" w:cs="Times New Roman"/>
-        </w:rPr>
-        <w:t xml:space="preserve">ProFaceFinder is a reverse image search engine </w:t>
-      </w:r>
-      <w:r>
-        <w:rPr>
-          <w:rFonts w:ascii="Times New Roman" w:eastAsia="Times New Roman" w:hAnsi="Times New Roman" w:cs="Times New Roman"/>
-        </w:rPr>
-        <w:t xml:space="preserve">that scans online platforms </w:t>
-      </w:r>
-      <w:r>
-        <w:rPr>
-          <w:rFonts w:ascii="Times New Roman" w:eastAsia="Times New Roman" w:hAnsi="Times New Roman" w:cs="Times New Roman"/>
-        </w:rPr>
-        <w:t>and social media for faces matching a user-uploaded photo [2]. It primarily markets itself for anti-</w:t>
-      </w:r>
-      <w:r>
-        <w:rPr>
-          <w:rFonts w:ascii="Times New Roman" w:eastAsia="Times New Roman" w:hAnsi="Times New Roman" w:cs="Times New Roman"/>
-        </w:rPr>
-        <w:t>scam</w:t>
-      </w:r>
-      <w:r>
-        <w:rPr>
-          <w:rFonts w:ascii="Times New Roman" w:eastAsia="Times New Roman" w:hAnsi="Times New Roman" w:cs="Times New Roman"/>
-        </w:rPr>
-        <w:t xml:space="preserve"> and </w:t>
+        <w:rPr>
+          <w:rFonts w:ascii="Times New Roman" w:eastAsia="Times New Roman" w:hAnsi="Times New Roman" w:cs="Times New Roman"/>
+        </w:rPr>
+      </w:pPr>
+      <w:r>
+        <w:rPr>
+          <w:rFonts w:ascii="Times New Roman" w:eastAsia="Times New Roman" w:hAnsi="Times New Roman" w:cs="Times New Roman"/>
+        </w:rPr>
+        <w:t xml:space="preserve">The consumer Augmented Reality (AR) hardware market has seen significant advancements, though devices frequently lack optimized facial recognition capabilities. Products </w:t>
       </w:r>
       <w:r>
         <w:rPr>
           <w:rFonts w:ascii="Times New Roman" w:eastAsia="Times New Roman" w:hAnsi="Times New Roman" w:cs="Times New Roman"/>
         </w:rPr>
         <w:lastRenderedPageBreak/>
-        <w:t>anti-</w:t>
-      </w:r>
-      <w:r>
-        <w:rPr>
-          <w:rFonts w:ascii="Times New Roman" w:eastAsia="Times New Roman" w:hAnsi="Times New Roman" w:cs="Times New Roman"/>
-        </w:rPr>
-        <w:t>catfishing</w:t>
-      </w:r>
-      <w:r>
-        <w:rPr>
-          <w:rFonts w:ascii="Times New Roman" w:eastAsia="Times New Roman" w:hAnsi="Times New Roman" w:cs="Times New Roman"/>
-        </w:rPr>
-        <w:t xml:space="preserve"> purposes, offering AI image detection and geolocation tools to help </w:t>
-      </w:r>
-      <w:r>
-        <w:rPr>
-          <w:rFonts w:ascii="Times New Roman" w:eastAsia="Times New Roman" w:hAnsi="Times New Roman" w:cs="Times New Roman"/>
-        </w:rPr>
-        <w:t>verify</w:t>
-      </w:r>
-      <w:r>
-        <w:rPr>
-          <w:rFonts w:ascii="Times New Roman" w:eastAsia="Times New Roman" w:hAnsi="Times New Roman" w:cs="Times New Roman"/>
-        </w:rPr>
-        <w:t xml:space="preserve"> identities</w:t>
-      </w:r>
-      <w:r>
-        <w:rPr>
-          <w:rFonts w:ascii="Times New Roman" w:eastAsia="Times New Roman" w:hAnsi="Times New Roman" w:cs="Times New Roman"/>
-        </w:rPr>
-        <w:t xml:space="preserve">. Strengths of this </w:t>
-      </w:r>
-      <w:r>
-        <w:rPr>
-          <w:rFonts w:ascii="Times New Roman" w:eastAsia="Times New Roman" w:hAnsi="Times New Roman" w:cs="Times New Roman"/>
-        </w:rPr>
-        <w:t>project</w:t>
-      </w:r>
-      <w:r>
-        <w:rPr>
-          <w:rFonts w:ascii="Times New Roman" w:eastAsia="Times New Roman" w:hAnsi="Times New Roman" w:cs="Times New Roman"/>
-        </w:rPr>
-        <w:t xml:space="preserve"> include a clear, </w:t>
-      </w:r>
-      <w:r>
-        <w:rPr>
-          <w:rFonts w:ascii="Times New Roman" w:eastAsia="Times New Roman" w:hAnsi="Times New Roman" w:cs="Times New Roman"/>
-        </w:rPr>
-        <w:t>specific use case a</w:t>
-      </w:r>
-      <w:r>
-        <w:rPr>
-          <w:rFonts w:ascii="Times New Roman" w:eastAsia="Times New Roman" w:hAnsi="Times New Roman" w:cs="Times New Roman"/>
-        </w:rPr>
-        <w:t xml:space="preserve">nd a user-friendly design that makes the tool approachable. </w:t>
-      </w:r>
-      <w:r>
-        <w:rPr>
-          <w:rFonts w:ascii="Times New Roman" w:eastAsia="Times New Roman" w:hAnsi="Times New Roman" w:cs="Times New Roman"/>
-        </w:rPr>
-        <w:t xml:space="preserve">Its design also </w:t>
-      </w:r>
-      <w:r>
-        <w:rPr>
-          <w:rFonts w:ascii="Times New Roman" w:eastAsia="Times New Roman" w:hAnsi="Times New Roman" w:cs="Times New Roman"/>
-        </w:rPr>
-        <w:t>avoids</w:t>
-      </w:r>
-      <w:r>
-        <w:rPr>
-          <w:rFonts w:ascii="Times New Roman" w:eastAsia="Times New Roman" w:hAnsi="Times New Roman" w:cs="Times New Roman"/>
-        </w:rPr>
-        <w:t xml:space="preserve"> direct API access, reducing potential </w:t>
-      </w:r>
-      <w:r>
-        <w:rPr>
-          <w:rFonts w:ascii="Times New Roman" w:eastAsia="Times New Roman" w:hAnsi="Times New Roman" w:cs="Times New Roman"/>
-        </w:rPr>
-        <w:t>misuse</w:t>
-      </w:r>
-      <w:r>
-        <w:rPr>
-          <w:rFonts w:ascii="Times New Roman" w:eastAsia="Times New Roman" w:hAnsi="Times New Roman" w:cs="Times New Roman"/>
-        </w:rPr>
-        <w:t xml:space="preserve"> compared to PimEyes. However</w:t>
-      </w:r>
-      <w:r>
-        <w:rPr>
-          <w:rFonts w:ascii="Times New Roman" w:eastAsia="Times New Roman" w:hAnsi="Times New Roman" w:cs="Times New Roman"/>
-        </w:rPr>
-        <w:t xml:space="preserve">, ProFaceFinder paywalls its search results, preventing users from verifying </w:t>
-      </w:r>
-      <w:r>
-        <w:rPr>
-          <w:rFonts w:ascii="Times New Roman" w:eastAsia="Times New Roman" w:hAnsi="Times New Roman" w:cs="Times New Roman"/>
-        </w:rPr>
-        <w:t>their</w:t>
-      </w:r>
-      <w:r>
-        <w:rPr>
-          <w:rFonts w:ascii="Times New Roman" w:eastAsia="Times New Roman" w:hAnsi="Times New Roman" w:cs="Times New Roman"/>
-        </w:rPr>
-        <w:t xml:space="preserve"> accuracy. Additionally, it claims about scarping social media raise legal and ethical concerns. Transparency issues around data sourcing and legality remain significant weaknesses in the project’s credibility. </w:t>
+        <w:t xml:space="preserve">like the Vive Eagle [6] and Vital Smart Glasses [7] prioritize multifunctionality by offering features like translation, Bluetooth connectivity, and </w:t>
+      </w:r>
+      <w:r>
+        <w:rPr>
+          <w:rFonts w:ascii="Times New Roman" w:eastAsia="Times New Roman" w:hAnsi="Times New Roman" w:cs="Times New Roman"/>
+        </w:rPr>
+        <w:t>hands-free</w:t>
+      </w:r>
+      <w:r>
+        <w:rPr>
+          <w:rFonts w:ascii="Times New Roman" w:eastAsia="Times New Roman" w:hAnsi="Times New Roman" w:cs="Times New Roman"/>
+        </w:rPr>
+        <w:t xml:space="preserve"> calling. The Vive Eagle suffers from an awkward, bulky design and impractical voice-input systems, </w:t>
+      </w:r>
+      <w:r>
+        <w:rPr>
+          <w:rFonts w:ascii="Times New Roman" w:eastAsia="Times New Roman" w:hAnsi="Times New Roman" w:cs="Times New Roman"/>
+        </w:rPr>
+        <w:t>while</w:t>
+      </w:r>
+      <w:r>
+        <w:rPr>
+          <w:rFonts w:ascii="Times New Roman" w:eastAsia="Times New Roman" w:hAnsi="Times New Roman" w:cs="Times New Roman"/>
+        </w:rPr>
+        <w:t xml:space="preserve"> the Vital glasses offer affordability but lack robust technical performance for high-stakes contexts. Premium options, like the Virtue Luma Smart Glasses, push toward immersive AR with high-resolution displays and advanced motion tracking, yet their high cost and complex interfaces limit mainstream adoption. Across the board, commercial smart glasses tend to treat facial recognition as an underdeveloped or secondary function, lacking the processing power or </w:t>
+      </w:r>
+      <w:r>
+        <w:rPr>
+          <w:rFonts w:ascii="Times New Roman" w:eastAsia="Times New Roman" w:hAnsi="Times New Roman" w:cs="Times New Roman"/>
+        </w:rPr>
+        <w:t>optimized</w:t>
+      </w:r>
+      <w:r>
+        <w:rPr>
+          <w:rFonts w:ascii="Times New Roman" w:eastAsia="Times New Roman" w:hAnsi="Times New Roman" w:cs="Times New Roman"/>
+        </w:rPr>
+        <w:t xml:space="preserve"> software required for rapid, accurate identification. </w:t>
       </w:r>
     </w:p>
     <w:p>
       <w:pPr>
-        <w:pStyle w:val="Para"/>
         <w:spacing w:line="360" w:lineRule="auto"/>
         <w:ind w:firstLine="708"/>
-        <w:jc w:val="both"/>
-        <w:rPr>
-          <w:rFonts w:ascii="Times New Roman" w:eastAsia="Times New Roman" w:hAnsi="Times New Roman" w:cs="Times New Roman"/>
-        </w:rPr>
-      </w:pPr>
-      <w:r>
-        <w:rPr>
-          <w:rFonts w:ascii="Times New Roman" w:eastAsia="Times New Roman" w:hAnsi="Times New Roman" w:cs="Times New Roman"/>
-        </w:rPr>
-        <w:t xml:space="preserve">Face SDK by Regula is a biometric verification toolkit designed to support facial </w:t>
-      </w:r>
-      <w:r>
-        <w:rPr>
-          <w:rFonts w:ascii="Times New Roman" w:eastAsia="Times New Roman" w:hAnsi="Times New Roman" w:cs="Times New Roman"/>
-        </w:rPr>
-        <w:t>recognition</w:t>
-      </w:r>
-      <w:r>
-        <w:rPr>
-          <w:rFonts w:ascii="Times New Roman" w:eastAsia="Times New Roman" w:hAnsi="Times New Roman" w:cs="Times New Roman"/>
-        </w:rPr>
-        <w:t>, liveness detection, and image quality analysis across multiple platforms</w:t>
-      </w:r>
-      <w:r>
-        <w:rPr>
-          <w:rFonts w:ascii="Times New Roman" w:eastAsia="Times New Roman" w:hAnsi="Times New Roman" w:cs="Times New Roman"/>
-        </w:rPr>
-        <w:t xml:space="preserve"> [3]</w:t>
-      </w:r>
-      <w:r>
-        <w:rPr>
-          <w:rFonts w:ascii="Times New Roman" w:eastAsia="Times New Roman" w:hAnsi="Times New Roman" w:cs="Times New Roman"/>
-        </w:rPr>
-        <w:t xml:space="preserve">. </w:t>
-      </w:r>
-      <w:r>
-        <w:rPr>
-          <w:rFonts w:ascii="Times New Roman" w:eastAsia="Times New Roman" w:hAnsi="Times New Roman" w:cs="Times New Roman"/>
-        </w:rPr>
-        <w:t>It is designed for high-</w:t>
-      </w:r>
-      <w:r>
-        <w:rPr>
-          <w:rFonts w:ascii="Times New Roman" w:eastAsia="Times New Roman" w:hAnsi="Times New Roman" w:cs="Times New Roman"/>
-        </w:rPr>
-        <w:t>security</w:t>
-      </w:r>
-      <w:r>
-        <w:rPr>
-          <w:rFonts w:ascii="Times New Roman" w:eastAsia="Times New Roman" w:hAnsi="Times New Roman" w:cs="Times New Roman"/>
-        </w:rPr>
-        <w:t xml:space="preserve"> applications such as border control</w:t>
-      </w:r>
-      <w:r>
-        <w:rPr>
-          <w:rFonts w:ascii="Times New Roman" w:eastAsia="Times New Roman" w:hAnsi="Times New Roman" w:cs="Times New Roman"/>
-        </w:rPr>
-        <w:t xml:space="preserve">, banking, </w:t>
-      </w:r>
-      <w:r>
-        <w:rPr>
-          <w:rFonts w:ascii="Times New Roman" w:eastAsia="Times New Roman" w:hAnsi="Times New Roman" w:cs="Times New Roman"/>
-        </w:rPr>
-        <w:t>and</w:t>
-      </w:r>
-      <w:r>
-        <w:rPr>
-          <w:rFonts w:ascii="Times New Roman" w:eastAsia="Times New Roman" w:hAnsi="Times New Roman" w:cs="Times New Roman"/>
-        </w:rPr>
-        <w:t xml:space="preserve"> identify verification, featuring active and passive liveness detection. </w:t>
-      </w:r>
-      <w:r>
-        <w:rPr>
-          <w:rFonts w:ascii="Times New Roman" w:eastAsia="Times New Roman" w:hAnsi="Times New Roman" w:cs="Times New Roman"/>
-        </w:rPr>
-        <w:t xml:space="preserve">Its biggest strengths include flexibility and adaptability, with applications across </w:t>
-      </w:r>
-      <w:r>
-        <w:rPr>
-          <w:rFonts w:ascii="Times New Roman" w:eastAsia="Times New Roman" w:hAnsi="Times New Roman" w:cs="Times New Roman"/>
-        </w:rPr>
-        <w:t>industries</w:t>
-      </w:r>
-      <w:r>
-        <w:rPr>
-          <w:rFonts w:ascii="Times New Roman" w:eastAsia="Times New Roman" w:hAnsi="Times New Roman" w:cs="Times New Roman"/>
-        </w:rPr>
-        <w:t xml:space="preserve"> such as border control, </w:t>
-      </w:r>
-      <w:r>
-        <w:rPr>
-          <w:rFonts w:ascii="Times New Roman" w:eastAsia="Times New Roman" w:hAnsi="Times New Roman" w:cs="Times New Roman"/>
-        </w:rPr>
-        <w:t>finance</w:t>
-      </w:r>
-      <w:r>
-        <w:rPr>
-          <w:rFonts w:ascii="Times New Roman" w:eastAsia="Times New Roman" w:hAnsi="Times New Roman" w:cs="Times New Roman"/>
-        </w:rPr>
-        <w:t>, and law</w:t>
-      </w:r>
-      <w:r>
-        <w:rPr>
-          <w:rFonts w:ascii="Times New Roman" w:eastAsia="Times New Roman" w:hAnsi="Times New Roman" w:cs="Times New Roman"/>
-        </w:rPr>
-        <w:t xml:space="preserve"> enforcement</w:t>
-      </w:r>
-      <w:r>
-        <w:rPr>
-          <w:rFonts w:ascii="Times New Roman" w:eastAsia="Times New Roman" w:hAnsi="Times New Roman" w:cs="Times New Roman"/>
-        </w:rPr>
-        <w:t xml:space="preserve">. The software complies with presentation attack detection (PAD) standards and can be customized to fit various institutional needs, making it appealing for organizations requiring reliable biometric verification. Another advantage is its support for multi-platform use, which broadens its utility across both hardware and software systems. However, its reliance on high-quality images presents limitations, </w:t>
-      </w:r>
-      <w:r>
-        <w:rPr>
-          <w:rFonts w:ascii="Times New Roman" w:eastAsia="Times New Roman" w:hAnsi="Times New Roman" w:cs="Times New Roman"/>
-        </w:rPr>
-        <w:t>such as</w:t>
-      </w:r>
-      <w:r>
-        <w:rPr>
-          <w:rFonts w:ascii="Times New Roman" w:eastAsia="Times New Roman" w:hAnsi="Times New Roman" w:cs="Times New Roman"/>
-        </w:rPr>
-        <w:t xml:space="preserve"> occlusions, poor lighting, or low-resolution inputs can reduce accuracy. Privacy and data protection remain significant concerns, as facial data is highly sensitive and prone to misuse if not managed responsibly. Additionally, its cost and integration complexity may pose barriers for smaller businesses or organizations. Despite these weaknesses, Face SDK represents one of the more robust and adaptable biometric solutions available.</w:t>
+        <w:rPr>
+          <w:rFonts w:ascii="Times New Roman" w:eastAsia="Times New Roman" w:hAnsi="Times New Roman" w:cs="Times New Roman"/>
+        </w:rPr>
+      </w:pPr>
+      <w:r>
+        <w:rPr>
+          <w:rFonts w:ascii="Times New Roman" w:eastAsia="Times New Roman" w:hAnsi="Times New Roman" w:cs="Times New Roman"/>
+        </w:rPr>
+        <w:t xml:space="preserve">Recent developments from industry leaders validate both the architectural challenges and the profound sociological dilemmas of combining AR with facial recognition. Meta’s Ray-Ban smart glasses have popularized lightweight, camera-equipped wearables, and recent leaks suggest the company is exploiting a feature called “Name Tag” to add real-time facial recognition capabilities. However, this prospect has sparked intense ethical backlash from civil liberties groups, who warn that deploying such technology in public spaces poses severe risks to data privacy, anonymity, and consent. Beyond the software ethics, Meta’s recently unveiled “Project Orion”, an advanced internal prototype for true holographic AR glasses, highlights the physical hardware limitations of self-contained devices. To overcome the exact heat dissipation and processing constraints faced by smaller smart glasses, Orion relies on a wireless, external “compute puck” to handle heavy processing. This industry shift toward distributed computing strongly supports the necessity of </w:t>
+      </w:r>
+      <w:r>
+        <w:rPr>
+          <w:rFonts w:ascii="Times New Roman" w:eastAsia="Times New Roman" w:hAnsi="Times New Roman" w:cs="Times New Roman"/>
+        </w:rPr>
+        <w:t xml:space="preserve">a </w:t>
+      </w:r>
+      <w:r>
+        <w:rPr>
+          <w:rFonts w:ascii="Times New Roman" w:eastAsia="Times New Roman" w:hAnsi="Times New Roman" w:cs="Times New Roman"/>
+        </w:rPr>
+        <w:t xml:space="preserve">hybrid </w:t>
+      </w:r>
+      <w:r>
+        <w:rPr>
+          <w:rFonts w:ascii="Times New Roman" w:eastAsia="Times New Roman" w:hAnsi="Times New Roman" w:cs="Times New Roman"/>
+        </w:rPr>
+        <w:t>architecture</w:t>
+      </w:r>
+      <w:r>
+        <w:rPr>
+          <w:rFonts w:ascii="Times New Roman" w:eastAsia="Times New Roman" w:hAnsi="Times New Roman" w:cs="Times New Roman"/>
+        </w:rPr>
+        <w:t xml:space="preserve"> for intensive, real-world tasks.</w:t>
       </w:r>
     </w:p>
     <w:p>
       <w:pPr>
-        <w:pStyle w:val="Para"/>
         <w:spacing w:line="360" w:lineRule="auto"/>
         <w:ind w:firstLine="708"/>
-        <w:jc w:val="both"/>
-        <w:rPr>
-          <w:rFonts w:ascii="Times New Roman" w:eastAsia="Times New Roman" w:hAnsi="Times New Roman" w:cs="Times New Roman"/>
-        </w:rPr>
-      </w:pPr>
-      <w:r>
-        <w:rPr>
-          <w:rFonts w:ascii="Times New Roman" w:eastAsia="Times New Roman" w:hAnsi="Times New Roman" w:cs="Times New Roman"/>
-        </w:rPr>
-        <w:t>Apple Face ID is Apple’s proprietary biometric authentication system integrated into iPhones and iPads</w:t>
-      </w:r>
-      <w:r>
-        <w:rPr>
-          <w:rFonts w:ascii="Times New Roman" w:eastAsia="Times New Roman" w:hAnsi="Times New Roman" w:cs="Times New Roman"/>
-        </w:rPr>
-        <w:t xml:space="preserve"> [4]</w:t>
-      </w:r>
-      <w:r>
-        <w:rPr>
-          <w:rFonts w:ascii="Times New Roman" w:eastAsia="Times New Roman" w:hAnsi="Times New Roman" w:cs="Times New Roman"/>
-        </w:rPr>
-        <w:t xml:space="preserve">. It uses infrared mapping to generate a detailed scan of a user’s face and stores the encrypted data locally in the device’s Secure Enclave. The system adapts over time, recognizing gradual changes in a user’s appearance, and is designed to unlock devices, authorize payments, and log into applications. Strengths of Face ID include its strong anti-spoofing measures, ease of use, and its security model, which avoids reliance on cloud-based facial data </w:t>
-      </w:r>
-      <w:r>
-        <w:rPr>
-          <w:rFonts w:ascii="Times New Roman" w:eastAsia="Times New Roman" w:hAnsi="Times New Roman" w:cs="Times New Roman"/>
-        </w:rPr>
-        <w:t>storage. Apple has also built in accessibility features, such as adapting to users wearing glasses or facial coverings. However, Face ID remains limited to Apple’s ecosystem, restricting its reach to those who own Apple products. Broader ethical concerns also exist around biometric dependence, even though Apple’s approach to on-device storage mitigates some of these risks. Overall, Face ID exemplifies a consumer-facing facial recognition tool that balances security and convenience while avoiding some pitfalls of broader recognition systems.</w:t>
+        <w:rPr>
+          <w:rFonts w:ascii="Times New Roman" w:eastAsia="Times New Roman" w:hAnsi="Times New Roman" w:cs="Times New Roman"/>
+        </w:rPr>
+      </w:pPr>
+      <w:r>
+        <w:rPr>
+          <w:rFonts w:ascii="Times New Roman" w:eastAsia="Times New Roman" w:hAnsi="Times New Roman" w:cs="Times New Roman"/>
+        </w:rPr>
+        <w:t xml:space="preserve">Several academic and experimental projects have attempted to bridge the gap between AR hardware and facial recognition. The student-led I-XRAY project [8] at Harvard University integrated Meta’s Ray-Ban glasses with existing databases and reverse image search engines to identify individuals in real time. While demonstrating the vast capabilities of combined technologies, the project had high latency caused by multiple API calls and a disjointed user experience where data was displayed on a separate mobile app rather than a heads-up </w:t>
+      </w:r>
+      <w:r>
+        <w:rPr>
+          <w:rFonts w:ascii="Times New Roman" w:eastAsia="Times New Roman" w:hAnsi="Times New Roman" w:cs="Times New Roman"/>
+        </w:rPr>
+        <w:t>display. Similarly, accessibility focused projects by students at SECAB [1] and Parul University [9] have developed AI-powered glasses to assist the</w:t>
+      </w:r>
+      <w:r>
+        <w:rPr>
+          <w:rFonts w:ascii="Times New Roman" w:eastAsia="Times New Roman" w:hAnsi="Times New Roman" w:cs="Times New Roman"/>
+        </w:rPr>
+        <w:t xml:space="preserve"> </w:t>
+      </w:r>
+      <w:r>
+        <w:rPr>
+          <w:rFonts w:ascii="Times New Roman" w:eastAsia="Times New Roman" w:hAnsi="Times New Roman" w:cs="Times New Roman"/>
+        </w:rPr>
+        <w:t xml:space="preserve">visually impaired by utilizing onboard cameras to build local, </w:t>
+      </w:r>
+      <w:r>
+        <w:rPr>
+          <w:rFonts w:ascii="Times New Roman" w:eastAsia="Times New Roman" w:hAnsi="Times New Roman" w:cs="Times New Roman"/>
+        </w:rPr>
+        <w:t>personalized</w:t>
+      </w:r>
+      <w:r>
+        <w:rPr>
+          <w:rFonts w:ascii="Times New Roman" w:eastAsia="Times New Roman" w:hAnsi="Times New Roman" w:cs="Times New Roman"/>
+        </w:rPr>
+        <w:t xml:space="preserve"> face databases. However, these systems are constrained by hardware </w:t>
+      </w:r>
+      <w:r>
+        <w:rPr>
+          <w:rFonts w:ascii="Times New Roman" w:eastAsia="Times New Roman" w:hAnsi="Times New Roman" w:cs="Times New Roman"/>
+        </w:rPr>
+        <w:t>limitations</w:t>
+      </w:r>
+      <w:r>
+        <w:rPr>
+          <w:rFonts w:ascii="Times New Roman" w:eastAsia="Times New Roman" w:hAnsi="Times New Roman" w:cs="Times New Roman"/>
+        </w:rPr>
+        <w:t>; reliance on localized Raspberry Pi processing often results in slower speeds, and small user-built databases frequently fail to accurately recognize faces due to a lack of image variation and poor input quality.</w:t>
       </w:r>
     </w:p>
     <w:p>
       <w:pPr>
-        <w:pStyle w:val="Para"/>
         <w:spacing w:line="360" w:lineRule="auto"/>
         <w:ind w:firstLine="708"/>
-        <w:jc w:val="both"/>
-        <w:rPr>
-          <w:rFonts w:ascii="Times New Roman" w:eastAsia="Times New Roman" w:hAnsi="Times New Roman" w:cs="Times New Roman"/>
-        </w:rPr>
-      </w:pPr>
-      <w:commentRangeStart w:id="2"/>
-      <w:r>
-        <w:rPr>
-          <w:rFonts w:ascii="Times New Roman" w:eastAsia="Times New Roman" w:hAnsi="Times New Roman" w:cs="Times New Roman"/>
-        </w:rPr>
-        <w:t>Vive Eagle Smart Glasses are a pair of AR-powered glasses that provide real-time translation, AI-assisted search, and a built-in camera and speaker system</w:t>
-      </w:r>
-      <w:r>
-        <w:rPr>
-          <w:rFonts w:ascii="Times New Roman" w:eastAsia="Times New Roman" w:hAnsi="Times New Roman" w:cs="Times New Roman"/>
-        </w:rPr>
-        <w:t xml:space="preserve"> [5]</w:t>
-      </w:r>
-      <w:r>
-        <w:rPr>
-          <w:rFonts w:ascii="Times New Roman" w:eastAsia="Times New Roman" w:hAnsi="Times New Roman" w:cs="Times New Roman"/>
-        </w:rPr>
-        <w:t>. They showcase potential facial recognition applications, though this feature has not been fully developed. Their biggest strengths are multifunctionality, a modern chipset, and compatibility with both Android and iOS devices, which make them attractive to a wider user base. In practice, however, weaknesses emerge, including limited geographic availability and an awkward, bulky design that reduces comfort for long-term use. Additionally, the voice-based input system requires speaking commands aloud, which can feel impractical in public or professional environments. These limitations raise questions about how smoothly glasses integrate into everyday life. While they represent a strong step toward consumer AR devices, they are not yet optimized for seamless or discreet use.</w:t>
-      </w:r>
-      <w:commentRangeEnd w:id="2"/>
-      <w:r>
-        <w:rPr>
-          <w:rStyle w:val="CommentReference"/>
-          <w:rFonts w:ascii="Times New Roman" w:eastAsia="Times New Roman" w:hAnsi="Times New Roman" w:cs="Times New Roman"/>
-          <w:sz w:val="18"/>
-          <w:szCs w:val="22"/>
-        </w:rPr>
-        <w:commentReference w:id="2"/>
-      </w:r>
-    </w:p>
-    <w:p>
-      <w:pPr>
-        <w:pStyle w:val="Para"/>
-        <w:spacing w:line="360" w:lineRule="auto"/>
-        <w:ind w:firstLine="708"/>
-        <w:jc w:val="both"/>
-        <w:rPr>
-          <w:rFonts w:ascii="Times New Roman" w:eastAsia="Times New Roman" w:hAnsi="Times New Roman" w:cs="Times New Roman"/>
-        </w:rPr>
-      </w:pPr>
-      <w:commentRangeStart w:id="3"/>
-      <w:r>
-        <w:rPr>
-          <w:rFonts w:ascii="Times New Roman" w:eastAsia="Times New Roman" w:hAnsi="Times New Roman" w:cs="Times New Roman"/>
-        </w:rPr>
-        <w:t>Vital Smart Glasses are marketed as a lightweight and affordable option for everyday use, offering features such as translation across 130 languages, Bluetooth pairing, hands-free calling, music streaming, and voice note recording</w:t>
-      </w:r>
-      <w:r>
-        <w:rPr>
-          <w:rFonts w:ascii="Times New Roman" w:eastAsia="Times New Roman" w:hAnsi="Times New Roman" w:cs="Times New Roman"/>
-        </w:rPr>
-        <w:t xml:space="preserve"> [6]</w:t>
-      </w:r>
-      <w:r>
-        <w:rPr>
-          <w:rFonts w:ascii="Times New Roman" w:eastAsia="Times New Roman" w:hAnsi="Times New Roman" w:cs="Times New Roman"/>
-        </w:rPr>
-        <w:t>.</w:t>
-      </w:r>
-      <w:r>
-        <w:rPr>
-          <w:rFonts w:ascii="Times New Roman" w:eastAsia="Times New Roman" w:hAnsi="Times New Roman" w:cs="Times New Roman"/>
-        </w:rPr>
-        <w:t xml:space="preserve"> They emphasize accessibility and convenience, aiming </w:t>
-      </w:r>
-      <w:r>
-        <w:rPr>
-          <w:rFonts w:ascii="Times New Roman" w:eastAsia="Times New Roman" w:hAnsi="Times New Roman" w:cs="Times New Roman"/>
-        </w:rPr>
-        <w:t>to</w:t>
-      </w:r>
-      <w:r>
-        <w:rPr>
-          <w:rFonts w:ascii="Times New Roman" w:eastAsia="Times New Roman" w:hAnsi="Times New Roman" w:cs="Times New Roman"/>
-        </w:rPr>
-        <w:t xml:space="preserve"> keep users connected without constant phone use. </w:t>
-      </w:r>
-      <w:r>
-        <w:rPr>
-          <w:rFonts w:ascii="Times New Roman" w:eastAsia="Times New Roman" w:hAnsi="Times New Roman" w:cs="Times New Roman"/>
-        </w:rPr>
-        <w:t xml:space="preserve">The main advantage of this product lies in its comfort-first design and affordability, making it more accessible compared to high-end smart glasses. Its range of practical features also positions it as a tool for casual convenience, appealing to users who want wearable connectivity without excessive cost. However, the weaknesses of the product include vague technical details in its marketing materials, raising doubts about how well its features perform in practice. Additionally, translation accuracy and performance may not meet the needs of professional or high-stakes contexts, limiting its scope to novelty </w:t>
-      </w:r>
-      <w:r>
-        <w:rPr>
-          <w:rFonts w:ascii="Times New Roman" w:eastAsia="Times New Roman" w:hAnsi="Times New Roman" w:cs="Times New Roman"/>
-        </w:rPr>
-        <w:lastRenderedPageBreak/>
-        <w:t>or light use. These weaknesses suggest that while Vital Smart Glasses provide a budget-friendly entry point to AR-style wearables, they lack the robustness and reliability needed for more advanced applications.</w:t>
-      </w:r>
-      <w:commentRangeEnd w:id="3"/>
-      <w:r>
-        <w:rPr>
-          <w:rStyle w:val="CommentReference"/>
-          <w:rFonts w:ascii="Times New Roman" w:eastAsia="Times New Roman" w:hAnsi="Times New Roman" w:cs="Times New Roman"/>
-          <w:sz w:val="18"/>
-          <w:szCs w:val="22"/>
-        </w:rPr>
-        <w:commentReference w:id="3"/>
-      </w:r>
-    </w:p>
-    <w:p>
-      <w:pPr>
-        <w:pStyle w:val="Para"/>
-        <w:spacing w:line="360" w:lineRule="auto"/>
-        <w:ind w:firstLine="708"/>
-        <w:jc w:val="both"/>
-        <w:rPr>
-          <w:rFonts w:ascii="Times New Roman" w:eastAsia="Times New Roman" w:hAnsi="Times New Roman" w:cs="Times New Roman"/>
-        </w:rPr>
-      </w:pPr>
-      <w:commentRangeStart w:id="4"/>
-      <w:r>
-        <w:rPr>
-          <w:rFonts w:ascii="Times New Roman" w:eastAsia="Times New Roman" w:hAnsi="Times New Roman" w:cs="Times New Roman"/>
-        </w:rPr>
-        <w:t>Viture Luma Smart Glasses are marketed as premium AR/VR glasses that prioritize high-resolution displays, integrated cameras and microphones, and advanced motion tracking capabilities</w:t>
-      </w:r>
-      <w:r>
-        <w:rPr>
-          <w:rFonts w:ascii="Times New Roman" w:eastAsia="Times New Roman" w:hAnsi="Times New Roman" w:cs="Times New Roman"/>
-        </w:rPr>
-        <w:t xml:space="preserve"> [7]</w:t>
-      </w:r>
-      <w:r>
-        <w:rPr>
-          <w:rFonts w:ascii="Times New Roman" w:eastAsia="Times New Roman" w:hAnsi="Times New Roman" w:cs="Times New Roman"/>
-        </w:rPr>
-        <w:t xml:space="preserve">. The biggest strengths of the Luma glasses include their visual quality and positional tracking, which </w:t>
-      </w:r>
-      <w:r>
-        <w:rPr>
-          <w:rFonts w:ascii="Times New Roman" w:eastAsia="Times New Roman" w:hAnsi="Times New Roman" w:cs="Times New Roman"/>
-        </w:rPr>
-        <w:t>enhance</w:t>
-      </w:r>
-      <w:r>
-        <w:rPr>
-          <w:rFonts w:ascii="Times New Roman" w:eastAsia="Times New Roman" w:hAnsi="Times New Roman" w:cs="Times New Roman"/>
-        </w:rPr>
-        <w:t xml:space="preserve"> entertainment and AR applications. They also support hand-tracking features, offering more interactive possibilities than lower-end competitors. However, several weaknesses limit their appeal, including uncertainty about real-world performance and usability in everyday scenarios. Their higher cost also makes them less accessible to casual consumers. Additionally, while advanced features sound appealing, they may introduce complexity or trade-offs that affect ease of use. As a result, these glasses suggest an ambitious push toward immersive AR and VR integration but remain niche in terms of mainstream adoption.</w:t>
-      </w:r>
-      <w:commentRangeEnd w:id="4"/>
-      <w:r>
-        <w:rPr>
-          <w:rStyle w:val="CommentReference"/>
-          <w:rFonts w:ascii="Times New Roman" w:eastAsia="Times New Roman" w:hAnsi="Times New Roman" w:cs="Times New Roman"/>
-          <w:sz w:val="18"/>
-          <w:szCs w:val="22"/>
-        </w:rPr>
-        <w:commentReference w:id="4"/>
-      </w:r>
-    </w:p>
-    <w:p>
-      <w:pPr>
-        <w:pStyle w:val="Para"/>
-        <w:spacing w:line="360" w:lineRule="auto"/>
-        <w:ind w:firstLine="708"/>
-        <w:jc w:val="both"/>
-        <w:rPr>
-          <w:rFonts w:ascii="Times New Roman" w:eastAsia="Times New Roman" w:hAnsi="Times New Roman" w:cs="Times New Roman"/>
-        </w:rPr>
-      </w:pPr>
-      <w:r>
-        <w:rPr>
-          <w:rFonts w:ascii="Times New Roman" w:eastAsia="Times New Roman" w:hAnsi="Times New Roman" w:cs="Times New Roman"/>
-        </w:rPr>
-        <w:t>I-XRAY was a student-led project at Harvard University that used Meta’s Ray-Ban smart glasses combined with PimEyes, scrapers, public databases, and ChatGPT to identify people and provide summarized information about them</w:t>
-      </w:r>
-      <w:r>
-        <w:rPr>
-          <w:rFonts w:ascii="Times New Roman" w:eastAsia="Times New Roman" w:hAnsi="Times New Roman" w:cs="Times New Roman"/>
-        </w:rPr>
-        <w:t xml:space="preserve"> [8]</w:t>
-      </w:r>
-      <w:r>
-        <w:rPr>
-          <w:rFonts w:ascii="Times New Roman" w:eastAsia="Times New Roman" w:hAnsi="Times New Roman" w:cs="Times New Roman"/>
-        </w:rPr>
-        <w:t>. The project was framed as a privacy awareness campaign rather than a commercial product, aiming to spark discussion about surveillance and data ethics. Its strengths include the scope of databases it could draw from, giving it potentially broad recognition capabilities. However, weaknesses were significant, including slow performance caused by multiple API calls, reliance on consistent database upkeep, and limitations in how data was displayed, since it only appeared through a mobile app rather than directly in the glasses. Additionally, no public updates have been reported since early 2024, suggesting limited continuity. Despite these flaws, I-XRAY remains one of the closest real-world parallels to integrating facial recognition and AR glasses, raising valuable questions about the future of such technologies.</w:t>
-      </w:r>
-    </w:p>
-    <w:p>
-      <w:pPr>
-        <w:pStyle w:val="Para"/>
-        <w:spacing w:line="360" w:lineRule="auto"/>
-        <w:ind w:firstLine="708"/>
-        <w:jc w:val="both"/>
-        <w:rPr>
-          <w:rFonts w:ascii="Times New Roman" w:eastAsia="Times New Roman" w:hAnsi="Times New Roman" w:cs="Times New Roman"/>
-        </w:rPr>
-      </w:pPr>
-      <w:bookmarkStart w:id="5" w:name="_Hlk215878134"/>
-      <w:r>
-        <w:rPr>
-          <w:rFonts w:ascii="Times New Roman" w:eastAsia="Times New Roman" w:hAnsi="Times New Roman" w:cs="Times New Roman"/>
-        </w:rPr>
-        <w:t xml:space="preserve">AI-Based Facial Recognition Smart Glasses for the Visually Impaired </w:t>
-      </w:r>
-      <w:bookmarkEnd w:id="5"/>
-      <w:r>
-        <w:rPr>
-          <w:rFonts w:ascii="Times New Roman" w:eastAsia="Times New Roman" w:hAnsi="Times New Roman" w:cs="Times New Roman"/>
-        </w:rPr>
-        <w:t xml:space="preserve">were created by students at SECAB </w:t>
-      </w:r>
-      <w:r>
-        <w:rPr>
-          <w:rFonts w:ascii="Times New Roman" w:eastAsia="Times New Roman" w:hAnsi="Times New Roman" w:cs="Times New Roman"/>
-        </w:rPr>
-        <w:t>to assist</w:t>
-      </w:r>
-      <w:r>
-        <w:rPr>
-          <w:rFonts w:ascii="Times New Roman" w:eastAsia="Times New Roman" w:hAnsi="Times New Roman" w:cs="Times New Roman"/>
-        </w:rPr>
-        <w:t xml:space="preserve"> people with vision </w:t>
-      </w:r>
-      <w:r>
-        <w:rPr>
-          <w:rFonts w:ascii="Times New Roman" w:eastAsia="Times New Roman" w:hAnsi="Times New Roman" w:cs="Times New Roman"/>
-        </w:rPr>
-        <w:t>impairment</w:t>
-      </w:r>
-      <w:r>
-        <w:rPr>
-          <w:rFonts w:ascii="Times New Roman" w:eastAsia="Times New Roman" w:hAnsi="Times New Roman" w:cs="Times New Roman"/>
-        </w:rPr>
-        <w:t xml:space="preserve"> [9]</w:t>
-      </w:r>
-      <w:r>
-        <w:rPr>
-          <w:rFonts w:ascii="Times New Roman" w:eastAsia="Times New Roman" w:hAnsi="Times New Roman" w:cs="Times New Roman"/>
-        </w:rPr>
-        <w:t xml:space="preserve">. The glasses use a camera to detect objects and people, calculate distances, and allow the user </w:t>
-      </w:r>
-      <w:r>
-        <w:rPr>
-          <w:rFonts w:ascii="Times New Roman" w:eastAsia="Times New Roman" w:hAnsi="Times New Roman" w:cs="Times New Roman"/>
-        </w:rPr>
-        <w:t>to build a personal database of known faces. This adaptability is one of the system’s major strengths, as users can register new individuals on the fly, improving recognition over time. The device is also relatively low cost, making it more feasible for accessibility-focused applications. However, the system also faces limitations, particularly when the database lacks sufficient variation in stored images, leading to inaccurate recognition. Poor-quality input images also reduce reliability. While promising, the project demonstrates both the potential and the challenges of tailoring facial recognition technology for accessibility, highlighting the difficulty of relying on small, user-built databases.</w:t>
-      </w:r>
-    </w:p>
-    <w:p>
-      <w:pPr>
-        <w:pStyle w:val="Para"/>
-        <w:spacing w:line="360" w:lineRule="auto"/>
-        <w:ind w:firstLine="708"/>
-        <w:jc w:val="both"/>
-        <w:rPr>
-          <w:rFonts w:ascii="Times New Roman" w:eastAsia="Times New Roman" w:hAnsi="Times New Roman" w:cs="Times New Roman"/>
-        </w:rPr>
-      </w:pPr>
-      <w:r>
-        <w:rPr>
-          <w:rFonts w:ascii="Times New Roman" w:eastAsia="Times New Roman" w:hAnsi="Times New Roman" w:cs="Times New Roman"/>
-        </w:rPr>
-        <w:t>AI-Powered Glasses for the Visually Impaired, developed by students at Parul University, expand on the SECAB design with added functionality such as image-to-text conversion using Google’s Tesseract OCR. This feature allows the glasses not only to detect objects and faces but also to read text aloud, making them more useful in real-world applications</w:t>
-      </w:r>
-      <w:r>
-        <w:rPr>
-          <w:rFonts w:ascii="Times New Roman" w:eastAsia="Times New Roman" w:hAnsi="Times New Roman" w:cs="Times New Roman"/>
-        </w:rPr>
-        <w:t xml:space="preserve"> [</w:t>
-      </w:r>
-      <w:r>
-        <w:rPr>
-          <w:rFonts w:ascii="Times New Roman" w:eastAsia="Times New Roman" w:hAnsi="Times New Roman" w:cs="Times New Roman"/>
-        </w:rPr>
-        <w:t>10</w:t>
-      </w:r>
-      <w:r>
-        <w:rPr>
-          <w:rFonts w:ascii="Times New Roman" w:eastAsia="Times New Roman" w:hAnsi="Times New Roman" w:cs="Times New Roman"/>
-        </w:rPr>
-        <w:t>]</w:t>
-      </w:r>
-      <w:r>
-        <w:rPr>
-          <w:rFonts w:ascii="Times New Roman" w:eastAsia="Times New Roman" w:hAnsi="Times New Roman" w:cs="Times New Roman"/>
-        </w:rPr>
-        <w:t>. Strengths of this system include improved recognition accuracy and expanded features, which increase its value for visually impaired users. However, weaknesses are clear, including higher production costs and slower processing speed due to reliance on a Raspberry Pi. Additionally, the number of detectable objects remains limited, restricting versatility in certain contexts. These weaknesses show that while the project has advanced beyond earlier models, it still faces technical and economic barriers to widespread adoption. Nevertheless, it illustrates how AI glasses can evolve to better serve specialized populations, blending recognition with assistive functions.</w:t>
-      </w:r>
-    </w:p>
-    <w:p>
-      <w:pPr>
-        <w:pStyle w:val="Para"/>
-        <w:spacing w:line="360" w:lineRule="auto"/>
-        <w:ind w:firstLine="708"/>
-        <w:jc w:val="both"/>
-        <w:rPr>
-          <w:rFonts w:ascii="Times New Roman" w:eastAsia="Times New Roman" w:hAnsi="Times New Roman" w:cs="Times New Roman"/>
-        </w:rPr>
-      </w:pPr>
-      <w:commentRangeStart w:id="6"/>
-      <w:r>
-        <w:rPr>
-          <w:rFonts w:ascii="Times New Roman" w:eastAsia="Times New Roman" w:hAnsi="Times New Roman" w:cs="Times New Roman"/>
-        </w:rPr>
-        <w:t>Android VR Development provides the base operating system for many AR and VR platforms, including devices like Pico and Meta headsets</w:t>
-      </w:r>
-      <w:r>
-        <w:rPr>
-          <w:rFonts w:ascii="Times New Roman" w:eastAsia="Times New Roman" w:hAnsi="Times New Roman" w:cs="Times New Roman"/>
-        </w:rPr>
-        <w:t xml:space="preserve"> [11]</w:t>
-      </w:r>
-      <w:r>
-        <w:rPr>
-          <w:rFonts w:ascii="Times New Roman" w:eastAsia="Times New Roman" w:hAnsi="Times New Roman" w:cs="Times New Roman"/>
-        </w:rPr>
-        <w:t xml:space="preserve">. Its major strength is adaptability, as Android is widely known and accessible, making it easier for developers to create prototypes and cross-device applications. The system also benefits from its open ecosystem, which encourages experimentation and lowers the barrier to entry. However, fragmentation across devices presents a challenge, as different hardware variations can complicate development and reduce consistency. Compared to proprietary systems, Android may also lack some optimizations or deep integrations. Despite these </w:t>
-      </w:r>
-      <w:r>
-        <w:rPr>
-          <w:rFonts w:ascii="Times New Roman" w:eastAsia="Times New Roman" w:hAnsi="Times New Roman" w:cs="Times New Roman"/>
-        </w:rPr>
-        <w:lastRenderedPageBreak/>
-        <w:t>challenges, Android serves as a versatile backbone for XR development, especially in early-stage innovation.</w:t>
-      </w:r>
-      <w:commentRangeEnd w:id="6"/>
-      <w:r>
-        <w:rPr>
-          <w:rStyle w:val="CommentReference"/>
-          <w:rFonts w:ascii="Times New Roman" w:eastAsia="Times New Roman" w:hAnsi="Times New Roman" w:cs="Times New Roman"/>
-          <w:sz w:val="18"/>
-          <w:szCs w:val="22"/>
-        </w:rPr>
-        <w:commentReference w:id="6"/>
-      </w:r>
-    </w:p>
-    <w:p>
-      <w:pPr>
-        <w:spacing w:line="360" w:lineRule="auto"/>
-        <w:ind w:firstLine="708"/>
-        <w:rPr>
-          <w:rFonts w:ascii="Times New Roman" w:eastAsia="Times New Roman" w:hAnsi="Times New Roman" w:cs="Times New Roman"/>
-        </w:rPr>
-      </w:pPr>
-      <w:commentRangeStart w:id="7"/>
-      <w:r>
-        <w:rPr>
-          <w:rFonts w:ascii="Times New Roman" w:eastAsia="Times New Roman" w:hAnsi="Times New Roman" w:cs="Times New Roman"/>
-        </w:rPr>
-        <w:t>Unity VR Development offers developers a set of drag-and-drop XR tools and UI systems through its XR Toolkit, which simplifies the process of building immersive applications. Its strengths include comprehensive documentation, pre-built templates, and a user-friendly interface that accelerates prototyping</w:t>
-      </w:r>
-      <w:r>
-        <w:rPr>
-          <w:rFonts w:ascii="Times New Roman" w:eastAsia="Times New Roman" w:hAnsi="Times New Roman" w:cs="Times New Roman"/>
-        </w:rPr>
-        <w:t xml:space="preserve"> [12]</w:t>
-      </w:r>
-      <w:r>
-        <w:rPr>
-          <w:rFonts w:ascii="Times New Roman" w:eastAsia="Times New Roman" w:hAnsi="Times New Roman" w:cs="Times New Roman"/>
-        </w:rPr>
-        <w:t>. Unity also supports a large developer community, providing resources and support for newcomers. However, its weaknesses include performance limitations compared to custom-built engines, particularly for highly demanding applications. Another concern is the reliance on Unity’s ecosystem, which may limit flexibility in the long run. Still, Unity remains one of the most accessible and powerful platforms for both beginners and professionals entering the VR/AR development space.</w:t>
-      </w:r>
-      <w:commentRangeEnd w:id="7"/>
-      <w:r>
-        <w:rPr>
-          <w:rStyle w:val="CommentReference"/>
-          <w:rFonts w:ascii="Times New Roman" w:eastAsia="Times New Roman" w:hAnsi="Times New Roman" w:cs="Times New Roman"/>
-          <w:sz w:val="18"/>
-          <w:szCs w:val="18"/>
-        </w:rPr>
-        <w:commentReference w:id="7"/>
-      </w:r>
-    </w:p>
-    <w:p>
-      <w:pPr>
-        <w:spacing w:line="360" w:lineRule="auto"/>
-        <w:ind w:firstLine="708"/>
-        <w:rPr>
-          <w:rFonts w:ascii="Times New Roman" w:eastAsia="Times New Roman" w:hAnsi="Times New Roman" w:cs="Times New Roman"/>
-        </w:rPr>
-      </w:pPr>
-      <w:commentRangeStart w:id="8"/>
-      <w:commentRangeStart w:id="9"/>
-      <w:r>
-        <w:rPr>
-          <w:rFonts w:ascii="Times New Roman" w:eastAsia="Times New Roman" w:hAnsi="Times New Roman" w:cs="Times New Roman"/>
-        </w:rPr>
-        <w:t>The Pico 4 SDK integrates with Unity to enable developers to compile applications directly for Pico headsets, while also providing templates for features like passthrough, hand tracking, and device-specific optimizations. Its greatest advantage</w:t>
-      </w:r>
-      <w:r>
-        <w:rPr>
-          <w:rFonts w:ascii="Times New Roman" w:eastAsia="Times New Roman" w:hAnsi="Times New Roman" w:cs="Times New Roman"/>
-        </w:rPr>
-        <w:t xml:space="preserve"> </w:t>
-      </w:r>
-      <w:r>
-        <w:rPr>
-          <w:rFonts w:ascii="Times New Roman" w:eastAsia="Times New Roman" w:hAnsi="Times New Roman" w:cs="Times New Roman"/>
-        </w:rPr>
-        <w:t>is ease of deployment, which streamlines prototyping and allows quick hardware testing</w:t>
-      </w:r>
-      <w:r>
-        <w:rPr>
-          <w:rFonts w:ascii="Times New Roman" w:eastAsia="Times New Roman" w:hAnsi="Times New Roman" w:cs="Times New Roman"/>
-        </w:rPr>
-        <w:t xml:space="preserve"> [13]</w:t>
-      </w:r>
-      <w:r>
-        <w:rPr>
-          <w:rFonts w:ascii="Times New Roman" w:eastAsia="Times New Roman" w:hAnsi="Times New Roman" w:cs="Times New Roman"/>
-        </w:rPr>
-        <w:t>. The SDK also supports strong hardware integration, making it valuable for developers targeting Pico’s ecosystem. On the downside, its utility is largely limited to Pico devices, reducing cross-platform applicability. Its reliance on Unity also narrows its usefulness outside that framework. Despite these constraints, the Pico 4 SDK represents a practical development tool for building and testing AR/VR applications, especially in early-stage design and experimentation.</w:t>
-      </w:r>
-      <w:commentRangeEnd w:id="8"/>
-      <w:r>
-        <w:rPr>
-          <w:rStyle w:val="CommentReference"/>
-          <w:rFonts w:ascii="Times New Roman" w:eastAsia="Times New Roman" w:hAnsi="Times New Roman" w:cs="Times New Roman"/>
-          <w:sz w:val="18"/>
-          <w:szCs w:val="18"/>
-        </w:rPr>
-        <w:commentReference w:id="8"/>
-      </w:r>
-      <w:commentRangeEnd w:id="9"/>
-      <w:r>
-        <w:rPr>
-          <w:rStyle w:val="CommentReference"/>
-          <w:rFonts w:ascii="Times New Roman" w:eastAsia="Times New Roman" w:hAnsi="Times New Roman" w:cs="Times New Roman"/>
-          <w:sz w:val="18"/>
-          <w:szCs w:val="18"/>
-        </w:rPr>
-        <w:commentReference w:id="9"/>
-      </w:r>
-    </w:p>
-    <w:p>
-      <w:pPr>
-        <w:spacing w:line="360" w:lineRule="auto"/>
-        <w:ind w:firstLine="708"/>
-      </w:pPr>
-      <w:commentRangeStart w:id="10"/>
-      <w:r>
-        <w:rPr>
-          <w:rFonts w:ascii="Times New Roman" w:eastAsia="Times New Roman" w:hAnsi="Times New Roman" w:cs="Times New Roman"/>
-        </w:rPr>
-        <w:t xml:space="preserve">The Viture Luma SDK is a set of developer tools published officially by the Viture team to make development on their hardware as straightforward as possible. This kit provides libraries for separating out displays from a mobile device and the glasses, as well as more streamlined access to the hardware onboard the glasses, such as </w:t>
-      </w:r>
-      <w:r>
-        <w:rPr>
-          <w:rFonts w:ascii="Times New Roman" w:eastAsia="Times New Roman" w:hAnsi="Times New Roman" w:cs="Times New Roman"/>
-        </w:rPr>
-        <w:t xml:space="preserve">pre-written tracking algorithms for the cameras. </w:t>
-      </w:r>
-      <w:r>
-        <w:rPr>
-          <w:rFonts w:ascii="Times New Roman" w:eastAsia="Times New Roman" w:hAnsi="Times New Roman" w:cs="Times New Roman"/>
-        </w:rPr>
-        <w:t>This SDK also provides substantial documentation and assistance for development</w:t>
-      </w:r>
-      <w:r>
-        <w:rPr>
-          <w:rFonts w:ascii="Times New Roman" w:eastAsia="Times New Roman" w:hAnsi="Times New Roman" w:cs="Times New Roman"/>
-        </w:rPr>
-        <w:t xml:space="preserve"> [13]</w:t>
-      </w:r>
-      <w:r>
-        <w:rPr>
-          <w:rFonts w:ascii="Times New Roman" w:eastAsia="Times New Roman" w:hAnsi="Times New Roman" w:cs="Times New Roman"/>
-        </w:rPr>
-        <w:t xml:space="preserve"> showing important methods and providing samples on how to use them. </w:t>
-      </w:r>
-      <w:commentRangeEnd w:id="10"/>
-      <w:r>
-        <w:rPr>
-          <w:rStyle w:val="CommentReference"/>
-          <w:sz w:val="18"/>
-          <w:szCs w:val="18"/>
-        </w:rPr>
-        <w:commentReference w:id="10"/>
+        <w:rPr>
+          <w:rFonts w:ascii="Times New Roman" w:eastAsia="Times New Roman" w:hAnsi="Times New Roman" w:cs="Times New Roman"/>
+        </w:rPr>
+      </w:pPr>
+      <w:r>
+        <w:rPr>
+          <w:rFonts w:ascii="Times New Roman" w:eastAsia="Times New Roman" w:hAnsi="Times New Roman" w:cs="Times New Roman"/>
+        </w:rPr>
+        <w:t xml:space="preserve">The creation of a stable, responsive wearable system requires a robust development foundation. Android VR [11] provides a highly adaptable and open ecosystem, though hardware fragmentation can complicate deployment. Unity VR Development [10] remains a standard due to its comprehensive XR toolkits and rapid prototyping capabilities, despite some performance bottlenecks in highly demanding applications. </w:t>
+      </w:r>
+      <w:r>
+        <w:rPr>
+          <w:rFonts w:ascii="Times New Roman" w:eastAsia="Times New Roman" w:hAnsi="Times New Roman" w:cs="Times New Roman"/>
+        </w:rPr>
+        <w:t>Hardware-specific</w:t>
+      </w:r>
+      <w:r>
+        <w:rPr>
+          <w:rFonts w:ascii="Times New Roman" w:eastAsia="Times New Roman" w:hAnsi="Times New Roman" w:cs="Times New Roman"/>
+        </w:rPr>
+        <w:t xml:space="preserve"> SDKs, such as the Virtue Lima SDK [13], offer critical device optimizations, including pre-written tracking algorithms and display separation libraries. By leveraging these foundational frameworks, developers can begin to design custom software architectures that address the latency and optimization failures seen in previous wearable prototypes. </w:t>
       </w:r>
     </w:p>
     <w:p>
@@ -2402,14 +1544,14 @@
         </w:rPr>
         <w:t xml:space="preserve">utilizing </w:t>
       </w:r>
-      <w:bookmarkStart w:id="11" w:name="_Int_sgDuRF34"/>
+      <w:bookmarkStart w:id="1" w:name="_Int_sgDuRF34"/>
       <w:r>
         <w:rPr>
           <w:rFonts w:ascii="Times New Roman" w:eastAsia="Times New Roman" w:hAnsi="Times New Roman" w:cs="Times New Roman"/>
         </w:rPr>
         <w:t>MediaPipe’s</w:t>
       </w:r>
-      <w:bookmarkEnd w:id="11"/>
+      <w:bookmarkEnd w:id="1"/>
       <w:r>
         <w:rPr>
           <w:rFonts w:ascii="Times New Roman" w:eastAsia="Times New Roman" w:hAnsi="Times New Roman" w:cs="Times New Roman"/>
@@ -2428,14 +1570,14 @@
         </w:rPr>
         <w:t xml:space="preserve">with </w:t>
       </w:r>
-      <w:bookmarkStart w:id="12" w:name="_Int_0jPK0Zm6"/>
+      <w:bookmarkStart w:id="2" w:name="_Int_0jPK0Zm6"/>
       <w:r>
         <w:rPr>
           <w:rFonts w:ascii="Times New Roman" w:eastAsia="Times New Roman" w:hAnsi="Times New Roman" w:cs="Times New Roman"/>
         </w:rPr>
         <w:t>DeepFace’s</w:t>
       </w:r>
-      <w:bookmarkEnd w:id="12"/>
+      <w:bookmarkEnd w:id="2"/>
       <w:r>
         <w:rPr>
           <w:rFonts w:ascii="Times New Roman" w:eastAsia="Times New Roman" w:hAnsi="Times New Roman" w:cs="Times New Roman"/>
@@ -2514,14 +1656,14 @@
         </w:rPr>
         <w:t xml:space="preserve">while the </w:t>
       </w:r>
-      <w:bookmarkStart w:id="13" w:name="_Int_9QH8Dalo"/>
+      <w:bookmarkStart w:id="3" w:name="_Int_9QH8Dalo"/>
       <w:r>
         <w:rPr>
           <w:rFonts w:ascii="Times New Roman" w:eastAsia="Times New Roman" w:hAnsi="Times New Roman" w:cs="Times New Roman"/>
         </w:rPr>
         <w:t>DeepFace</w:t>
       </w:r>
-      <w:bookmarkEnd w:id="13"/>
+      <w:bookmarkEnd w:id="3"/>
       <w:r>
         <w:rPr>
           <w:rFonts w:ascii="Times New Roman" w:eastAsia="Times New Roman" w:hAnsi="Times New Roman" w:cs="Times New Roman"/>
@@ -2684,14 +1826,14 @@
         </w:rPr>
         <w:t xml:space="preserve">landmarks vector which is output by all </w:t>
       </w:r>
-      <w:bookmarkStart w:id="14" w:name="_Int_wTIkHiDQ"/>
+      <w:bookmarkStart w:id="4" w:name="_Int_wTIkHiDQ"/>
       <w:r>
         <w:rPr>
           <w:rFonts w:ascii="Times New Roman" w:eastAsia="Times New Roman" w:hAnsi="Times New Roman" w:cs="Times New Roman"/>
         </w:rPr>
         <w:t>MediaPipe</w:t>
       </w:r>
-      <w:bookmarkEnd w:id="14"/>
+      <w:bookmarkEnd w:id="4"/>
       <w:r>
         <w:rPr>
           <w:rFonts w:ascii="Times New Roman" w:eastAsia="Times New Roman" w:hAnsi="Times New Roman" w:cs="Times New Roman"/>
@@ -2840,7 +1982,14 @@
         <w:rPr>
           <w:rFonts w:ascii="Times New Roman" w:eastAsia="Times New Roman" w:hAnsi="Times New Roman" w:cs="Times New Roman"/>
         </w:rPr>
-        <w:t xml:space="preserve"> We chose to split our models across a client-server architecture to split the computational workload, finding that when both models were run</w:t>
+        <w:t xml:space="preserve"> We chose to split our models across a client-</w:t>
+      </w:r>
+      <w:r>
+        <w:rPr>
+          <w:rFonts w:ascii="Times New Roman" w:eastAsia="Times New Roman" w:hAnsi="Times New Roman" w:cs="Times New Roman"/>
+        </w:rPr>
+        <w:lastRenderedPageBreak/>
+        <w:t>server architecture to split the computational workload, finding that when both models were run</w:t>
       </w:r>
       <w:r>
         <w:rPr>
@@ -3019,14 +2168,7 @@
         <w:rPr>
           <w:rFonts w:ascii="Times New Roman" w:eastAsia="Times New Roman" w:hAnsi="Times New Roman" w:cs="Times New Roman"/>
         </w:rPr>
-        <w:t xml:space="preserve">a new face is met, </w:t>
-      </w:r>
-      <w:r>
-        <w:rPr>
-          <w:rFonts w:ascii="Times New Roman" w:eastAsia="Times New Roman" w:hAnsi="Times New Roman" w:cs="Times New Roman"/>
-        </w:rPr>
-        <w:lastRenderedPageBreak/>
-        <w:t>identification is still tried initially</w:t>
+        <w:t>a new face is met, identification is still tried initially</w:t>
       </w:r>
       <w:r>
         <w:rPr>
@@ -3253,7 +2395,13 @@
         <w:rPr>
           <w:rFonts w:ascii="Times New Roman" w:eastAsia="Times New Roman" w:hAnsi="Times New Roman" w:cs="Times New Roman"/>
         </w:rPr>
-        <w:t>, at which point if there is no match it will capture the new face</w:t>
+        <w:t xml:space="preserve">, at which point if </w:t>
+      </w:r>
+      <w:r>
+        <w:rPr>
+          <w:rFonts w:ascii="Times New Roman" w:eastAsia="Times New Roman" w:hAnsi="Times New Roman" w:cs="Times New Roman"/>
+        </w:rPr>
+        <w:t>there is no match it will capture the new face</w:t>
       </w:r>
       <w:r>
         <w:rPr>
@@ -3624,13 +2772,7 @@
         <w:rPr>
           <w:rFonts w:ascii="Times New Roman" w:eastAsia="Times New Roman" w:hAnsi="Times New Roman" w:cs="Times New Roman"/>
         </w:rPr>
-        <w:t xml:space="preserve"> and home </w:t>
-      </w:r>
-      <w:r>
-        <w:rPr>
-          <w:rFonts w:ascii="Times New Roman" w:eastAsia="Times New Roman" w:hAnsi="Times New Roman" w:cs="Times New Roman"/>
-        </w:rPr>
-        <w:t>addresses</w:t>
+        <w:t xml:space="preserve"> and home addresses</w:t>
       </w:r>
       <w:r>
         <w:rPr>
@@ -3891,7 +3033,7 @@
           <w:sz w:val="18"/>
           <w:szCs w:val="18"/>
         </w:rPr>
-        <w:t xml:space="preserve">termine how front facing a person’s head is before attempting to identify them. We also had a simple function to determine the sharpness of the crop. Only if the detection passed both of these tests could </w:t>
+        <w:t xml:space="preserve">termine how front facing a person’s head is before attempting to identify them. We also had a simple function to </w:t>
       </w:r>
       <w:r>
         <w:rPr>
@@ -3900,7 +3042,8 @@
           <w:sz w:val="18"/>
           <w:szCs w:val="18"/>
         </w:rPr>
-        <w:t xml:space="preserve">the client attempt to identify the person’s face, rejecting all those that were not high enough quality and waiting for a better angle. </w:t>
+        <w:lastRenderedPageBreak/>
+        <w:t xml:space="preserve">determine the sharpness of the crop. Only if the detection passed both of these tests could </w:t>
       </w:r>
       <w:r>
         <w:rPr>
@@ -3909,105 +3052,105 @@
           <w:sz w:val="18"/>
           <w:szCs w:val="18"/>
         </w:rPr>
-        <w:t>This effectively solved the pose variation problem for real time facial recognition.</w:t>
-      </w:r>
-    </w:p>
-    <w:p>
-      <w:pPr>
-        <w:spacing w:line="360" w:lineRule="auto"/>
-        <w:ind w:firstLine="708"/>
-        <w:rPr>
-          <w:rFonts w:ascii="Times New Roman" w:eastAsia="Times New Roman" w:hAnsi="Times New Roman" w:cs="Times New Roman"/>
-        </w:rPr>
-      </w:pPr>
-      <w:r>
-        <w:rPr>
-          <w:rFonts w:ascii="Times New Roman" w:eastAsia="Times New Roman" w:hAnsi="Times New Roman" w:cs="Times New Roman"/>
-        </w:rPr>
-        <w:t>Our identification logic is split into two cases: ID case and Re-ID case. In the ID case, if there are no recent identifications, our client collects 10 high-quality crops of a new face, then sends them to the server where they are processed by Facenet512, averaged together and normalized, and then checked against the encodings stored within our database. Otherwise, in the Re-ID case, if there have been recent identifications, the last five most recently seen IDs and one captured high-quality crop are sent to be checked for a high-similarity match on the server. If this limited check fails, a full check is run against the single crop, and if that fails, the client will capture 10 crops for a full database search.</w:t>
-      </w:r>
-      <w:r>
-        <w:rPr>
-          <w:rFonts w:ascii="Times New Roman" w:eastAsia="Times New Roman" w:hAnsi="Times New Roman" w:cs="Times New Roman"/>
-        </w:rPr>
-        <w:t xml:space="preserve"> This case-based logic allowed for lightweight and quick identification of several people within the same frame, minimizing processing </w:t>
-      </w:r>
-      <w:r>
-        <w:rPr>
-          <w:rFonts w:ascii="Times New Roman" w:eastAsia="Times New Roman" w:hAnsi="Times New Roman" w:cs="Times New Roman"/>
-        </w:rPr>
-        <w:t xml:space="preserve">lag </w:t>
-      </w:r>
-      <w:r>
-        <w:rPr>
-          <w:rFonts w:ascii="Times New Roman" w:eastAsia="Times New Roman" w:hAnsi="Times New Roman" w:cs="Times New Roman"/>
-        </w:rPr>
-        <w:t xml:space="preserve">and </w:t>
-      </w:r>
-      <w:r>
-        <w:rPr>
-          <w:rFonts w:ascii="Times New Roman" w:eastAsia="Times New Roman" w:hAnsi="Times New Roman" w:cs="Times New Roman"/>
-        </w:rPr>
-        <w:t>identification latency</w:t>
-      </w:r>
-      <w:r>
-        <w:rPr>
-          <w:rFonts w:ascii="Times New Roman" w:eastAsia="Times New Roman" w:hAnsi="Times New Roman" w:cs="Times New Roman"/>
-        </w:rPr>
-        <w:t>.</w:t>
-      </w:r>
-      <w:r>
-        <w:rPr>
-          <w:rFonts w:ascii="Times New Roman" w:eastAsia="Times New Roman" w:hAnsi="Times New Roman" w:cs="Times New Roman"/>
-        </w:rPr>
-        <w:t xml:space="preserve"> These cases allowed for our implementation of a portable AR client and </w:t>
-      </w:r>
-      <w:r>
-        <w:rPr>
-          <w:rFonts w:ascii="Times New Roman" w:eastAsia="Times New Roman" w:hAnsi="Times New Roman" w:cs="Times New Roman"/>
-        </w:rPr>
-        <w:t xml:space="preserve">face </w:t>
-      </w:r>
-      <w:r>
-        <w:rPr>
-          <w:rFonts w:ascii="Times New Roman" w:eastAsia="Times New Roman" w:hAnsi="Times New Roman" w:cs="Times New Roman"/>
-        </w:rPr>
-        <w:t>recognition server architecture</w:t>
-      </w:r>
-      <w:r>
-        <w:rPr>
-          <w:rFonts w:ascii="Times New Roman" w:eastAsia="Times New Roman" w:hAnsi="Times New Roman" w:cs="Times New Roman"/>
-        </w:rPr>
-        <w:t xml:space="preserve"> to work on numerous people in frame at once</w:t>
-      </w:r>
-      <w:r>
-        <w:rPr>
-          <w:rFonts w:ascii="Times New Roman" w:eastAsia="Times New Roman" w:hAnsi="Times New Roman" w:cs="Times New Roman"/>
-        </w:rPr>
-        <w:t>.</w:t>
-      </w:r>
-    </w:p>
-    <w:p>
-      <w:pPr>
-        <w:pStyle w:val="Head1"/>
-        <w:spacing w:before="0" w:after="0" w:line="360" w:lineRule="auto"/>
-        <w:ind w:left="0" w:firstLine="708"/>
+        <w:t xml:space="preserve">the client attempt to identify the person’s face, rejecting all those that were not high enough quality and waiting for a better angle. </w:t>
+      </w:r>
+      <w:r>
         <w:rPr>
           <w:rFonts w:ascii="Times New Roman" w:hAnsi="Times New Roman" w:cs="Times New Roman"/>
           <w:b w:val="0"/>
           <w:sz w:val="18"/>
           <w:szCs w:val="18"/>
         </w:rPr>
-      </w:pPr>
-      <w:r>
+        <w:t>This effectively solved the pose variation problem for real time facial recognition.</w:t>
+      </w:r>
+    </w:p>
+    <w:p>
+      <w:pPr>
+        <w:spacing w:line="360" w:lineRule="auto"/>
+        <w:ind w:firstLine="708"/>
+        <w:rPr>
+          <w:rFonts w:ascii="Times New Roman" w:eastAsia="Times New Roman" w:hAnsi="Times New Roman" w:cs="Times New Roman"/>
+        </w:rPr>
+      </w:pPr>
+      <w:r>
+        <w:rPr>
+          <w:rFonts w:ascii="Times New Roman" w:eastAsia="Times New Roman" w:hAnsi="Times New Roman" w:cs="Times New Roman"/>
+        </w:rPr>
+        <w:t>Our identification logic is split into two cases: ID case and Re-ID case. In the ID case, if there are no recent identifications, our client collects 10 high-quality crops of a new face, then sends them to the server where they are processed by Facenet512, averaged together and normalized, and then checked against the encodings stored within our database. Otherwise, in the Re-ID case, if there have been recent identifications, the last five most recently seen IDs and one captured high-quality crop are sent to be checked for a high-similarity match on the server. If this limited check fails, a full check is run against the single crop, and if that fails, the client will capture 10 crops for a full database search.</w:t>
+      </w:r>
+      <w:r>
+        <w:rPr>
+          <w:rFonts w:ascii="Times New Roman" w:eastAsia="Times New Roman" w:hAnsi="Times New Roman" w:cs="Times New Roman"/>
+        </w:rPr>
+        <w:t xml:space="preserve"> This case-based logic allowed for lightweight and quick identification of several people within the same frame, minimizing processing </w:t>
+      </w:r>
+      <w:r>
+        <w:rPr>
+          <w:rFonts w:ascii="Times New Roman" w:eastAsia="Times New Roman" w:hAnsi="Times New Roman" w:cs="Times New Roman"/>
+        </w:rPr>
+        <w:t xml:space="preserve">lag </w:t>
+      </w:r>
+      <w:r>
+        <w:rPr>
+          <w:rFonts w:ascii="Times New Roman" w:eastAsia="Times New Roman" w:hAnsi="Times New Roman" w:cs="Times New Roman"/>
+        </w:rPr>
+        <w:t xml:space="preserve">and </w:t>
+      </w:r>
+      <w:r>
+        <w:rPr>
+          <w:rFonts w:ascii="Times New Roman" w:eastAsia="Times New Roman" w:hAnsi="Times New Roman" w:cs="Times New Roman"/>
+        </w:rPr>
+        <w:t>identification latency</w:t>
+      </w:r>
+      <w:r>
+        <w:rPr>
+          <w:rFonts w:ascii="Times New Roman" w:eastAsia="Times New Roman" w:hAnsi="Times New Roman" w:cs="Times New Roman"/>
+        </w:rPr>
+        <w:t>.</w:t>
+      </w:r>
+      <w:r>
+        <w:rPr>
+          <w:rFonts w:ascii="Times New Roman" w:eastAsia="Times New Roman" w:hAnsi="Times New Roman" w:cs="Times New Roman"/>
+        </w:rPr>
+        <w:t xml:space="preserve"> These cases allowed for our implementation of a portable AR client and </w:t>
+      </w:r>
+      <w:r>
+        <w:rPr>
+          <w:rFonts w:ascii="Times New Roman" w:eastAsia="Times New Roman" w:hAnsi="Times New Roman" w:cs="Times New Roman"/>
+        </w:rPr>
+        <w:t xml:space="preserve">face </w:t>
+      </w:r>
+      <w:r>
+        <w:rPr>
+          <w:rFonts w:ascii="Times New Roman" w:eastAsia="Times New Roman" w:hAnsi="Times New Roman" w:cs="Times New Roman"/>
+        </w:rPr>
+        <w:t>recognition server architecture</w:t>
+      </w:r>
+      <w:r>
+        <w:rPr>
+          <w:rFonts w:ascii="Times New Roman" w:eastAsia="Times New Roman" w:hAnsi="Times New Roman" w:cs="Times New Roman"/>
+        </w:rPr>
+        <w:t xml:space="preserve"> to work on numerous people in frame at once</w:t>
+      </w:r>
+      <w:r>
+        <w:rPr>
+          <w:rFonts w:ascii="Times New Roman" w:eastAsia="Times New Roman" w:hAnsi="Times New Roman" w:cs="Times New Roman"/>
+        </w:rPr>
+        <w:t>.</w:t>
+      </w:r>
+    </w:p>
+    <w:p>
+      <w:pPr>
+        <w:pStyle w:val="Head1"/>
+        <w:spacing w:before="0" w:after="0" w:line="360" w:lineRule="auto"/>
+        <w:ind w:left="0" w:firstLine="708"/>
         <w:rPr>
           <w:rFonts w:ascii="Times New Roman" w:hAnsi="Times New Roman" w:cs="Times New Roman"/>
           <w:b w:val="0"/>
           <w:sz w:val="18"/>
           <w:szCs w:val="18"/>
         </w:rPr>
-        <w:t xml:space="preserve">Early on in development, we were sending an entire continuous stream of crops from each detection on screen to the </w:t>
-      </w:r>
+      </w:pPr>
       <w:r>
         <w:rPr>
           <w:rFonts w:ascii="Times New Roman" w:hAnsi="Times New Roman" w:cs="Times New Roman"/>
@@ -4015,8 +3158,7 @@
           <w:sz w:val="18"/>
           <w:szCs w:val="18"/>
         </w:rPr>
-        <w:lastRenderedPageBreak/>
-        <w:t xml:space="preserve">server for processing, displaying the results in real time as they flowed back to the client. This was highly inefficient, especially since people’s identities do not change between frames, assuming the program has knowledge that it is tracking the exact same face. MediaPipe’s face mesh model has powerful face tracking built in, but the internal box ID’s and direct box object references are not available through the high-level API. To circumvent this issue, we developed a Kalman filter-based temporal intersection over union box tracking class, and tied identification and UI information to that single </w:t>
+        <w:t xml:space="preserve">Early on in development, we were sending an entire continuous stream of crops from each detection on screen to the server for processing, displaying the results in real time as they flowed back to the client. This was highly inefficient, especially since people’s identities do not change between frames, assuming the program has knowledge that it is tracking the exact same face. MediaPipe’s face mesh model has powerful face tracking built in, but the internal box ID’s and direct box object references are not available through the high-level API. To circumvent this issue, we developed a Kalman filter-based temporal intersection over union box tracking class, and tied identification and UI information to that single </w:t>
       </w:r>
       <w:r>
         <w:rPr>
@@ -4115,26 +3257,35 @@
           <w:sz w:val="18"/>
           <w:szCs w:val="18"/>
         </w:rPr>
-        <w:t xml:space="preserve"> identity, preventing further attempts at reidentification. This allowed for the simultaneous identification and display of multiple people, increased accuracy regardless of a person’s current pose, and greatly reduced processing and latency.</w:t>
-      </w:r>
-    </w:p>
-    <w:p>
-      <w:pPr>
-        <w:pStyle w:val="Head1"/>
-        <w:spacing w:before="0" w:after="0" w:line="360" w:lineRule="auto"/>
-        <w:ind w:left="0" w:firstLine="708"/>
+        <w:t xml:space="preserve"> identity, preventing further attempts at reidentification. This allowed for the simultaneous identification and display of multiple people, </w:t>
+      </w:r>
+      <w:r>
         <w:rPr>
           <w:rFonts w:ascii="Times New Roman" w:hAnsi="Times New Roman" w:cs="Times New Roman"/>
           <w:b w:val="0"/>
           <w:sz w:val="18"/>
           <w:szCs w:val="18"/>
         </w:rPr>
-      </w:pPr>
+        <w:t>increased accuracy regardless of a person’s current pose, and greatly reduced processing and latency.</w:t>
+      </w:r>
     </w:p>
     <w:p>
       <w:pPr>
         <w:pStyle w:val="Head1"/>
         <w:spacing w:before="0" w:after="0" w:line="360" w:lineRule="auto"/>
+        <w:ind w:left="0" w:firstLine="708"/>
+        <w:rPr>
+          <w:rFonts w:ascii="Times New Roman" w:hAnsi="Times New Roman" w:cs="Times New Roman"/>
+          <w:b w:val="0"/>
+          <w:sz w:val="18"/>
+          <w:szCs w:val="18"/>
+        </w:rPr>
+      </w:pPr>
+    </w:p>
+    <w:p>
+      <w:pPr>
+        <w:pStyle w:val="Head1"/>
+        <w:spacing w:before="0" w:after="0" w:line="360" w:lineRule="auto"/>
         <w:rPr>
           <w:rFonts w:ascii="Times New Roman" w:hAnsi="Times New Roman" w:cs="Times New Roman"/>
           <w:smallCaps/>
@@ -4179,10 +3330,7 @@
         <w:ind w:firstLine="708"/>
       </w:pPr>
       <w:r>
-        <w:t xml:space="preserve">Data gathering in this day and age has become difficult. We wanted to use a bot or scraper to collect data en masse and possibly even in real-time. But websites with large amounts of PII employ a whole host of anti-bot measures. For example, LinkedIn utilizes behavioral tracking (how a user uses and navigates the site) and request fingerprinting (verifying that requests are coming from a real user). Getting past these were would have been difficult and would run the risk of us getting banned. As we were searching for jobs at the time, this risk didn’t make sense to take. An alternative is paying for a database that already exists, but that </w:t>
-      </w:r>
-      <w:r>
-        <w:t xml:space="preserve">would require an exorbitant amount of money that was beyond the scope of our budget. </w:t>
+        <w:t xml:space="preserve">Data gathering in this day and age has become difficult. We wanted to use a bot or scraper to collect data en masse and possibly even in real-time. But websites with large amounts of PII employ a whole host of anti-bot measures. For example, LinkedIn utilizes behavioral tracking (how a user uses and navigates the site) and request fingerprinting (verifying that requests are coming from a real user). Getting past these were would have been difficult and would run the risk of us getting banned. As we were searching for jobs at the time, this risk didn’t make sense to take. An alternative is paying for a database that already exists, but that would require an exorbitant amount of money that was beyond the scope of our budget. </w:t>
       </w:r>
     </w:p>
     <w:p>
@@ -4224,10 +3372,7 @@
         <w:t> </w:t>
       </w:r>
       <w:r>
-        <w:t xml:space="preserve"> </w:t>
-      </w:r>
-      <w:r>
-        <w:t>Future Work</w:t>
+        <w:t xml:space="preserve"> Future Work</w:t>
       </w:r>
     </w:p>
     <w:p>
@@ -4236,6 +3381,7 @@
         <w:ind w:firstLine="708"/>
       </w:pPr>
       <w:r>
+        <w:lastRenderedPageBreak/>
         <w:t>To expand on these limitations, we look forward to how, given the resources, time, and a specific client to build for (instead of our more wide-cast net for the sake of demonstrating feasibility) a more robust implementation of our work could be</w:t>
       </w:r>
       <w:r>
@@ -4254,11 +3400,7 @@
         <w:t>The primary limitation the project faces at this current point in time is data. At peak efficiency, the greatest rate we could achieve on a limited budget was approximately 100 people with faces per day, and even that couldn’t be guaranteed to contain good scans of their faces. The best source we could find for this was of course LinkedIN, where a user is most likely to have both their full name as well as a reasonably front-on photo of themselves, however, this solution was not fool-proof. It’s not a guarantee a face is head on, or even the only face in an image. In some instances, an entry would be found in the database that simply wasn’t a face at all. These images were also low resolution, meaning that if the face wasn’t front and center, key landmarks and identifiers could be easily lost simply to image noise.</w:t>
       </w:r>
       <w:r>
-        <w:t xml:space="preserve"> We rectified this by going broader with our scaping, but unfortunately needing to pull manually. By manually searching for scanned persons, we could populate the database with a variety of these publicly available images, from social medias, news articles, and still, LinkedIN. This alone improved the </w:t>
-      </w:r>
-      <w:r>
-        <w:lastRenderedPageBreak/>
-        <w:t xml:space="preserve">accuracy of the model tenfold, and, given automation through this system, the original goal of populating the database with a state becomes substantially more feasible. </w:t>
+        <w:t xml:space="preserve"> We rectified this by going broader with our scaping, but unfortunately needing to pull manually. By manually searching for scanned persons, we could populate the database with a variety of these publicly available images, from social medias, news articles, and still, LinkedIN. This alone improved the accuracy of the model tenfold, and, given automation through this system, the original goal of populating the database with a state becomes substantially more feasible. </w:t>
       </w:r>
     </w:p>
     <w:p>
@@ -4354,7 +3496,13 @@
         <w:rPr>
           <w:rFonts w:ascii="Times New Roman" w:eastAsia="Times New Roman" w:hAnsi="Times New Roman" w:cs="Times New Roman"/>
         </w:rPr>
-        <w:t xml:space="preserve">. However, with the time and budget </w:t>
+        <w:t xml:space="preserve">. However, </w:t>
+      </w:r>
+      <w:r>
+        <w:rPr>
+          <w:rFonts w:ascii="Times New Roman" w:eastAsia="Times New Roman" w:hAnsi="Times New Roman" w:cs="Times New Roman"/>
+        </w:rPr>
+        <w:t xml:space="preserve">with the time and budget </w:t>
       </w:r>
       <w:r>
         <w:rPr>
@@ -4632,18 +3780,7 @@
           <w:sz w:val="18"/>
           <w:szCs w:val="18"/>
         </w:rPr>
-        <w:t xml:space="preserve">S. N. Ilkal, S. S. Munshi, S. Katarki, N. Kotwal, M. Chikkond, and A. Makandar, “AI Based Facial Recognition Smart Glass for </w:t>
-      </w:r>
-      <w:r>
-        <w:rPr>
-          <w:rFonts w:ascii="Times New Roman" w:eastAsia="MS Mincho" w:hAnsi="Times New Roman" w:cs="Times New Roman"/>
-          <w:i/>
-          <w:iCs/>
-          <w:color w:val="auto"/>
-          <w:sz w:val="18"/>
-          <w:szCs w:val="18"/>
-        </w:rPr>
-        <w:t xml:space="preserve">Visually Impaired Person,” Saudi Journal of Engineering and Technology, vol. 10, no. 06, pp. 270–276, Jun. 2025, doi: </w:t>
+        <w:t xml:space="preserve">S. N. Ilkal, S. S. Munshi, S. Katarki, N. Kotwal, M. Chikkond, and A. Makandar, “AI Based Facial Recognition Smart Glass for Visually Impaired Person,” Saudi Journal of Engineering and Technology, vol. 10, no. 06, pp. 270–276, Jun. 2025, doi: </w:t>
       </w:r>
       <w:hyperlink r:id="rId41">
         <w:r>
@@ -5042,6 +4179,7 @@
           <w:sz w:val="18"/>
           <w:szCs w:val="18"/>
         </w:rPr>
+        <w:lastRenderedPageBreak/>
         <w:t>[7]</w:t>
       </w:r>
       <w:r>
@@ -5582,6 +4720,12 @@
       <w:pPr>
         <w:pStyle w:val="MetadataHead"/>
         <w:spacing w:line="360" w:lineRule="auto"/>
+        <w:rPr>
+          <w:rFonts w:ascii="Times New Roman" w:hAnsi="Times New Roman" w:cs="Times New Roman"/>
+          <w:color w:val="auto"/>
+          <w:sz w:val="18"/>
+          <w:szCs w:val="18"/>
+        </w:rPr>
       </w:pPr>
       <w:r>
         <w:rPr>
@@ -5592,8 +4736,18 @@
           <w:sz w:val="18"/>
           <w:szCs w:val="18"/>
         </w:rPr>
-        <w:lastRenderedPageBreak/>
-        <w:t>[14] “Benchmarks · serengil/deepface,” GitHub, 2026. https://github.com/serengil/deepface/tree/master/benchmarks (accessed Apr. 23, 2026).</w:t>
+        <w:t xml:space="preserve">[14] “Benchmarks · serengil/deepface,” GitHub, 2026. </w:t>
+      </w:r>
+      <w:r>
+        <w:rPr>
+          <w:rFonts w:ascii="Times New Roman" w:eastAsia="Times New Roman" w:hAnsi="Times New Roman" w:cs="Times New Roman"/>
+          <w:i/>
+          <w:iCs/>
+          <w:color w:val="auto"/>
+          <w:sz w:val="18"/>
+          <w:szCs w:val="18"/>
+        </w:rPr>
+        <w:t>https://github.com/serengil/deepface/tree/master/benchmarks (accessed Apr. 23, 2026).</w:t>
       </w:r>
     </w:p>
     <w:p>
@@ -5601,31 +4755,140 @@
         <w:pStyle w:val="MetadataHead"/>
         <w:spacing w:line="360" w:lineRule="auto"/>
         <w:rPr>
+          <w:rFonts w:ascii="Times New Roman" w:hAnsi="Times New Roman" w:cs="Times New Roman"/>
+          <w:i/>
+          <w:iCs/>
           <w:color w:val="auto"/>
-          <w:sz w:val="14"/>
-          <w:szCs w:val="14"/>
+          <w:sz w:val="18"/>
+          <w:szCs w:val="18"/>
           <w14:ligatures w14:val="standard"/>
         </w:rPr>
       </w:pPr>
+      <w:r>
+        <w:rPr>
+          <w:rFonts w:ascii="Times New Roman" w:hAnsi="Times New Roman" w:cs="Times New Roman"/>
+          <w:i/>
+          <w:iCs/>
+          <w:color w:val="auto"/>
+          <w:sz w:val="18"/>
+          <w:szCs w:val="18"/>
+          <w14:ligatures w14:val="standard"/>
+        </w:rPr>
+        <w:t xml:space="preserve">[15] Futurism, “Meta Adding Facial Recognition to Its Smart Glasses That Identifies People in Real Time, Hoping the Public Is Too Distracted by Political Turmoil to Care,” Futurism, 2026. </w:t>
+      </w:r>
+      <w:hyperlink r:id="rId53" w:tgtFrame="_blank" w:history="1">
+        <w:r>
+          <w:rPr>
+            <w:rStyle w:val="Hyperlink"/>
+            <w:rFonts w:ascii="Times New Roman" w:hAnsi="Times New Roman" w:cs="Times New Roman"/>
+            <w:i/>
+            <w:iCs/>
+            <w:color w:val="auto"/>
+            <w:sz w:val="18"/>
+            <w:szCs w:val="18"/>
+            <w14:ligatures w14:val="standard"/>
+          </w:rPr>
+          <w:t>https://futurism.com/artificial-intelligence/meta-facial-recognition-glasses</w:t>
+        </w:r>
+      </w:hyperlink>
+      <w:r>
+        <w:rPr>
+          <w:rFonts w:ascii="Times New Roman" w:hAnsi="Times New Roman" w:cs="Times New Roman"/>
+          <w:i/>
+          <w:iCs/>
+          <w:color w:val="auto"/>
+          <w:sz w:val="18"/>
+          <w:szCs w:val="18"/>
+          <w14:ligatures w14:val="standard"/>
+        </w:rPr>
+        <w:t xml:space="preserve"> (accessed Apr. 24, 2026).</w:t>
+      </w:r>
     </w:p>
     <w:p>
       <w:pPr>
         <w:pStyle w:val="MetadataHead"/>
         <w:spacing w:line="360" w:lineRule="auto"/>
         <w:rPr>
+          <w:rFonts w:ascii="Times New Roman" w:hAnsi="Times New Roman" w:cs="Times New Roman"/>
+          <w:i/>
+          <w:iCs/>
           <w:color w:val="auto"/>
-        </w:rPr>
-      </w:pPr>
+          <w:sz w:val="18"/>
+          <w:szCs w:val="18"/>
+          <w14:ligatures w14:val="standard"/>
+        </w:rPr>
+      </w:pPr>
+      <w:r>
+        <w:rPr>
+          <w:rFonts w:ascii="Times New Roman" w:hAnsi="Times New Roman" w:cs="Times New Roman"/>
+          <w:i/>
+          <w:iCs/>
+          <w:color w:val="auto"/>
+          <w:sz w:val="18"/>
+          <w:szCs w:val="18"/>
+          <w14:ligatures w14:val="standard"/>
+        </w:rPr>
+        <w:t xml:space="preserve">[16] Meta, “Orion's Compute Puck: The Story Behind the Device that Helped Make Our AR Glasses Possible,” Meta Quest Blog, 2025. </w:t>
+      </w:r>
+      <w:hyperlink r:id="rId54" w:tgtFrame="_blank" w:history="1">
+        <w:r>
+          <w:rPr>
+            <w:rStyle w:val="Hyperlink"/>
+            <w:rFonts w:ascii="Times New Roman" w:hAnsi="Times New Roman" w:cs="Times New Roman"/>
+            <w:i/>
+            <w:iCs/>
+            <w:color w:val="auto"/>
+            <w:sz w:val="18"/>
+            <w:szCs w:val="18"/>
+            <w14:ligatures w14:val="standard"/>
+          </w:rPr>
+          <w:t>https://www.meta.com/blog/orion-compute-puck-reality-labs-next-computing-platform/</w:t>
+        </w:r>
+      </w:hyperlink>
+      <w:r>
+        <w:rPr>
+          <w:rFonts w:ascii="Times New Roman" w:hAnsi="Times New Roman" w:cs="Times New Roman"/>
+          <w:i/>
+          <w:iCs/>
+          <w:color w:val="auto"/>
+          <w:sz w:val="18"/>
+          <w:szCs w:val="18"/>
+          <w14:ligatures w14:val="standard"/>
+        </w:rPr>
+        <w:t xml:space="preserve"> (accessed Apr. 24, 2026).</w:t>
+      </w:r>
     </w:p>
     <w:p>
       <w:pPr>
         <w:pStyle w:val="MetadataHead"/>
         <w:spacing w:line="360" w:lineRule="auto"/>
+        <w:rPr>
+          <w:rFonts w:ascii="Times New Roman" w:hAnsi="Times New Roman" w:cs="Times New Roman"/>
+          <w:color w:val="auto"/>
+          <w:sz w:val="18"/>
+          <w:szCs w:val="18"/>
+          <w14:ligatures w14:val="standard"/>
+        </w:rPr>
+      </w:pPr>
+    </w:p>
+    <w:p>
+      <w:pPr>
+        <w:pStyle w:val="MetadataHead"/>
+        <w:spacing w:line="360" w:lineRule="auto"/>
+        <w:rPr>
+          <w:color w:val="auto"/>
+        </w:rPr>
+      </w:pPr>
+    </w:p>
+    <w:p>
+      <w:pPr>
+        <w:pStyle w:val="MetadataHead"/>
+        <w:spacing w:line="360" w:lineRule="auto"/>
       </w:pPr>
     </w:p>
     <w:sectPr>
-      <w:headerReference w:type="first" r:id="rId53"/>
-      <w:footerReference w:type="first" r:id="rId54"/>
+      <w:headerReference w:type="first" r:id="rId55"/>
+      <w:footerReference w:type="first" r:id="rId56"/>
       <w:endnotePr>
         <w:numFmt w:val="decimal"/>
       </w:endnotePr>
@@ -5659,195 +4922,24 @@
       </w:r>
     </w:p>
   </w:comment>
-  <w:comment w:id="1" w:author="McCleary, Andrew J." w:date="2026-04-22T22:51:00Z" w:initials="MA">
-    <w:p>
-      <w:pPr>
-        <w:pStyle w:val="CommentText"/>
-      </w:pPr>
-      <w:r>
-        <w:rPr>
-          <w:rStyle w:val="CommentReference"/>
-        </w:rPr>
-        <w:annotationRef/>
-      </w:r>
-      <w:r>
-        <w:t>Not the worst thing to jump right into it, but wouldn't hurt to add a sentence or two just before to provide some context</w:t>
-      </w:r>
-    </w:p>
-  </w:comment>
-  <w:comment w:id="2" w:author="McCleary, Andrew J." w:date="2026-04-22T23:02:00Z" w:initials="MA">
-    <w:p>
-      <w:pPr>
-        <w:pStyle w:val="CommentText"/>
-      </w:pPr>
-      <w:r>
-        <w:rPr>
-          <w:rStyle w:val="CommentReference"/>
-        </w:rPr>
-        <w:annotationRef/>
-      </w:r>
-      <w:r>
-        <w:t>do they require another device like the pi or do they compute internally?</w:t>
-      </w:r>
-    </w:p>
-  </w:comment>
-  <w:comment w:id="3" w:author="McCleary, Andrew J." w:date="2026-04-22T23:03:00Z" w:initials="MA">
-    <w:p>
-      <w:pPr>
-        <w:pStyle w:val="CommentText"/>
-      </w:pPr>
-      <w:r>
-        <w:rPr>
-          <w:rStyle w:val="CommentReference"/>
-        </w:rPr>
-        <w:annotationRef/>
-      </w:r>
-      <w:r>
-        <w:t>this could possibly be cut imo</w:t>
-      </w:r>
-    </w:p>
-  </w:comment>
-  <w:comment w:id="4" w:author="McCleary, Andrew J." w:date="2026-04-22T23:04:00Z" w:initials="MA">
-    <w:p>
-      <w:pPr>
-        <w:pStyle w:val="CommentText"/>
-      </w:pPr>
-      <w:r>
-        <w:rPr>
-          <w:rStyle w:val="CommentReference"/>
-        </w:rPr>
-        <w:annotationRef/>
-      </w:r>
-      <w:r>
-        <w:t>also lowkey cuttable, we're not competing with AR glasses</w:t>
-      </w:r>
-    </w:p>
-  </w:comment>
-  <w:comment w:id="6" w:author="McCleary, Andrew J." w:date="2026-04-22T23:05:00Z" w:initials="MA">
-    <w:p>
-      <w:pPr>
-        <w:pStyle w:val="CommentText"/>
-      </w:pPr>
-      <w:r>
-        <w:rPr>
-          <w:rStyle w:val="CommentReference"/>
-        </w:rPr>
-        <w:annotationRef/>
-      </w:r>
-      <w:r>
-        <w:t>i would also fully cut this. since we would be cutting multiple, possibly find other face recognition ie Windows Hello, Meta stuff etc</w:t>
-      </w:r>
-    </w:p>
-  </w:comment>
-  <w:comment w:id="7" w:author="McCleary, Andrew J." w:date="2026-04-22T14:52:00Z" w:initials="MA">
-    <w:p>
-      <w:pPr>
-        <w:pStyle w:val="CommentText"/>
-      </w:pPr>
-      <w:r>
-        <w:rPr>
-          <w:rStyle w:val="CommentReference"/>
-        </w:rPr>
-        <w:annotationRef/>
-      </w:r>
-      <w:r>
-        <w:t>lmao needs updating</w:t>
-      </w:r>
-    </w:p>
-  </w:comment>
-  <w:comment w:id="8" w:author="McCleary, Andrew J." w:date="2026-04-22T23:11:00Z" w:initials="MA">
-    <w:p>
-      <w:pPr>
-        <w:pStyle w:val="CommentText"/>
-      </w:pPr>
-      <w:r>
-        <w:rPr>
-          <w:rStyle w:val="CommentReference"/>
-        </w:rPr>
-        <w:annotationRef/>
-      </w:r>
-      <w:r>
-        <w:t>i think cut this as well because we are barely building an AR app at all</w:t>
-      </w:r>
-    </w:p>
-  </w:comment>
-  <w:comment w:id="9" w:author="McCleary, Andrew J." w:date="2026-04-22T23:14:00Z" w:initials="MA">
-    <w:p>
-      <w:pPr>
-        <w:pStyle w:val="CommentText"/>
-      </w:pPr>
-      <w:r>
-        <w:rPr>
-          <w:rStyle w:val="CommentReference"/>
-        </w:rPr>
-        <w:annotationRef/>
-      </w:r>
-      <w:r>
-        <w:t>we can discuss this as a group if we want to keep the AR dev lit review sections because i feel like theres more of a case for keeping em, as opposed to the glasses sections which we are just not competing with at all</w:t>
-      </w:r>
-    </w:p>
-  </w:comment>
-  <w:comment w:id="10" w:author="McCleary, Andrew J." w:date="2026-04-22T23:10:00Z" w:initials="MA">
-    <w:p>
-      <w:pPr>
-        <w:pStyle w:val="CommentText"/>
-      </w:pPr>
-      <w:r>
-        <w:rPr>
-          <w:rStyle w:val="CommentReference"/>
-        </w:rPr>
-        <w:annotationRef/>
-      </w:r>
-      <w:r>
-        <w:t>this and the other one on viture could be migrated out of this section and it would make more sense imo</w:t>
-      </w:r>
-    </w:p>
-  </w:comment>
 </w:comments>
 </file>
 
 <file path=word/commentsExtended.xml><?xml version="1.0" encoding="utf-8"?>
 <w15:commentsEx xmlns:wpc="http://schemas.microsoft.com/office/word/2010/wordprocessingCanvas" xmlns:cx="http://schemas.microsoft.com/office/drawing/2014/chartex" xmlns:cx1="http://schemas.microsoft.com/office/drawing/2015/9/8/chartex" xmlns:cx2="http://schemas.microsoft.com/office/drawing/2015/10/21/chartex" xmlns:cx3="http://schemas.microsoft.com/office/drawing/2016/5/9/chartex" xmlns:cx4="http://schemas.microsoft.com/office/drawing/2016/5/10/chartex" xmlns:cx5="http://schemas.microsoft.com/office/drawing/2016/5/11/chartex" xmlns:cx6="http://schemas.microsoft.com/office/drawing/2016/5/12/chartex" xmlns:cx7="http://schemas.microsoft.com/office/drawing/2016/5/13/chartex" xmlns:cx8="http://schemas.microsoft.com/office/drawing/2016/5/14/chartex" xmlns:mc="http://schemas.openxmlformats.org/markup-compatibility/2006" xmlns:aink="http://schemas.microsoft.com/office/drawing/2016/ink" xmlns:am3d="http://schemas.microsoft.com/office/drawing/2017/model3d" xmlns:o="urn:schemas-microsoft-com:office:office" xmlns:oel="http://schemas.microsoft.com/office/2019/extlst" xmlns:r="http://schemas.openxmlformats.org/officeDocument/2006/relationships" xmlns:m="http://schemas.openxmlformats.org/officeDocument/2006/math" xmlns:v="urn:schemas-microsoft-com:vml" xmlns:wp14="http://schemas.microsoft.com/office/word/2010/wordprocessingDrawing" xmlns:wp="http://schemas.openxmlformats.org/drawingml/2006/wordprocessingDrawing" xmlns:w10="urn:schemas-microsoft-com:office:word" xmlns:w="http://schemas.openxmlformats.org/wordprocessingml/2006/main" xmlns:w14="http://schemas.microsoft.com/office/word/2010/wordml" xmlns:w15="http://schemas.microsoft.com/office/word/2012/wordml" xmlns:w16cex="http://schemas.microsoft.com/office/word/2018/wordml/cex" xmlns:w16cid="http://schemas.microsoft.com/office/word/2016/wordml/cid" xmlns:w16="http://schemas.microsoft.com/office/word/2018/wordml" xmlns:w16du="http://schemas.microsoft.com/office/word/2023/wordml/word16du" xmlns:w16sdtdh="http://schemas.microsoft.com/office/word/2020/wordml/sdtdatahash" xmlns:w16sdtfl="http://schemas.microsoft.com/office/word/2024/wordml/sdtformatlock" xmlns:w16se="http://schemas.microsoft.com/office/word/2015/wordml/symex" xmlns:wpg="http://schemas.microsoft.com/office/word/2010/wordprocessingGroup" xmlns:wpi="http://schemas.microsoft.com/office/word/2010/wordprocessingInk" xmlns:wne="http://schemas.microsoft.com/office/word/2006/wordml" xmlns:wps="http://schemas.microsoft.com/office/word/2010/wordprocessingShape" mc:Ignorable="w14 w15 w16se w16cid w16 w16cex w16sdtdh w16sdtfl w16du wp14">
   <w15:commentEx w15:paraId="67B63104" w15:done="0"/>
-  <w15:commentEx w15:paraId="77496433" w15:done="0"/>
-  <w15:commentEx w15:paraId="69B84595" w15:done="0"/>
-  <w15:commentEx w15:paraId="4C360D49" w15:done="0"/>
-  <w15:commentEx w15:paraId="539A4FDE" w15:done="0"/>
-  <w15:commentEx w15:paraId="7075CB1D" w15:done="0"/>
-  <w15:commentEx w15:paraId="6F98EC36" w15:done="0"/>
-  <w15:commentEx w15:paraId="286B76AA" w15:done="0"/>
-  <w15:commentEx w15:paraId="472CB0CD" w15:paraIdParent="286B76AA" w15:done="0"/>
-  <w15:commentEx w15:paraId="06A7FA56" w15:done="0"/>
 </w15:commentsEx>
 </file>
 
 <file path=word/commentsExtensible.xml><?xml version="1.0" encoding="utf-8"?>
 <w16cex:commentsExtensible xmlns:wpc="http://schemas.microsoft.com/office/word/2010/wordprocessingCanvas" xmlns:cx="http://schemas.microsoft.com/office/drawing/2014/chartex" xmlns:cx1="http://schemas.microsoft.com/office/drawing/2015/9/8/chartex" xmlns:cx2="http://schemas.microsoft.com/office/drawing/2015/10/21/chartex" xmlns:cx3="http://schemas.microsoft.com/office/drawing/2016/5/9/chartex" xmlns:cx4="http://schemas.microsoft.com/office/drawing/2016/5/10/chartex" xmlns:cx5="http://schemas.microsoft.com/office/drawing/2016/5/11/chartex" xmlns:cx6="http://schemas.microsoft.com/office/drawing/2016/5/12/chartex" xmlns:cx7="http://schemas.microsoft.com/office/drawing/2016/5/13/chartex" xmlns:cx8="http://schemas.microsoft.com/office/drawing/2016/5/14/chartex" xmlns:cr="http://schemas.microsoft.com/office/comments/2020/reactions" xmlns:mc="http://schemas.openxmlformats.org/markup-compatibility/2006" xmlns:aink="http://schemas.microsoft.com/office/drawing/2016/ink" xmlns:am3d="http://schemas.microsoft.com/office/drawing/2017/model3d" xmlns:o="urn:schemas-microsoft-com:office:office" xmlns:oel="http://schemas.microsoft.com/office/2019/extlst" xmlns:r="http://schemas.openxmlformats.org/officeDocument/2006/relationships" xmlns:m="http://schemas.openxmlformats.org/officeDocument/2006/math" xmlns:v="urn:schemas-microsoft-com:vml" xmlns:wp14="http://schemas.microsoft.com/office/word/2010/wordprocessingDrawing" xmlns:wp="http://schemas.openxmlformats.org/drawingml/2006/wordprocessingDrawing" xmlns:w10="urn:schemas-microsoft-com:office:word" xmlns:w="http://schemas.openxmlformats.org/wordprocessingml/2006/main" xmlns:w14="http://schemas.microsoft.com/office/word/2010/wordml" xmlns:w15="http://schemas.microsoft.com/office/word/2012/wordml" xmlns:w16cex="http://schemas.microsoft.com/office/word/2018/wordml/cex" xmlns:w16cid="http://schemas.microsoft.com/office/word/2016/wordml/cid" xmlns:w16="http://schemas.microsoft.com/office/word/2018/wordml" xmlns:w16du="http://schemas.microsoft.com/office/word/2023/wordml/word16du" xmlns:w16sdtdh="http://schemas.microsoft.com/office/word/2020/wordml/sdtdatahash" xmlns:w16sdtfl="http://schemas.microsoft.com/office/word/2024/wordml/sdtformatlock" xmlns:w16se="http://schemas.microsoft.com/office/word/2015/wordml/symex" xmlns:wpg="http://schemas.microsoft.com/office/word/2010/wordprocessingGroup" xmlns:wpi="http://schemas.microsoft.com/office/word/2010/wordprocessingInk" xmlns:wne="http://schemas.microsoft.com/office/word/2006/wordml" xmlns:wps="http://schemas.microsoft.com/office/word/2010/wordprocessingShape" mc:Ignorable="w14 w15 w16se w16cid w16 w16cex w16sdtdh w16sdtfl cr w16du wp14">
   <w16cex:commentExtensible w16cex:durableId="1539ABD0" w16cex:dateUtc="2026-04-23T02:50:00Z"/>
-  <w16cex:commentExtensible w16cex:durableId="4CED40E7" w16cex:dateUtc="2026-04-23T02:51:00Z"/>
-  <w16cex:commentExtensible w16cex:durableId="56E1413E" w16cex:dateUtc="2026-04-23T03:02:00Z"/>
-  <w16cex:commentExtensible w16cex:durableId="012F9FDD" w16cex:dateUtc="2026-04-23T03:03:00Z"/>
-  <w16cex:commentExtensible w16cex:durableId="6265C71D" w16cex:dateUtc="2026-04-23T03:04:00Z"/>
-  <w16cex:commentExtensible w16cex:durableId="14DC2C48" w16cex:dateUtc="2026-04-23T03:05:00Z"/>
-  <w16cex:commentExtensible w16cex:durableId="37408EFF" w16cex:dateUtc="2026-04-22T18:52:00Z"/>
-  <w16cex:commentExtensible w16cex:durableId="265D6A69" w16cex:dateUtc="2026-04-23T03:11:00Z"/>
-  <w16cex:commentExtensible w16cex:durableId="720D041C" w16cex:dateUtc="2026-04-23T03:14:00Z"/>
-  <w16cex:commentExtensible w16cex:durableId="6AED1A78" w16cex:dateUtc="2026-04-23T03:10:00Z"/>
 </w16cex:commentsExtensible>
 </file>
 
 <file path=word/commentsIds.xml><?xml version="1.0" encoding="utf-8"?>
 <w16cid:commentsIds xmlns:wpc="http://schemas.microsoft.com/office/word/2010/wordprocessingCanvas" xmlns:cx="http://schemas.microsoft.com/office/drawing/2014/chartex" xmlns:cx1="http://schemas.microsoft.com/office/drawing/2015/9/8/chartex" xmlns:cx2="http://schemas.microsoft.com/office/drawing/2015/10/21/chartex" xmlns:cx3="http://schemas.microsoft.com/office/drawing/2016/5/9/chartex" xmlns:cx4="http://schemas.microsoft.com/office/drawing/2016/5/10/chartex" xmlns:cx5="http://schemas.microsoft.com/office/drawing/2016/5/11/chartex" xmlns:cx6="http://schemas.microsoft.com/office/drawing/2016/5/12/chartex" xmlns:cx7="http://schemas.microsoft.com/office/drawing/2016/5/13/chartex" xmlns:cx8="http://schemas.microsoft.com/office/drawing/2016/5/14/chartex" xmlns:mc="http://schemas.openxmlformats.org/markup-compatibility/2006" xmlns:aink="http://schemas.microsoft.com/office/drawing/2016/ink" xmlns:am3d="http://schemas.microsoft.com/office/drawing/2017/model3d" xmlns:o="urn:schemas-microsoft-com:office:office" xmlns:oel="http://schemas.microsoft.com/office/2019/extlst" xmlns:r="http://schemas.openxmlformats.org/officeDocument/2006/relationships" xmlns:m="http://schemas.openxmlformats.org/officeDocument/2006/math" xmlns:v="urn:schemas-microsoft-com:vml" xmlns:wp14="http://schemas.microsoft.com/office/word/2010/wordprocessingDrawing" xmlns:wp="http://schemas.openxmlformats.org/drawingml/2006/wordprocessingDrawing" xmlns:w10="urn:schemas-microsoft-com:office:word" xmlns:w="http://schemas.openxmlformats.org/wordprocessingml/2006/main" xmlns:w14="http://schemas.microsoft.com/office/word/2010/wordml" xmlns:w15="http://schemas.microsoft.com/office/word/2012/wordml" xmlns:w16cex="http://schemas.microsoft.com/office/word/2018/wordml/cex" xmlns:w16cid="http://schemas.microsoft.com/office/word/2016/wordml/cid" xmlns:w16="http://schemas.microsoft.com/office/word/2018/wordml" xmlns:w16du="http://schemas.microsoft.com/office/word/2023/wordml/word16du" xmlns:w16sdtdh="http://schemas.microsoft.com/office/word/2020/wordml/sdtdatahash" xmlns:w16sdtfl="http://schemas.microsoft.com/office/word/2024/wordml/sdtformatlock" xmlns:w16se="http://schemas.microsoft.com/office/word/2015/wordml/symex" xmlns:wpg="http://schemas.microsoft.com/office/word/2010/wordprocessingGroup" xmlns:wpi="http://schemas.microsoft.com/office/word/2010/wordprocessingInk" xmlns:wne="http://schemas.microsoft.com/office/word/2006/wordml" xmlns:wps="http://schemas.microsoft.com/office/word/2010/wordprocessingShape" mc:Ignorable="w14 w15 w16se w16cid w16 w16cex w16sdtdh w16sdtfl w16du wp14">
   <w16cid:commentId w16cid:paraId="67B63104" w16cid:durableId="1539ABD0"/>
-  <w16cid:commentId w16cid:paraId="77496433" w16cid:durableId="4CED40E7"/>
-  <w16cid:commentId w16cid:paraId="69B84595" w16cid:durableId="56E1413E"/>
-  <w16cid:commentId w16cid:paraId="4C360D49" w16cid:durableId="012F9FDD"/>
-  <w16cid:commentId w16cid:paraId="539A4FDE" w16cid:durableId="6265C71D"/>
-  <w16cid:commentId w16cid:paraId="7075CB1D" w16cid:durableId="14DC2C48"/>
-  <w16cid:commentId w16cid:paraId="6F98EC36" w16cid:durableId="37408EFF"/>
-  <w16cid:commentId w16cid:paraId="286B76AA" w16cid:durableId="265D6A69"/>
-  <w16cid:commentId w16cid:paraId="472CB0CD" w16cid:durableId="720D041C"/>
-  <w16cid:commentId w16cid:paraId="06A7FA56" w16cid:durableId="6AED1A78"/>
 </w16cid:commentsIds>
 </file>
 
@@ -10324,7 +9416,6 @@
   <w:style w:type="character" w:default="1" w:styleId="DefaultParagraphFont">
     <w:name w:val="Default Paragraph Font"/>
     <w:uiPriority w:val="1"/>
-    <w:semiHidden/>
     <w:unhideWhenUsed/>
   </w:style>
   <w:style w:type="table" w:default="1" w:styleId="TableNormal">
@@ -16007,15 +15098,190 @@
 </file>
 
 <file path=customXml/item1.xml><?xml version="1.0" encoding="utf-8"?>
-<p:properties xmlns:p="http://schemas.microsoft.com/office/2006/metadata/properties" xmlns:xsi="http://www.w3.org/2001/XMLSchema-instance" xmlns:pc="http://schemas.microsoft.com/office/infopath/2007/PartnerControls">
-  <documentManagement>
-    <_activity xmlns="1112fb0d-fe2d-4cf5-ba0d-ded80aadf55c" xsi:nil="true"/>
-  </documentManagement>
-</p:properties>
+<Workflow version="v.1.13">
+  <Filtration versionrequired="True" status="DONE" StartTime="25-07-2014 13:27:04" EndTime="25-07-2014 13:28:29">
+    <Mandatory>
+      <P status="DONE" StartTime="25-07-2014 13:27:42" EndTime="25-07-2014 13:27:43">(1) * Replace leftmost and rightmost char -(hyphen) of superscript matter, into minus</P>
+      <P status="DONE" StartTime="25-07-2014 13:27:43" EndTime="25-07-2014 13:27:44">(2) * Replace all variations of degree into 'degree' symbol</P>
+      <P status="DONE" StartTime="25-07-2014 13:27:44" EndTime="25-07-2014 13:27:44">(3) * Remove unwanted blank lines</P>
+      <P status="DONE" StartTime="25-07-2014 13:27:44" EndTime="25-07-2014 13:27:44">(4) * Replace underlined 'plus' sign(s) with plus/minus symbol(s)</P>
+      <P status="DONE" StartTime="25-07-2014 13:27:44" EndTime="25-07-2014 13:27:44">(5) * Replace underlined 'Greater Than' symbol(s) with 'Greater Than or Equal To' symbol(s)</P>
+      <P status="DONE" StartTime="25-07-2014 13:27:44" EndTime="25-07-2014 13:27:45">(6) * Replace underlined 'Less Than' symbol(s) with 'Less Than or Equal To' symbol(s)</P>
+      <P status="DONE" StartTime="25-07-2014 13:27:45" EndTime="25-07-2014 13:27:46">(7) * Replace 'x' with 'multiplication' symbol</P>
+      <P status="DONE" StartTime="25-07-2014 13:27:46" EndTime="25-07-2014 13:27:46">(8) * Remove space(s) before tab</P>
+      <P status="DONE" StartTime="25-07-2014 13:27:46" EndTime="25-07-2014 13:27:46">(9) * Remove space(s) after tab</P>
+      <P status="DONE" StartTime="25-07-2014 13:27:46" EndTime="25-07-2014 13:27:47">(10) * Remove tab(s) before paragraph mark</P>
+      <P status="DONE" StartTime="25-07-2014 13:27:47" EndTime="25-07-2014 13:27:47">(11) * Remove tab(s) after paragraph mark</P>
+      <P status="DONE" StartTime="25-07-2014 13:27:47" EndTime="25-07-2014 13:27:50">(12) * Remove space(s) before paragraph mark</P>
+      <P status="DONE" StartTime="25-07-2014 13:27:50" EndTime="25-07-2014 13:27:51">(13) * Remove space(s) after paragraph mark</P>
+      <P status="DONE" StartTime="25-07-2014 13:27:51" EndTime="25-07-2014 13:27:51">(14) * Replace multiple space(s) with single space</P>
+      <P status="DONE" StartTime="25-07-2014 13:27:51" EndTime="25-07-2014 13:28:14">(16) * Replace 'single hyphen' inside page range/number range with 'double hyphen'</P>
+      <P status="DONE" StartTime="25-07-2014 13:28:14" EndTime="25-07-2014 13:28:14">(18) * Change smart quote(s) to straight quote(s)</P>
+      <P status="DONE" StartTime="25-07-2014 13:28:14" EndTime="25-07-2014 13:28:15">(19) * Change straight quote(s) to smart quote(s)</P>
+      <P status="DONE" StartTime="25-07-2014 13:28:15" EndTime="25-07-2014 13:28:15">(20) * Change three consecutive dots to Ellipsis(...)</P>
+      <P status="DONE" StartTime="25-07-2014 13:28:15" EndTime="25-07-2014 13:28:16">(22) * Remove space(s) before comma</P>
+      <P status="DONE" StartTime="25-07-2014 13:28:16" EndTime="25-07-2014 13:28:16">(23) * Remove space(s) before semicolon</P>
+      <P status="DONE" StartTime="25-07-2014 13:28:16" EndTime="25-07-2014 13:28:17">(24) * Remove space(s) before period</P>
+      <P status="DONE" StartTime="25-07-2014 13:28:17" EndTime="25-07-2014 13:28:17">(25) * Remove space(s) before closing parenthesis</P>
+      <P status="DONE" StartTime="25-07-2014 13:28:17" EndTime="25-07-2014 13:28:17">(26) * Remove space(s) after opening parenthesis</P>
+      <P status="DONE" StartTime="25-07-2014 13:28:17" EndTime="25-07-2014 13:28:18">(28) * Remove space(s) before % sign</P>
+      <P status="DONE" StartTime="25-07-2014 13:28:18" EndTime="25-07-2014 13:28:18">(29) * Remove space before Celsius or Fahrenheit sign</P>
+      <P status="DONE" StartTime="25-07-2014 13:28:18" EndTime="25-07-2014 13:28:19">(34) * Convert 'direction' sign(s) to symbol(s)</P>
+      <P status="DONE" StartTime="25-07-2014 13:28:19" EndTime="25-07-2014 13:28:20">(38) * Remove unwanted section/page/column Breaks</P>
+      <P status="DONE" StartTime="25-07-2014 13:28:20" EndTime="25-07-2014 13:28:22">(47) * Convert 'direction' arrow(s) to symbol(s)</P>
+    </Mandatory>
+    <Optional>
+      <P status="YTS">(15) * Change 'Em Dash' with --- (triple hyphen) and 'En Dash' with -- (double hyphen)</P>
+      <P status="YTS">(17) * Change 'double hyphen' inside page range/number range into 'single hyphen'</P>
+      <P status="YTS">(21) * Change hyphen (with space both side) into En Dash (with space both side)</P>
+      <P status="YTS">(27) * Remove comma from digits</P>
+      <P status="YTS">(30) * Convert tab mark(s) to standard form</P>
+      <P status="YTS">(31) * Add 'space' before and after 'equal sign'</P>
+      <P status="YTS">(32) * Move 'period' from outside closing double quote(s) to inside</P>
+      <P status="YTS">(33) * Move 'comma' from outside closing double quote(s) to inside</P>
+      <P status="YTS">(35) * Convert 'hard return' mark(s) to standard form</P>
+      <P status="YTS">(36) * Insert 'En Space' in COMMON SI and Metric units</P>
+      <P status="YTS">(37) * Insert 'En Space' for COMPLEX (&gt;550 units) SI and Metric units</P>
+      <P status="YTS">(39) * Replace Em dash with spaces on both sides to En dash with spaces on both sides</P>
+      <P status="YTS">(40) * Replace --- (Triple hyphens) with spaces on both sides to En dash with spaces on both sides</P>
+      <P status="YTS">(41) * Replace --- (Triple hyphens) without spaces on both sides to En dash with spaces on both sides</P>
+      <P status="YTS">(42) * Replace -- (Double hyphens) with spaces on both sides to En dash with spaces on both sides</P>
+      <P status="YTS">(43) * Insert 'Non-breaking Space' for COMPLEX (&gt;550 units) SI and Metric units</P>
+      <P status="YTS">(44) * Remove header and footer information</P>
+      <P status="YTS">(45) * Remove space before superscript footnote/endnote citations</P>
+      <P status="YTS">(46) * Remove Optional Hyphen Between Word</P>
+    </Optional>
+  </Filtration>
+  <BodyStyling versionrequired="True" status="DONE" StartTime="25-07-2014 13:29:21" EndTime="25-07-2014 13:33:39">
+    <TagMapping status="DONE">
+    </TagMapping>
+    <StyleMapping status="DONE">
+    </StyleMapping>
+  </BodyStyling>
+  <Reference versionrequired="True" status="DONE" StartTime="25-07-2014 13:34:10" EndTime="25-07-2014 13:37:04">
+  </Reference>
+  <CrossLinking versionrequired="True" status="YTS">
+  </CrossLinking>
+  <DOI versionrequired="True" status="YTS">
+  </DOI>
+  <Metadata versionrequired="True" status="YTS">
+    <Global>
+      <JournalID type="publisher">PRB</JournalID>
+      <JournalID type="coden">PRBMDO</JournalID>
+      <JournalID type="hwp">
+      </JournalID>
+      <JournalID type="pmc">
+      </JournalID>
+      <JournalID type="nlmta">
+      </JournalID>
+      <JournalID type="pmid">
+      </JournalID>
+      <JournalID type="pumbed">
+      </JournalID>
+      <JournalID type="doi">
+      </JournalID>
+      <JournalID type="other">
+      </JournalID>
+      <JOURNALTITLE>Physical Review B</JOURNALTITLE>
+      <JOURNALSUBTITLE>
+      </JOURNALSUBTITLE>
+      <TRANSJOURNALTITLE>
+      </TRANSJOURNALTITLE>
+      <ABBREVJOURNALTITLE>Phys. Rev. B</ABBREVJOURNALTITLE>
+      <ISSNPRINT>1098-0121</ISSNPRINT>
+      <ISSNONLINE>1550-235X</ISSNONLINE>
+      <PUBLISHERNAME>American Physical Society</PUBLISHERNAME>
+      <PUBLISHERLOCATION>
+      </PUBLISHERLOCATION>
+      <SELFURI>
+      </SELFURI>
+      <COPYRIGHTS>
+      </COPYRIGHTS>
+    </Global>
+    <OPENACCESS>
+      <OPEN_ACCESS_NO>
+      </OPEN_ACCESS_NO>
+      <OPEN_ACCESS_YES>
+      </OPEN_ACCESS_YES>
+      <OPEN_ACCESS_CC_BY>
+      </OPEN_ACCESS_CC_BY>
+      <OPEN_ACCESS_CC_BY_SA>
+      </OPEN_ACCESS_CC_BY_SA>
+      <OPEN_ACCESS_CC_BY_ND>
+      </OPEN_ACCESS_CC_BY_ND>
+      <OPEN_ACCESS_CC_BY_NC>
+      </OPEN_ACCESS_CC_BY_NC>
+      <OPEN_ACCESS_CC_BY_NC_SA>
+      </OPEN_ACCESS_CC_BY_NC_SA>
+      <OPEN_ACCESS_CC_BY_NC_ND>
+      </OPEN_ACCESS_CC_BY_NC_ND>
+    </OPENACCESS>
+    <ArticleSpecific metafile="starter.txt">
+      <ARTICLEID mandatory="False" active="True" metadata="%ACC" tagname=""/>
+      <DOI mandatory="False" active="True" metadata="%SC" tagname=""/>
+      <PMID mandatory="False" active="False" metadata="" tagname=""/>
+      <CODEN mandatory="False" active="False" metadata="" tagname=""/>
+      <MANUSCRIPT mandatory="False" active="True" metadata="%ACC" tagname=""/>
+      <PII mandatory="False" active="False" metadata="" tagname=""/>
+      <OTHER mandatory="False" active="False" metadata="" tagname=""/>
+      <SUBJECT_LEVEL1 mandatory="False" active="True" metadata="%SC" tagname=""/>
+      <SUBJECT_LEVEL2 mandatory="False" active="True" metadata="%SC" tagname=""/>
+      <PUBDATE_PRINT mandatory="False" active="True" metadata="" tagname=""/>
+      <PUBDATE_ONLINE mandatory="False" active="True" metadata="" tagname=""/>
+      <HISTORYDATE_RECEIVED mandatory="False" active="True" metadata="%RD" tagname=""/>
+      <HISTORYDATE_REV-REQUEST mandatory="False" active="False" metadata="" tagname=""/>
+      <HISTORYDATE_REV-RECEIVED mandatory="False" active="True" metadata="%RDREV" tagname=""/>
+      <HISTORYDATE_ACCEPTED mandatory="False" active="False" metadata="" tagname=""/>
+      <VOLUME mandatory="False" active="True" metadata="" tagname="00"/>
+      <ISSUE mandatory="False" active="True" metadata="" tagname="0"/>
+      <SUPPLEMENTARY_MATERIAL mandatory="False" active="False" metadata="" tagname=""/>
+      <COPYRIGHT_STATEMENT mandatory="False" active="True" metadata="%CP+%CPTXT+%CPHOLDER+%CPURL" tagname=""/>
+      <OPEN_ACCESS mandatory="False" active="False" metadata="" tagname=""/>
+      <ARTICLE_TYPE mandatory="False" active="True" metadata="%SC" tagname=""/>
+    </ArticleSpecific>
+  </Metadata>
+  <XmlConversion versionrequired="True" status="YTS">
+    <XMLValidation>
+      <DTDNAME>JATS-JOURNALPUBLISHING-OASIS-ARTICLE1-MATHML3</DTDNAME>
+      <MATHSTYLENAME>LaTeX</MATHSTYLENAME>
+      <FLOATPLACEMENT>End of Para</FLOATPLACEMENT>
+      <FLOATPOSITION>First callout </FLOATPOSITION>
+      <ENTITYSTYLE>ISO</ENTITYSTYLE>
+    </XMLValidation>
+    <DocValidation status="YTS">
+    </DocValidation>
+  </XmlConversion>
+  <CopyEditing versionrequired="True" status="YTS">
+  </CopyEditing>
+  <XmlConversion versionrequired="True" status="YTS">
+    <XMLValidation>
+      <DTDNAME>JATS-JOURNALPUBLISHING-OASIS-ARTICLE1-MATHML3</DTDNAME>
+      <MATHSTYLENAME>LaTeX</MATHSTYLENAME>
+      <FLOATPLACEMENT>End of Para</FLOATPLACEMENT>
+      <FLOATPOSITION>First callout </FLOATPOSITION>
+      <ENTITYSTYLE>ISO</ENTITYSTYLE>
+    </XMLValidation>
+    <DocValidation status="YTS">
+    </DocValidation>
+  </XmlConversion>
+  <Utility>
+    <Manual>
+      <Category name="General">
+        <Query>Please Check 3</Query>
+      </Category>
+    </Manual>
+  </Utility>
+  <Client id="5" name="APS" journalname="PRB"/>
+</Workflow>
 </file>
 
 <file path=customXml/item2.xml><?xml version="1.0" encoding="utf-8"?>
-<b:Sources xmlns:b="http://schemas.openxmlformats.org/officeDocument/2006/bibliography" xmlns="http://schemas.openxmlformats.org/officeDocument/2006/bibliography" SelectedStyle="\APA.XSL" StyleName="APA"/>
+<?mso-contentType ?>
+<FormTemplates xmlns="http://schemas.microsoft.com/sharepoint/v3/contenttype/forms">
+  <Display>DocumentLibraryForm</Display>
+  <Edit>DocumentLibraryForm</Edit>
+  <New>DocumentLibraryForm</New>
+</FormTemplates>
 </file>
 
 <file path=customXml/item3.xml><?xml version="1.0" encoding="utf-8"?>
@@ -16238,206 +15504,27 @@
 </file>
 
 <file path=customXml/item4.xml><?xml version="1.0" encoding="utf-8"?>
-<?mso-contentType ?>
-<FormTemplates xmlns="http://schemas.microsoft.com/sharepoint/v3/contenttype/forms">
-  <Display>DocumentLibraryForm</Display>
-  <Edit>DocumentLibraryForm</Edit>
-  <New>DocumentLibraryForm</New>
-</FormTemplates>
+<p:properties xmlns:p="http://schemas.microsoft.com/office/2006/metadata/properties" xmlns:xsi="http://www.w3.org/2001/XMLSchema-instance" xmlns:pc="http://schemas.microsoft.com/office/infopath/2007/PartnerControls">
+  <documentManagement>
+    <_activity xmlns="1112fb0d-fe2d-4cf5-ba0d-ded80aadf55c" xsi:nil="true"/>
+  </documentManagement>
+</p:properties>
 </file>
 
 <file path=customXml/item5.xml><?xml version="1.0" encoding="utf-8"?>
-<Workflow version="v.1.13">
-  <Filtration versionrequired="True" status="DONE" StartTime="25-07-2014 13:27:04" EndTime="25-07-2014 13:28:29">
-    <Mandatory>
-      <P status="DONE" StartTime="25-07-2014 13:27:42" EndTime="25-07-2014 13:27:43">(1) * Replace leftmost and rightmost char -(hyphen) of superscript matter, into minus</P>
-      <P status="DONE" StartTime="25-07-2014 13:27:43" EndTime="25-07-2014 13:27:44">(2) * Replace all variations of degree into 'degree' symbol</P>
-      <P status="DONE" StartTime="25-07-2014 13:27:44" EndTime="25-07-2014 13:27:44">(3) * Remove unwanted blank lines</P>
-      <P status="DONE" StartTime="25-07-2014 13:27:44" EndTime="25-07-2014 13:27:44">(4) * Replace underlined 'plus' sign(s) with plus/minus symbol(s)</P>
-      <P status="DONE" StartTime="25-07-2014 13:27:44" EndTime="25-07-2014 13:27:44">(5) * Replace underlined 'Greater Than' symbol(s) with 'Greater Than or Equal To' symbol(s)</P>
-      <P status="DONE" StartTime="25-07-2014 13:27:44" EndTime="25-07-2014 13:27:45">(6) * Replace underlined 'Less Than' symbol(s) with 'Less Than or Equal To' symbol(s)</P>
-      <P status="DONE" StartTime="25-07-2014 13:27:45" EndTime="25-07-2014 13:27:46">(7) * Replace 'x' with 'multiplication' symbol</P>
-      <P status="DONE" StartTime="25-07-2014 13:27:46" EndTime="25-07-2014 13:27:46">(8) * Remove space(s) before tab</P>
-      <P status="DONE" StartTime="25-07-2014 13:27:46" EndTime="25-07-2014 13:27:46">(9) * Remove space(s) after tab</P>
-      <P status="DONE" StartTime="25-07-2014 13:27:46" EndTime="25-07-2014 13:27:47">(10) * Remove tab(s) before paragraph mark</P>
-      <P status="DONE" StartTime="25-07-2014 13:27:47" EndTime="25-07-2014 13:27:47">(11) * Remove tab(s) after paragraph mark</P>
-      <P status="DONE" StartTime="25-07-2014 13:27:47" EndTime="25-07-2014 13:27:50">(12) * Remove space(s) before paragraph mark</P>
-      <P status="DONE" StartTime="25-07-2014 13:27:50" EndTime="25-07-2014 13:27:51">(13) * Remove space(s) after paragraph mark</P>
-      <P status="DONE" StartTime="25-07-2014 13:27:51" EndTime="25-07-2014 13:27:51">(14) * Replace multiple space(s) with single space</P>
-      <P status="DONE" StartTime="25-07-2014 13:27:51" EndTime="25-07-2014 13:28:14">(16) * Replace 'single hyphen' inside page range/number range with 'double hyphen'</P>
-      <P status="DONE" StartTime="25-07-2014 13:28:14" EndTime="25-07-2014 13:28:14">(18) * Change smart quote(s) to straight quote(s)</P>
-      <P status="DONE" StartTime="25-07-2014 13:28:14" EndTime="25-07-2014 13:28:15">(19) * Change straight quote(s) to smart quote(s)</P>
-      <P status="DONE" StartTime="25-07-2014 13:28:15" EndTime="25-07-2014 13:28:15">(20) * Change three consecutive dots to Ellipsis(...)</P>
-      <P status="DONE" StartTime="25-07-2014 13:28:15" EndTime="25-07-2014 13:28:16">(22) * Remove space(s) before comma</P>
-      <P status="DONE" StartTime="25-07-2014 13:28:16" EndTime="25-07-2014 13:28:16">(23) * Remove space(s) before semicolon</P>
-      <P status="DONE" StartTime="25-07-2014 13:28:16" EndTime="25-07-2014 13:28:17">(24) * Remove space(s) before period</P>
-      <P status="DONE" StartTime="25-07-2014 13:28:17" EndTime="25-07-2014 13:28:17">(25) * Remove space(s) before closing parenthesis</P>
-      <P status="DONE" StartTime="25-07-2014 13:28:17" EndTime="25-07-2014 13:28:17">(26) * Remove space(s) after opening parenthesis</P>
-      <P status="DONE" StartTime="25-07-2014 13:28:17" EndTime="25-07-2014 13:28:18">(28) * Remove space(s) before % sign</P>
-      <P status="DONE" StartTime="25-07-2014 13:28:18" EndTime="25-07-2014 13:28:18">(29) * Remove space before Celsius or Fahrenheit sign</P>
-      <P status="DONE" StartTime="25-07-2014 13:28:18" EndTime="25-07-2014 13:28:19">(34) * Convert 'direction' sign(s) to symbol(s)</P>
-      <P status="DONE" StartTime="25-07-2014 13:28:19" EndTime="25-07-2014 13:28:20">(38) * Remove unwanted section/page/column Breaks</P>
-      <P status="DONE" StartTime="25-07-2014 13:28:20" EndTime="25-07-2014 13:28:22">(47) * Convert 'direction' arrow(s) to symbol(s)</P>
-    </Mandatory>
-    <Optional>
-      <P status="YTS">(15) * Change 'Em Dash' with --- (triple hyphen) and 'En Dash' with -- (double hyphen)</P>
-      <P status="YTS">(17) * Change 'double hyphen' inside page range/number range into 'single hyphen'</P>
-      <P status="YTS">(21) * Change hyphen (with space both side) into En Dash (with space both side)</P>
-      <P status="YTS">(27) * Remove comma from digits</P>
-      <P status="YTS">(30) * Convert tab mark(s) to standard form</P>
-      <P status="YTS">(31) * Add 'space' before and after 'equal sign'</P>
-      <P status="YTS">(32) * Move 'period' from outside closing double quote(s) to inside</P>
-      <P status="YTS">(33) * Move 'comma' from outside closing double quote(s) to inside</P>
-      <P status="YTS">(35) * Convert 'hard return' mark(s) to standard form</P>
-      <P status="YTS">(36) * Insert 'En Space' in COMMON SI and Metric units</P>
-      <P status="YTS">(37) * Insert 'En Space' for COMPLEX (&gt;550 units) SI and Metric units</P>
-      <P status="YTS">(39) * Replace Em dash with spaces on both sides to En dash with spaces on both sides</P>
-      <P status="YTS">(40) * Replace --- (Triple hyphens) with spaces on both sides to En dash with spaces on both sides</P>
-      <P status="YTS">(41) * Replace --- (Triple hyphens) without spaces on both sides to En dash with spaces on both sides</P>
-      <P status="YTS">(42) * Replace -- (Double hyphens) with spaces on both sides to En dash with spaces on both sides</P>
-      <P status="YTS">(43) * Insert 'Non-breaking Space' for COMPLEX (&gt;550 units) SI and Metric units</P>
-      <P status="YTS">(44) * Remove header and footer information</P>
-      <P status="YTS">(45) * Remove space before superscript footnote/endnote citations</P>
-      <P status="YTS">(46) * Remove Optional Hyphen Between Word</P>
-    </Optional>
-  </Filtration>
-  <BodyStyling versionrequired="True" status="DONE" StartTime="25-07-2014 13:29:21" EndTime="25-07-2014 13:33:39">
-    <TagMapping status="DONE">
-    </TagMapping>
-    <StyleMapping status="DONE">
-    </StyleMapping>
-  </BodyStyling>
-  <Reference versionrequired="True" status="DONE" StartTime="25-07-2014 13:34:10" EndTime="25-07-2014 13:37:04">
-  </Reference>
-  <CrossLinking versionrequired="True" status="YTS">
-  </CrossLinking>
-  <DOI versionrequired="True" status="YTS">
-  </DOI>
-  <Metadata versionrequired="True" status="YTS">
-    <Global>
-      <JournalID type="publisher">PRB</JournalID>
-      <JournalID type="coden">PRBMDO</JournalID>
-      <JournalID type="hwp">
-      </JournalID>
-      <JournalID type="pmc">
-      </JournalID>
-      <JournalID type="nlmta">
-      </JournalID>
-      <JournalID type="pmid">
-      </JournalID>
-      <JournalID type="pumbed">
-      </JournalID>
-      <JournalID type="doi">
-      </JournalID>
-      <JournalID type="other">
-      </JournalID>
-      <JOURNALTITLE>Physical Review B</JOURNALTITLE>
-      <JOURNALSUBTITLE>
-      </JOURNALSUBTITLE>
-      <TRANSJOURNALTITLE>
-      </TRANSJOURNALTITLE>
-      <ABBREVJOURNALTITLE>Phys. Rev. B</ABBREVJOURNALTITLE>
-      <ISSNPRINT>1098-0121</ISSNPRINT>
-      <ISSNONLINE>1550-235X</ISSNONLINE>
-      <PUBLISHERNAME>American Physical Society</PUBLISHERNAME>
-      <PUBLISHERLOCATION>
-      </PUBLISHERLOCATION>
-      <SELFURI>
-      </SELFURI>
-      <COPYRIGHTS>
-      </COPYRIGHTS>
-    </Global>
-    <OPENACCESS>
-      <OPEN_ACCESS_NO>
-      </OPEN_ACCESS_NO>
-      <OPEN_ACCESS_YES>
-      </OPEN_ACCESS_YES>
-      <OPEN_ACCESS_CC_BY>
-      </OPEN_ACCESS_CC_BY>
-      <OPEN_ACCESS_CC_BY_SA>
-      </OPEN_ACCESS_CC_BY_SA>
-      <OPEN_ACCESS_CC_BY_ND>
-      </OPEN_ACCESS_CC_BY_ND>
-      <OPEN_ACCESS_CC_BY_NC>
-      </OPEN_ACCESS_CC_BY_NC>
-      <OPEN_ACCESS_CC_BY_NC_SA>
-      </OPEN_ACCESS_CC_BY_NC_SA>
-      <OPEN_ACCESS_CC_BY_NC_ND>
-      </OPEN_ACCESS_CC_BY_NC_ND>
-    </OPENACCESS>
-    <ArticleSpecific metafile="starter.txt">
-      <ARTICLEID mandatory="False" active="True" metadata="%ACC" tagname=""/>
-      <DOI mandatory="False" active="True" metadata="%SC" tagname=""/>
-      <PMID mandatory="False" active="False" metadata="" tagname=""/>
-      <CODEN mandatory="False" active="False" metadata="" tagname=""/>
-      <MANUSCRIPT mandatory="False" active="True" metadata="%ACC" tagname=""/>
-      <PII mandatory="False" active="False" metadata="" tagname=""/>
-      <OTHER mandatory="False" active="False" metadata="" tagname=""/>
-      <SUBJECT_LEVEL1 mandatory="False" active="True" metadata="%SC" tagname=""/>
-      <SUBJECT_LEVEL2 mandatory="False" active="True" metadata="%SC" tagname=""/>
-      <PUBDATE_PRINT mandatory="False" active="True" metadata="" tagname=""/>
-      <PUBDATE_ONLINE mandatory="False" active="True" metadata="" tagname=""/>
-      <HISTORYDATE_RECEIVED mandatory="False" active="True" metadata="%RD" tagname=""/>
-      <HISTORYDATE_REV-REQUEST mandatory="False" active="False" metadata="" tagname=""/>
-      <HISTORYDATE_REV-RECEIVED mandatory="False" active="True" metadata="%RDREV" tagname=""/>
-      <HISTORYDATE_ACCEPTED mandatory="False" active="False" metadata="" tagname=""/>
-      <VOLUME mandatory="False" active="True" metadata="" tagname="00"/>
-      <ISSUE mandatory="False" active="True" metadata="" tagname="0"/>
-      <SUPPLEMENTARY_MATERIAL mandatory="False" active="False" metadata="" tagname=""/>
-      <COPYRIGHT_STATEMENT mandatory="False" active="True" metadata="%CP+%CPTXT+%CPHOLDER+%CPURL" tagname=""/>
-      <OPEN_ACCESS mandatory="False" active="False" metadata="" tagname=""/>
-      <ARTICLE_TYPE mandatory="False" active="True" metadata="%SC" tagname=""/>
-    </ArticleSpecific>
-  </Metadata>
-  <XmlConversion versionrequired="True" status="YTS">
-    <XMLValidation>
-      <DTDNAME>JATS-JOURNALPUBLISHING-OASIS-ARTICLE1-MATHML3</DTDNAME>
-      <MATHSTYLENAME>LaTeX</MATHSTYLENAME>
-      <FLOATPLACEMENT>End of Para</FLOATPLACEMENT>
-      <FLOATPOSITION>First callout </FLOATPOSITION>
-      <ENTITYSTYLE>ISO</ENTITYSTYLE>
-    </XMLValidation>
-    <DocValidation status="YTS">
-    </DocValidation>
-  </XmlConversion>
-  <CopyEditing versionrequired="True" status="YTS">
-  </CopyEditing>
-  <XmlConversion versionrequired="True" status="YTS">
-    <XMLValidation>
-      <DTDNAME>JATS-JOURNALPUBLISHING-OASIS-ARTICLE1-MATHML3</DTDNAME>
-      <MATHSTYLENAME>LaTeX</MATHSTYLENAME>
-      <FLOATPLACEMENT>End of Para</FLOATPLACEMENT>
-      <FLOATPOSITION>First callout </FLOATPOSITION>
-      <ENTITYSTYLE>ISO</ENTITYSTYLE>
-    </XMLValidation>
-    <DocValidation status="YTS">
-    </DocValidation>
-  </XmlConversion>
-  <Utility>
-    <Manual>
-      <Category name="General">
-        <Query>Please Check 3</Query>
-      </Category>
-    </Manual>
-  </Utility>
-  <Client id="5" name="APS" journalname="PRB"/>
-</Workflow>
+<b:Sources xmlns:b="http://schemas.openxmlformats.org/officeDocument/2006/bibliography" xmlns="http://schemas.openxmlformats.org/officeDocument/2006/bibliography" SelectedStyle="\APA.XSL" StyleName="APA"/>
 </file>
 
 <file path=customXml/itemProps1.xml><?xml version="1.0" encoding="utf-8"?>
-<ds:datastoreItem xmlns:ds="http://schemas.openxmlformats.org/officeDocument/2006/customXml" ds:itemID="{5293C4E6-2A44-4085-88BC-9CCCD5DAF4E2}">
-  <ds:schemaRefs>
-    <ds:schemaRef ds:uri="http://schemas.microsoft.com/office/2006/metadata/properties"/>
-    <ds:schemaRef ds:uri="http://schemas.microsoft.com/office/infopath/2007/PartnerControls"/>
-    <ds:schemaRef ds:uri="1112fb0d-fe2d-4cf5-ba0d-ded80aadf55c"/>
-  </ds:schemaRefs>
+<ds:datastoreItem xmlns:ds="http://schemas.openxmlformats.org/officeDocument/2006/customXml" ds:itemID="{4D45DBA2-DCF6-46BF-858B-9A8CC8161B4D}">
+  <ds:schemaRefs/>
 </ds:datastoreItem>
 </file>
 
 <file path=customXml/itemProps2.xml><?xml version="1.0" encoding="utf-8"?>
-<ds:datastoreItem xmlns:ds="http://schemas.openxmlformats.org/officeDocument/2006/customXml" ds:itemID="{B589180B-96F4-4B3D-93D7-E2C64345EF74}">
+<ds:datastoreItem xmlns:ds="http://schemas.openxmlformats.org/officeDocument/2006/customXml" ds:itemID="{EDBB85A4-1C45-466C-B8CE-BC57B6E8D826}">
   <ds:schemaRefs>
-    <ds:schemaRef ds:uri="http://schemas.openxmlformats.org/officeDocument/2006/bibliography"/>
+    <ds:schemaRef ds:uri="http://schemas.microsoft.com/sharepoint/v3/contenttype/forms"/>
   </ds:schemaRefs>
 </ds:datastoreItem>
 </file>
@@ -16462,15 +15549,19 @@
 </file>
 
 <file path=customXml/itemProps4.xml><?xml version="1.0" encoding="utf-8"?>
-<ds:datastoreItem xmlns:ds="http://schemas.openxmlformats.org/officeDocument/2006/customXml" ds:itemID="{EDBB85A4-1C45-466C-B8CE-BC57B6E8D826}">
+<ds:datastoreItem xmlns:ds="http://schemas.openxmlformats.org/officeDocument/2006/customXml" ds:itemID="{5293C4E6-2A44-4085-88BC-9CCCD5DAF4E2}">
   <ds:schemaRefs>
-    <ds:schemaRef ds:uri="http://schemas.microsoft.com/sharepoint/v3/contenttype/forms"/>
+    <ds:schemaRef ds:uri="http://schemas.microsoft.com/office/2006/metadata/properties"/>
+    <ds:schemaRef ds:uri="http://schemas.microsoft.com/office/infopath/2007/PartnerControls"/>
+    <ds:schemaRef ds:uri="1112fb0d-fe2d-4cf5-ba0d-ded80aadf55c"/>
   </ds:schemaRefs>
 </ds:datastoreItem>
 </file>
 
 <file path=customXml/itemProps5.xml><?xml version="1.0" encoding="utf-8"?>
-<ds:datastoreItem xmlns:ds="http://schemas.openxmlformats.org/officeDocument/2006/customXml" ds:itemID="{4D45DBA2-DCF6-46BF-858B-9A8CC8161B4D}">
-  <ds:schemaRefs/>
+<ds:datastoreItem xmlns:ds="http://schemas.openxmlformats.org/officeDocument/2006/customXml" ds:itemID="{B589180B-96F4-4B3D-93D7-E2C64345EF74}">
+  <ds:schemaRefs>
+    <ds:schemaRef ds:uri="http://schemas.openxmlformats.org/officeDocument/2006/bibliography"/>
+  </ds:schemaRefs>
 </ds:datastoreItem>
 </file>
</xml_diff>